<commit_message>
updated dsa practice (23-07-2026)
</commit_message>
<xml_diff>
--- a/filter interview list2.docx
+++ b/filter interview list2.docx
@@ -686,6 +686,150 @@
       <w:r>
         <w:rPr>
           <w:rFonts w:ascii="Times New Roman" w:eastAsia="Times New Roman" w:hAnsi="Times New Roman" w:cs="Times New Roman"/>
+          <w:sz w:val="24"/>
+          <w:szCs w:val="24"/>
+          <w:lang w:eastAsia="en-IN"/>
+        </w:rPr>
+        <w:t xml:space="preserve">Merge Two Sorted Arrays </w:t>
+      </w:r>
+    </w:p>
+    <w:p>
+      <w:pPr>
+        <w:numPr>
+          <w:ilvl w:val="0"/>
+          <w:numId w:val="1"/>
+        </w:numPr>
+        <w:spacing w:before="100" w:beforeAutospacing="1" w:after="100" w:afterAutospacing="1" w:line="240" w:lineRule="auto"/>
+        <w:rPr>
+          <w:rFonts w:ascii="Times New Roman" w:eastAsia="Times New Roman" w:hAnsi="Times New Roman" w:cs="Times New Roman"/>
+          <w:sz w:val="24"/>
+          <w:szCs w:val="24"/>
+          <w:lang w:eastAsia="en-IN"/>
+        </w:rPr>
+      </w:pPr>
+      <w:r>
+        <w:rPr>
+          <w:rFonts w:ascii="Times New Roman" w:eastAsia="Times New Roman" w:hAnsi="Times New Roman" w:cs="Times New Roman"/>
+          <w:sz w:val="24"/>
+          <w:szCs w:val="24"/>
+          <w:lang w:eastAsia="en-IN"/>
+        </w:rPr>
+        <w:t xml:space="preserve">Pair Sum </w:t>
+      </w:r>
+    </w:p>
+    <w:p>
+      <w:pPr>
+        <w:numPr>
+          <w:ilvl w:val="0"/>
+          <w:numId w:val="1"/>
+        </w:numPr>
+        <w:spacing w:before="100" w:beforeAutospacing="1" w:after="100" w:afterAutospacing="1" w:line="240" w:lineRule="auto"/>
+        <w:rPr>
+          <w:rFonts w:ascii="Times New Roman" w:eastAsia="Times New Roman" w:hAnsi="Times New Roman" w:cs="Times New Roman"/>
+          <w:sz w:val="24"/>
+          <w:szCs w:val="24"/>
+          <w:lang w:eastAsia="en-IN"/>
+        </w:rPr>
+      </w:pPr>
+      <w:r>
+        <w:rPr>
+          <w:rFonts w:ascii="Times New Roman" w:eastAsia="Times New Roman" w:hAnsi="Times New Roman" w:cs="Times New Roman"/>
+          <w:sz w:val="24"/>
+          <w:szCs w:val="24"/>
+          <w:lang w:eastAsia="en-IN"/>
+        </w:rPr>
+        <w:t xml:space="preserve">Two Sum </w:t>
+      </w:r>
+    </w:p>
+    <w:p>
+      <w:pPr>
+        <w:numPr>
+          <w:ilvl w:val="0"/>
+          <w:numId w:val="1"/>
+        </w:numPr>
+        <w:spacing w:before="100" w:beforeAutospacing="1" w:after="100" w:afterAutospacing="1" w:line="240" w:lineRule="auto"/>
+        <w:rPr>
+          <w:rFonts w:ascii="Times New Roman" w:eastAsia="Times New Roman" w:hAnsi="Times New Roman" w:cs="Times New Roman"/>
+          <w:sz w:val="24"/>
+          <w:szCs w:val="24"/>
+          <w:lang w:eastAsia="en-IN"/>
+        </w:rPr>
+      </w:pPr>
+      <w:r>
+        <w:rPr>
+          <w:rFonts w:ascii="Times New Roman" w:eastAsia="Times New Roman" w:hAnsi="Times New Roman" w:cs="Times New Roman"/>
+          <w:sz w:val="24"/>
+          <w:szCs w:val="24"/>
+          <w:lang w:eastAsia="en-IN"/>
+        </w:rPr>
+        <w:t xml:space="preserve">Majority Element </w:t>
+      </w:r>
+    </w:p>
+    <w:p>
+      <w:pPr>
+        <w:numPr>
+          <w:ilvl w:val="0"/>
+          <w:numId w:val="1"/>
+        </w:numPr>
+        <w:spacing w:before="100" w:beforeAutospacing="1" w:after="100" w:afterAutospacing="1" w:line="240" w:lineRule="auto"/>
+        <w:rPr>
+          <w:rFonts w:ascii="Times New Roman" w:eastAsia="Times New Roman" w:hAnsi="Times New Roman" w:cs="Times New Roman"/>
+          <w:sz w:val="24"/>
+          <w:szCs w:val="24"/>
+          <w:lang w:eastAsia="en-IN"/>
+        </w:rPr>
+      </w:pPr>
+      <w:r>
+        <w:rPr>
+          <w:rFonts w:ascii="Times New Roman" w:eastAsia="Times New Roman" w:hAnsi="Times New Roman" w:cs="Times New Roman"/>
+          <w:sz w:val="24"/>
+          <w:szCs w:val="24"/>
+          <w:lang w:eastAsia="en-IN"/>
+        </w:rPr>
+        <w:t xml:space="preserve">Leaders in Array </w:t>
+      </w:r>
+    </w:p>
+    <w:p>
+      <w:pPr>
+        <w:numPr>
+          <w:ilvl w:val="0"/>
+          <w:numId w:val="1"/>
+        </w:numPr>
+        <w:spacing w:before="100" w:beforeAutospacing="1" w:after="100" w:afterAutospacing="1" w:line="240" w:lineRule="auto"/>
+        <w:rPr>
+          <w:rFonts w:ascii="Times New Roman" w:eastAsia="Times New Roman" w:hAnsi="Times New Roman" w:cs="Times New Roman"/>
+          <w:sz w:val="24"/>
+          <w:szCs w:val="24"/>
+          <w:lang w:eastAsia="en-IN"/>
+        </w:rPr>
+      </w:pPr>
+      <w:r>
+        <w:rPr>
+          <w:rFonts w:ascii="Times New Roman" w:eastAsia="Times New Roman" w:hAnsi="Times New Roman" w:cs="Times New Roman"/>
+          <w:sz w:val="24"/>
+          <w:szCs w:val="24"/>
+          <w:lang w:eastAsia="en-IN"/>
+        </w:rPr>
+        <w:t xml:space="preserve">Equilibrium Index </w:t>
+      </w:r>
+    </w:p>
+    <w:p>
+      <w:pPr>
+        <w:numPr>
+          <w:ilvl w:val="0"/>
+          <w:numId w:val="1"/>
+        </w:numPr>
+        <w:spacing w:before="100" w:beforeAutospacing="1" w:after="100" w:afterAutospacing="1" w:line="240" w:lineRule="auto"/>
+        <w:rPr>
+          <w:rFonts w:ascii="Times New Roman" w:eastAsia="Times New Roman" w:hAnsi="Times New Roman" w:cs="Times New Roman"/>
+          <w:sz w:val="24"/>
+          <w:szCs w:val="24"/>
+          <w:lang w:eastAsia="en-IN"/>
+        </w:rPr>
+      </w:pPr>
+      <w:r>
+        <w:rPr>
+          <w:rFonts w:ascii="Times New Roman" w:eastAsia="Times New Roman" w:hAnsi="Times New Roman" w:cs="Times New Roman"/>
           <w:noProof/>
           <w:sz w:val="24"/>
           <w:szCs w:val="24"/>
@@ -694,13 +838,13 @@
         <mc:AlternateContent>
           <mc:Choice Requires="wps">
             <w:drawing>
-              <wp:anchor distT="0" distB="0" distL="114300" distR="114300" simplePos="0" relativeHeight="251659264" behindDoc="0" locked="0" layoutInCell="1" allowOverlap="1" wp14:anchorId="58B32D78" wp14:editId="06FF05F5">
+              <wp:anchor distT="0" distB="0" distL="114300" distR="114300" simplePos="0" relativeHeight="251659264" behindDoc="0" locked="0" layoutInCell="1" allowOverlap="1" wp14:anchorId="58B32D78" wp14:editId="784BAF8E">
                 <wp:simplePos x="0" y="0"/>
                 <wp:positionH relativeFrom="column">
-                  <wp:posOffset>-82882</wp:posOffset>
+                  <wp:posOffset>-62672</wp:posOffset>
                 </wp:positionH>
                 <wp:positionV relativeFrom="paragraph">
-                  <wp:posOffset>180009</wp:posOffset>
+                  <wp:posOffset>177717</wp:posOffset>
                 </wp:positionV>
                 <wp:extent cx="2413221" cy="3976"/>
                 <wp:effectExtent l="0" t="0" r="25400" b="34290"/>
@@ -743,157 +887,13 @@
           </mc:Choice>
           <mc:Fallback>
             <w:pict>
-              <v:line w14:anchorId="51DDE1D9" id="Straight Connector 1" o:spid="_x0000_s1026" style="position:absolute;flip:y;z-index:251659264;visibility:visible;mso-wrap-style:square;mso-wrap-distance-left:9pt;mso-wrap-distance-top:0;mso-wrap-distance-right:9pt;mso-wrap-distance-bottom:0;mso-position-horizontal:absolute;mso-position-horizontal-relative:text;mso-position-vertical:absolute;mso-position-vertical-relative:text" from="-6.55pt,14.15pt" to="183.45pt,14.45pt" o:gfxdata="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" strokecolor="#4472c4 [3204]" strokeweight=".5pt">
+              <v:line w14:anchorId="7FD42D5F" id="Straight Connector 1" o:spid="_x0000_s1026" style="position:absolute;flip:y;z-index:251659264;visibility:visible;mso-wrap-style:square;mso-wrap-distance-left:9pt;mso-wrap-distance-top:0;mso-wrap-distance-right:9pt;mso-wrap-distance-bottom:0;mso-position-horizontal:absolute;mso-position-horizontal-relative:text;mso-position-vertical:absolute;mso-position-vertical-relative:text" from="-4.95pt,14pt" to="185.05pt,14.3pt" o:gfxdata="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" strokecolor="#4472c4 [3204]" strokeweight=".5pt">
                 <v:stroke joinstyle="miter"/>
               </v:line>
             </w:pict>
           </mc:Fallback>
         </mc:AlternateContent>
       </w:r>
-      <w:r>
-        <w:rPr>
-          <w:rFonts w:ascii="Times New Roman" w:eastAsia="Times New Roman" w:hAnsi="Times New Roman" w:cs="Times New Roman"/>
-          <w:sz w:val="24"/>
-          <w:szCs w:val="24"/>
-          <w:lang w:eastAsia="en-IN"/>
-        </w:rPr>
-        <w:t xml:space="preserve">Merge Two Sorted Arrays </w:t>
-      </w:r>
-    </w:p>
-    <w:p>
-      <w:pPr>
-        <w:numPr>
-          <w:ilvl w:val="0"/>
-          <w:numId w:val="1"/>
-        </w:numPr>
-        <w:spacing w:before="100" w:beforeAutospacing="1" w:after="100" w:afterAutospacing="1" w:line="240" w:lineRule="auto"/>
-        <w:rPr>
-          <w:rFonts w:ascii="Times New Roman" w:eastAsia="Times New Roman" w:hAnsi="Times New Roman" w:cs="Times New Roman"/>
-          <w:sz w:val="24"/>
-          <w:szCs w:val="24"/>
-          <w:lang w:eastAsia="en-IN"/>
-        </w:rPr>
-      </w:pPr>
-      <w:r>
-        <w:rPr>
-          <w:rFonts w:ascii="Times New Roman" w:eastAsia="Times New Roman" w:hAnsi="Times New Roman" w:cs="Times New Roman"/>
-          <w:sz w:val="24"/>
-          <w:szCs w:val="24"/>
-          <w:lang w:eastAsia="en-IN"/>
-        </w:rPr>
-        <w:t xml:space="preserve">Pair Sum </w:t>
-      </w:r>
-    </w:p>
-    <w:p>
-      <w:pPr>
-        <w:numPr>
-          <w:ilvl w:val="0"/>
-          <w:numId w:val="1"/>
-        </w:numPr>
-        <w:spacing w:before="100" w:beforeAutospacing="1" w:after="100" w:afterAutospacing="1" w:line="240" w:lineRule="auto"/>
-        <w:rPr>
-          <w:rFonts w:ascii="Times New Roman" w:eastAsia="Times New Roman" w:hAnsi="Times New Roman" w:cs="Times New Roman"/>
-          <w:sz w:val="24"/>
-          <w:szCs w:val="24"/>
-          <w:lang w:eastAsia="en-IN"/>
-        </w:rPr>
-      </w:pPr>
-      <w:r>
-        <w:rPr>
-          <w:rFonts w:ascii="Times New Roman" w:eastAsia="Times New Roman" w:hAnsi="Times New Roman" w:cs="Times New Roman"/>
-          <w:sz w:val="24"/>
-          <w:szCs w:val="24"/>
-          <w:lang w:eastAsia="en-IN"/>
-        </w:rPr>
-        <w:t xml:space="preserve">Two Sum </w:t>
-      </w:r>
-    </w:p>
-    <w:p>
-      <w:pPr>
-        <w:numPr>
-          <w:ilvl w:val="0"/>
-          <w:numId w:val="1"/>
-        </w:numPr>
-        <w:spacing w:before="100" w:beforeAutospacing="1" w:after="100" w:afterAutospacing="1" w:line="240" w:lineRule="auto"/>
-        <w:rPr>
-          <w:rFonts w:ascii="Times New Roman" w:eastAsia="Times New Roman" w:hAnsi="Times New Roman" w:cs="Times New Roman"/>
-          <w:sz w:val="24"/>
-          <w:szCs w:val="24"/>
-          <w:lang w:eastAsia="en-IN"/>
-        </w:rPr>
-      </w:pPr>
-      <w:r>
-        <w:rPr>
-          <w:rFonts w:ascii="Times New Roman" w:eastAsia="Times New Roman" w:hAnsi="Times New Roman" w:cs="Times New Roman"/>
-          <w:sz w:val="24"/>
-          <w:szCs w:val="24"/>
-          <w:lang w:eastAsia="en-IN"/>
-        </w:rPr>
-        <w:t xml:space="preserve">Majority Element </w:t>
-      </w:r>
-    </w:p>
-    <w:p>
-      <w:pPr>
-        <w:numPr>
-          <w:ilvl w:val="0"/>
-          <w:numId w:val="1"/>
-        </w:numPr>
-        <w:spacing w:before="100" w:beforeAutospacing="1" w:after="100" w:afterAutospacing="1" w:line="240" w:lineRule="auto"/>
-        <w:rPr>
-          <w:rFonts w:ascii="Times New Roman" w:eastAsia="Times New Roman" w:hAnsi="Times New Roman" w:cs="Times New Roman"/>
-          <w:sz w:val="24"/>
-          <w:szCs w:val="24"/>
-          <w:lang w:eastAsia="en-IN"/>
-        </w:rPr>
-      </w:pPr>
-      <w:r>
-        <w:rPr>
-          <w:rFonts w:ascii="Times New Roman" w:eastAsia="Times New Roman" w:hAnsi="Times New Roman" w:cs="Times New Roman"/>
-          <w:sz w:val="24"/>
-          <w:szCs w:val="24"/>
-          <w:lang w:eastAsia="en-IN"/>
-        </w:rPr>
-        <w:t xml:space="preserve">Leaders in Array </w:t>
-      </w:r>
-    </w:p>
-    <w:p>
-      <w:pPr>
-        <w:numPr>
-          <w:ilvl w:val="0"/>
-          <w:numId w:val="1"/>
-        </w:numPr>
-        <w:spacing w:before="100" w:beforeAutospacing="1" w:after="100" w:afterAutospacing="1" w:line="240" w:lineRule="auto"/>
-        <w:rPr>
-          <w:rFonts w:ascii="Times New Roman" w:eastAsia="Times New Roman" w:hAnsi="Times New Roman" w:cs="Times New Roman"/>
-          <w:sz w:val="24"/>
-          <w:szCs w:val="24"/>
-          <w:lang w:eastAsia="en-IN"/>
-        </w:rPr>
-      </w:pPr>
-      <w:r>
-        <w:rPr>
-          <w:rFonts w:ascii="Times New Roman" w:eastAsia="Times New Roman" w:hAnsi="Times New Roman" w:cs="Times New Roman"/>
-          <w:sz w:val="24"/>
-          <w:szCs w:val="24"/>
-          <w:lang w:eastAsia="en-IN"/>
-        </w:rPr>
-        <w:t xml:space="preserve">Equilibrium Index </w:t>
-      </w:r>
-    </w:p>
-    <w:p>
-      <w:pPr>
-        <w:numPr>
-          <w:ilvl w:val="0"/>
-          <w:numId w:val="1"/>
-        </w:numPr>
-        <w:spacing w:before="100" w:beforeAutospacing="1" w:after="100" w:afterAutospacing="1" w:line="240" w:lineRule="auto"/>
-        <w:rPr>
-          <w:rFonts w:ascii="Times New Roman" w:eastAsia="Times New Roman" w:hAnsi="Times New Roman" w:cs="Times New Roman"/>
-          <w:sz w:val="24"/>
-          <w:szCs w:val="24"/>
-          <w:lang w:eastAsia="en-IN"/>
-        </w:rPr>
-      </w:pPr>
       <w:r>
         <w:rPr>
           <w:rFonts w:ascii="Times New Roman" w:eastAsia="Times New Roman" w:hAnsi="Times New Roman" w:cs="Times New Roman"/>

</xml_diff>

<commit_message>
updated dsa revision 13-08-2026
</commit_message>
<xml_diff>
--- a/filter interview list2.docx
+++ b/filter interview list2.docx
@@ -734,6 +734,78 @@
       <w:r>
         <w:rPr>
           <w:rFonts w:ascii="Times New Roman" w:eastAsia="Times New Roman" w:hAnsi="Times New Roman" w:cs="Times New Roman"/>
+          <w:sz w:val="24"/>
+          <w:szCs w:val="24"/>
+          <w:lang w:eastAsia="en-IN"/>
+        </w:rPr>
+        <w:t xml:space="preserve">Two Sum </w:t>
+      </w:r>
+    </w:p>
+    <w:p>
+      <w:pPr>
+        <w:numPr>
+          <w:ilvl w:val="0"/>
+          <w:numId w:val="1"/>
+        </w:numPr>
+        <w:spacing w:before="100" w:beforeAutospacing="1" w:after="100" w:afterAutospacing="1" w:line="240" w:lineRule="auto"/>
+        <w:rPr>
+          <w:rFonts w:ascii="Times New Roman" w:eastAsia="Times New Roman" w:hAnsi="Times New Roman" w:cs="Times New Roman"/>
+          <w:sz w:val="24"/>
+          <w:szCs w:val="24"/>
+          <w:lang w:eastAsia="en-IN"/>
+        </w:rPr>
+      </w:pPr>
+      <w:r>
+        <w:rPr>
+          <w:rFonts w:ascii="Times New Roman" w:eastAsia="Times New Roman" w:hAnsi="Times New Roman" w:cs="Times New Roman"/>
+          <w:sz w:val="24"/>
+          <w:szCs w:val="24"/>
+          <w:lang w:eastAsia="en-IN"/>
+        </w:rPr>
+        <w:t xml:space="preserve">Majority Element </w:t>
+      </w:r>
+    </w:p>
+    <w:p>
+      <w:pPr>
+        <w:numPr>
+          <w:ilvl w:val="0"/>
+          <w:numId w:val="1"/>
+        </w:numPr>
+        <w:spacing w:before="100" w:beforeAutospacing="1" w:after="100" w:afterAutospacing="1" w:line="240" w:lineRule="auto"/>
+        <w:rPr>
+          <w:rFonts w:ascii="Times New Roman" w:eastAsia="Times New Roman" w:hAnsi="Times New Roman" w:cs="Times New Roman"/>
+          <w:sz w:val="24"/>
+          <w:szCs w:val="24"/>
+          <w:lang w:eastAsia="en-IN"/>
+        </w:rPr>
+      </w:pPr>
+      <w:r>
+        <w:rPr>
+          <w:rFonts w:ascii="Times New Roman" w:eastAsia="Times New Roman" w:hAnsi="Times New Roman" w:cs="Times New Roman"/>
+          <w:sz w:val="24"/>
+          <w:szCs w:val="24"/>
+          <w:lang w:eastAsia="en-IN"/>
+        </w:rPr>
+        <w:t xml:space="preserve">Leaders in Array </w:t>
+      </w:r>
+    </w:p>
+    <w:p>
+      <w:pPr>
+        <w:numPr>
+          <w:ilvl w:val="0"/>
+          <w:numId w:val="1"/>
+        </w:numPr>
+        <w:spacing w:before="100" w:beforeAutospacing="1" w:after="100" w:afterAutospacing="1" w:line="240" w:lineRule="auto"/>
+        <w:rPr>
+          <w:rFonts w:ascii="Times New Roman" w:eastAsia="Times New Roman" w:hAnsi="Times New Roman" w:cs="Times New Roman"/>
+          <w:sz w:val="24"/>
+          <w:szCs w:val="24"/>
+          <w:lang w:eastAsia="en-IN"/>
+        </w:rPr>
+      </w:pPr>
+      <w:r>
+        <w:rPr>
+          <w:rFonts w:ascii="Times New Roman" w:eastAsia="Times New Roman" w:hAnsi="Times New Roman" w:cs="Times New Roman"/>
           <w:noProof/>
           <w:sz w:val="24"/>
           <w:szCs w:val="24"/>
@@ -742,13 +814,13 @@
         <mc:AlternateContent>
           <mc:Choice Requires="wps">
             <w:drawing>
-              <wp:anchor distT="0" distB="0" distL="114300" distR="114300" simplePos="0" relativeHeight="251682816" behindDoc="0" locked="0" layoutInCell="1" allowOverlap="1" wp14:anchorId="7A2EABD1" wp14:editId="58124097">
+              <wp:anchor distT="0" distB="0" distL="114300" distR="114300" simplePos="0" relativeHeight="251682816" behindDoc="0" locked="0" layoutInCell="1" allowOverlap="1" wp14:anchorId="7A2EABD1" wp14:editId="26CD6219">
                 <wp:simplePos x="0" y="0"/>
                 <wp:positionH relativeFrom="column">
-                  <wp:posOffset>-694055</wp:posOffset>
+                  <wp:posOffset>-715222</wp:posOffset>
                 </wp:positionH>
                 <wp:positionV relativeFrom="paragraph">
-                  <wp:posOffset>177376</wp:posOffset>
+                  <wp:posOffset>176318</wp:posOffset>
                 </wp:positionV>
                 <wp:extent cx="4131522" cy="8890"/>
                 <wp:effectExtent l="0" t="0" r="21590" b="29210"/>
@@ -797,85 +869,13 @@
           </mc:Choice>
           <mc:Fallback>
             <w:pict>
-              <v:line w14:anchorId="422C8CCD" id="Straight Connector 3" o:spid="_x0000_s1026" style="position:absolute;flip:y;z-index:251682816;visibility:visible;mso-wrap-style:square;mso-width-percent:0;mso-height-percent:0;mso-wrap-distance-left:9pt;mso-wrap-distance-top:0;mso-wrap-distance-right:9pt;mso-wrap-distance-bottom:0;mso-position-horizontal:absolute;mso-position-horizontal-relative:text;mso-position-vertical:absolute;mso-position-vertical-relative:text;mso-width-percent:0;mso-height-percent:0;mso-width-relative:margin;mso-height-relative:margin" from="-54.65pt,13.95pt" to="270.65pt,14.65pt" o:gfxdata="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" strokecolor="#4472c4 [3204]" strokeweight=".5pt">
+              <v:line w14:anchorId="444FB735" id="Straight Connector 3" o:spid="_x0000_s1026" style="position:absolute;flip:y;z-index:251682816;visibility:visible;mso-wrap-style:square;mso-width-percent:0;mso-height-percent:0;mso-wrap-distance-left:9pt;mso-wrap-distance-top:0;mso-wrap-distance-right:9pt;mso-wrap-distance-bottom:0;mso-position-horizontal:absolute;mso-position-horizontal-relative:text;mso-position-vertical:absolute;mso-position-vertical-relative:text;mso-width-percent:0;mso-height-percent:0;mso-width-relative:margin;mso-height-relative:margin" from="-56.3pt,13.9pt" to="269pt,14.6pt" o:gfxdata="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" strokecolor="#4472c4 [3204]" strokeweight=".5pt">
                 <v:stroke joinstyle="miter"/>
               </v:line>
             </w:pict>
           </mc:Fallback>
         </mc:AlternateContent>
       </w:r>
-      <w:r>
-        <w:rPr>
-          <w:rFonts w:ascii="Times New Roman" w:eastAsia="Times New Roman" w:hAnsi="Times New Roman" w:cs="Times New Roman"/>
-          <w:sz w:val="24"/>
-          <w:szCs w:val="24"/>
-          <w:lang w:eastAsia="en-IN"/>
-        </w:rPr>
-        <w:t xml:space="preserve">Two Sum </w:t>
-      </w:r>
-    </w:p>
-    <w:p>
-      <w:pPr>
-        <w:numPr>
-          <w:ilvl w:val="0"/>
-          <w:numId w:val="1"/>
-        </w:numPr>
-        <w:spacing w:before="100" w:beforeAutospacing="1" w:after="100" w:afterAutospacing="1" w:line="240" w:lineRule="auto"/>
-        <w:rPr>
-          <w:rFonts w:ascii="Times New Roman" w:eastAsia="Times New Roman" w:hAnsi="Times New Roman" w:cs="Times New Roman"/>
-          <w:sz w:val="24"/>
-          <w:szCs w:val="24"/>
-          <w:lang w:eastAsia="en-IN"/>
-        </w:rPr>
-      </w:pPr>
-      <w:r>
-        <w:rPr>
-          <w:rFonts w:ascii="Times New Roman" w:eastAsia="Times New Roman" w:hAnsi="Times New Roman" w:cs="Times New Roman"/>
-          <w:sz w:val="24"/>
-          <w:szCs w:val="24"/>
-          <w:lang w:eastAsia="en-IN"/>
-        </w:rPr>
-        <w:t xml:space="preserve">Majority Element </w:t>
-      </w:r>
-    </w:p>
-    <w:p>
-      <w:pPr>
-        <w:numPr>
-          <w:ilvl w:val="0"/>
-          <w:numId w:val="1"/>
-        </w:numPr>
-        <w:spacing w:before="100" w:beforeAutospacing="1" w:after="100" w:afterAutospacing="1" w:line="240" w:lineRule="auto"/>
-        <w:rPr>
-          <w:rFonts w:ascii="Times New Roman" w:eastAsia="Times New Roman" w:hAnsi="Times New Roman" w:cs="Times New Roman"/>
-          <w:sz w:val="24"/>
-          <w:szCs w:val="24"/>
-          <w:lang w:eastAsia="en-IN"/>
-        </w:rPr>
-      </w:pPr>
-      <w:r>
-        <w:rPr>
-          <w:rFonts w:ascii="Times New Roman" w:eastAsia="Times New Roman" w:hAnsi="Times New Roman" w:cs="Times New Roman"/>
-          <w:sz w:val="24"/>
-          <w:szCs w:val="24"/>
-          <w:lang w:eastAsia="en-IN"/>
-        </w:rPr>
-        <w:t xml:space="preserve">Leaders in Array </w:t>
-      </w:r>
-    </w:p>
-    <w:p>
-      <w:pPr>
-        <w:numPr>
-          <w:ilvl w:val="0"/>
-          <w:numId w:val="1"/>
-        </w:numPr>
-        <w:spacing w:before="100" w:beforeAutospacing="1" w:after="100" w:afterAutospacing="1" w:line="240" w:lineRule="auto"/>
-        <w:rPr>
-          <w:rFonts w:ascii="Times New Roman" w:eastAsia="Times New Roman" w:hAnsi="Times New Roman" w:cs="Times New Roman"/>
-          <w:sz w:val="24"/>
-          <w:szCs w:val="24"/>
-          <w:lang w:eastAsia="en-IN"/>
-        </w:rPr>
-      </w:pPr>
       <w:r>
         <w:rPr>
           <w:rFonts w:ascii="Times New Roman" w:eastAsia="Times New Roman" w:hAnsi="Times New Roman" w:cs="Times New Roman"/>

</xml_diff>

<commit_message>
updated dsa revision (14-08-2026)
</commit_message>
<xml_diff>
--- a/filter interview list2.docx
+++ b/filter interview list2.docx
@@ -511,6 +511,82 @@
           <w:lang w:eastAsia="en-IN"/>
         </w:rPr>
       </w:pPr>
+      <w:r>
+        <w:rPr>
+          <w:rFonts w:ascii="Segoe UI Emoji" w:eastAsia="Times New Roman" w:hAnsi="Segoe UI Emoji" w:cs="Segoe UI Emoji"/>
+          <w:b/>
+          <w:bCs/>
+          <w:noProof/>
+          <w:kern w:val="36"/>
+          <w:sz w:val="48"/>
+          <w:szCs w:val="48"/>
+          <w:lang w:eastAsia="en-IN"/>
+        </w:rPr>
+        <mc:AlternateContent>
+          <mc:Choice Requires="wps">
+            <w:drawing>
+              <wp:anchor distT="0" distB="0" distL="114300" distR="114300" simplePos="0" relativeHeight="251682816" behindDoc="0" locked="0" layoutInCell="1" allowOverlap="1" wp14:anchorId="5148CF99" wp14:editId="00E6E528">
+                <wp:simplePos x="0" y="0"/>
+                <wp:positionH relativeFrom="column">
+                  <wp:posOffset>-169333</wp:posOffset>
+                </wp:positionH>
+                <wp:positionV relativeFrom="paragraph">
+                  <wp:posOffset>1156335</wp:posOffset>
+                </wp:positionV>
+                <wp:extent cx="2582333" cy="2734733"/>
+                <wp:effectExtent l="0" t="0" r="27940" b="27940"/>
+                <wp:wrapNone/>
+                <wp:docPr id="5" name="Rectangle 5"/>
+                <wp:cNvGraphicFramePr/>
+                <a:graphic xmlns:a="http://schemas.openxmlformats.org/drawingml/2006/main">
+                  <a:graphicData uri="http://schemas.microsoft.com/office/word/2010/wordprocessingShape">
+                    <wps:wsp>
+                      <wps:cNvSpPr/>
+                      <wps:spPr>
+                        <a:xfrm>
+                          <a:off x="0" y="0"/>
+                          <a:ext cx="2582333" cy="2734733"/>
+                        </a:xfrm>
+                        <a:prstGeom prst="rect">
+                          <a:avLst/>
+                        </a:prstGeom>
+                        <a:noFill/>
+                      </wps:spPr>
+                      <wps:style>
+                        <a:lnRef idx="2">
+                          <a:schemeClr val="accent1">
+                            <a:shade val="50000"/>
+                          </a:schemeClr>
+                        </a:lnRef>
+                        <a:fillRef idx="1">
+                          <a:schemeClr val="accent1"/>
+                        </a:fillRef>
+                        <a:effectRef idx="0">
+                          <a:schemeClr val="accent1"/>
+                        </a:effectRef>
+                        <a:fontRef idx="minor">
+                          <a:schemeClr val="lt1"/>
+                        </a:fontRef>
+                      </wps:style>
+                      <wps:bodyPr rot="0" spcFirstLastPara="0" vertOverflow="overflow" horzOverflow="overflow" vert="horz" wrap="square" lIns="91440" tIns="45720" rIns="91440" bIns="45720" numCol="1" spcCol="0" rtlCol="0" fromWordArt="0" anchor="ctr" anchorCtr="0" forceAA="0" compatLnSpc="1">
+                        <a:prstTxWarp prst="textNoShape">
+                          <a:avLst/>
+                        </a:prstTxWarp>
+                        <a:noAutofit/>
+                      </wps:bodyPr>
+                    </wps:wsp>
+                  </a:graphicData>
+                </a:graphic>
+              </wp:anchor>
+            </w:drawing>
+          </mc:Choice>
+          <mc:Fallback>
+            <w:pict>
+              <v:rect w14:anchorId="09E989E7" id="Rectangle 5" o:spid="_x0000_s1026" style="position:absolute;margin-left:-13.35pt;margin-top:91.05pt;width:203.35pt;height:215.35pt;z-index:251682816;visibility:visible;mso-wrap-style:square;mso-wrap-distance-left:9pt;mso-wrap-distance-top:0;mso-wrap-distance-right:9pt;mso-wrap-distance-bottom:0;mso-position-horizontal:absolute;mso-position-horizontal-relative:text;mso-position-vertical:absolute;mso-position-vertical-relative:text;v-text-anchor:middle" o:gfxdata="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" filled="f" strokecolor="#1f3763 [1604]" strokeweight="1pt"/>
+            </w:pict>
+          </mc:Fallback>
+        </mc:AlternateContent>
+      </w:r>
       <w:r>
         <w:rPr>
           <w:rFonts w:ascii="Segoe UI Emoji" w:eastAsia="Times New Roman" w:hAnsi="Segoe UI Emoji" w:cs="Segoe UI Emoji"/>
@@ -709,136 +785,154 @@
       </w:pPr>
       <w:r>
         <w:rPr>
-          <w:rFonts w:ascii="Times New Roman" w:eastAsia="Times New Roman" w:hAnsi="Times New Roman" w:cs="Times New Roman"/>
-          <w:sz w:val="24"/>
-          <w:szCs w:val="24"/>
-          <w:lang w:eastAsia="en-IN"/>
-        </w:rPr>
-        <w:t xml:space="preserve">Pair Sum </w:t>
-      </w:r>
-    </w:p>
-    <w:p>
-      <w:pPr>
-        <w:numPr>
-          <w:ilvl w:val="0"/>
-          <w:numId w:val="1"/>
-        </w:numPr>
-        <w:spacing w:before="100" w:beforeAutospacing="1" w:after="100" w:afterAutospacing="1" w:line="240" w:lineRule="auto"/>
-        <w:rPr>
-          <w:rFonts w:ascii="Times New Roman" w:eastAsia="Times New Roman" w:hAnsi="Times New Roman" w:cs="Times New Roman"/>
-          <w:sz w:val="24"/>
-          <w:szCs w:val="24"/>
-          <w:lang w:eastAsia="en-IN"/>
-        </w:rPr>
-      </w:pPr>
-      <w:r>
-        <w:rPr>
-          <w:rFonts w:ascii="Times New Roman" w:eastAsia="Times New Roman" w:hAnsi="Times New Roman" w:cs="Times New Roman"/>
-          <w:sz w:val="24"/>
-          <w:szCs w:val="24"/>
-          <w:lang w:eastAsia="en-IN"/>
-        </w:rPr>
-        <w:t xml:space="preserve">Two Sum </w:t>
-      </w:r>
-    </w:p>
-    <w:p>
-      <w:pPr>
-        <w:numPr>
-          <w:ilvl w:val="0"/>
-          <w:numId w:val="1"/>
-        </w:numPr>
-        <w:spacing w:before="100" w:beforeAutospacing="1" w:after="100" w:afterAutospacing="1" w:line="240" w:lineRule="auto"/>
-        <w:rPr>
-          <w:rFonts w:ascii="Times New Roman" w:eastAsia="Times New Roman" w:hAnsi="Times New Roman" w:cs="Times New Roman"/>
-          <w:sz w:val="24"/>
-          <w:szCs w:val="24"/>
-          <w:lang w:eastAsia="en-IN"/>
-        </w:rPr>
-      </w:pPr>
-      <w:r>
-        <w:rPr>
-          <w:rFonts w:ascii="Times New Roman" w:eastAsia="Times New Roman" w:hAnsi="Times New Roman" w:cs="Times New Roman"/>
-          <w:sz w:val="24"/>
-          <w:szCs w:val="24"/>
-          <w:lang w:eastAsia="en-IN"/>
-        </w:rPr>
-        <w:t xml:space="preserve">Majority Element </w:t>
-      </w:r>
-    </w:p>
-    <w:p>
-      <w:pPr>
-        <w:numPr>
-          <w:ilvl w:val="0"/>
-          <w:numId w:val="1"/>
-        </w:numPr>
-        <w:spacing w:before="100" w:beforeAutospacing="1" w:after="100" w:afterAutospacing="1" w:line="240" w:lineRule="auto"/>
-        <w:rPr>
-          <w:rFonts w:ascii="Times New Roman" w:eastAsia="Times New Roman" w:hAnsi="Times New Roman" w:cs="Times New Roman"/>
-          <w:sz w:val="24"/>
-          <w:szCs w:val="24"/>
-          <w:lang w:eastAsia="en-IN"/>
-        </w:rPr>
-      </w:pPr>
-      <w:r>
-        <w:rPr>
-          <w:rFonts w:ascii="Times New Roman" w:eastAsia="Times New Roman" w:hAnsi="Times New Roman" w:cs="Times New Roman"/>
-          <w:sz w:val="24"/>
-          <w:szCs w:val="24"/>
-          <w:lang w:eastAsia="en-IN"/>
-        </w:rPr>
-        <w:t xml:space="preserve">Leaders in Array </w:t>
-      </w:r>
-    </w:p>
-    <w:p>
-      <w:pPr>
-        <w:numPr>
-          <w:ilvl w:val="0"/>
-          <w:numId w:val="1"/>
-        </w:numPr>
-        <w:spacing w:before="100" w:beforeAutospacing="1" w:after="100" w:afterAutospacing="1" w:line="240" w:lineRule="auto"/>
-        <w:rPr>
-          <w:rFonts w:ascii="Times New Roman" w:eastAsia="Times New Roman" w:hAnsi="Times New Roman" w:cs="Times New Roman"/>
-          <w:sz w:val="24"/>
-          <w:szCs w:val="24"/>
-          <w:lang w:eastAsia="en-IN"/>
-        </w:rPr>
-      </w:pPr>
-      <w:r>
-        <w:rPr>
-          <w:rFonts w:ascii="Times New Roman" w:eastAsia="Times New Roman" w:hAnsi="Times New Roman" w:cs="Times New Roman"/>
           <w:noProof/>
-          <w:sz w:val="24"/>
-          <w:szCs w:val="24"/>
-          <w:lang w:eastAsia="en-IN"/>
         </w:rPr>
         <mc:AlternateContent>
           <mc:Choice Requires="wps">
             <w:drawing>
-              <wp:anchor distT="0" distB="0" distL="114300" distR="114300" simplePos="0" relativeHeight="251682816" behindDoc="0" locked="0" layoutInCell="1" allowOverlap="1" wp14:anchorId="7A2EABD1" wp14:editId="26CD6219">
+              <wp:anchor distT="0" distB="0" distL="114300" distR="114300" simplePos="0" relativeHeight="251686912" behindDoc="0" locked="0" layoutInCell="1" allowOverlap="1" wp14:anchorId="2D30B1BD" wp14:editId="1EEC5BD9">
                 <wp:simplePos x="0" y="0"/>
                 <wp:positionH relativeFrom="column">
-                  <wp:posOffset>-715222</wp:posOffset>
+                  <wp:posOffset>3860800</wp:posOffset>
                 </wp:positionH>
                 <wp:positionV relativeFrom="paragraph">
-                  <wp:posOffset>176318</wp:posOffset>
+                  <wp:posOffset>2117</wp:posOffset>
                 </wp:positionV>
-                <wp:extent cx="4131522" cy="8890"/>
-                <wp:effectExtent l="0" t="0" r="21590" b="29210"/>
+                <wp:extent cx="351367" cy="131233"/>
+                <wp:effectExtent l="0" t="0" r="0" b="2540"/>
                 <wp:wrapNone/>
-                <wp:docPr id="3" name="Straight Connector 3"/>
+                <wp:docPr id="8" name="Text Box 8"/>
+                <wp:cNvGraphicFramePr/>
+                <a:graphic xmlns:a="http://schemas.openxmlformats.org/drawingml/2006/main">
+                  <a:graphicData uri="http://schemas.microsoft.com/office/word/2010/wordprocessingShape">
+                    <wps:wsp>
+                      <wps:cNvSpPr txBox="1"/>
+                      <wps:spPr>
+                        <a:xfrm>
+                          <a:off x="0" y="0"/>
+                          <a:ext cx="351367" cy="131233"/>
+                        </a:xfrm>
+                        <a:prstGeom prst="rect">
+                          <a:avLst/>
+                        </a:prstGeom>
+                        <a:solidFill>
+                          <a:prstClr val="white"/>
+                        </a:solidFill>
+                        <a:ln>
+                          <a:noFill/>
+                        </a:ln>
+                      </wps:spPr>
+                      <wps:txbx>
+                        <w:txbxContent>
+                          <w:p>
+                            <w:pPr>
+                              <w:pStyle w:val="Caption"/>
+                              <w:rPr>
+                                <w:rFonts w:ascii="Times New Roman" w:eastAsia="Times New Roman" w:hAnsi="Times New Roman" w:cs="Times New Roman"/>
+                                <w:noProof/>
+                                <w:sz w:val="24"/>
+                                <w:szCs w:val="24"/>
+                              </w:rPr>
+                            </w:pPr>
+                            <w:r>
+                              <w:rPr>
+                                <w:lang w:val="en-US"/>
+                              </w:rPr>
+                              <w:t>DONE</w:t>
+                            </w:r>
+                          </w:p>
+                        </w:txbxContent>
+                      </wps:txbx>
+                      <wps:bodyPr rot="0" spcFirstLastPara="0" vertOverflow="overflow" horzOverflow="overflow" vert="horz" wrap="square" lIns="0" tIns="0" rIns="0" bIns="0" numCol="1" spcCol="0" rtlCol="0" fromWordArt="0" anchor="t" anchorCtr="0" forceAA="0" compatLnSpc="1">
+                        <a:prstTxWarp prst="textNoShape">
+                          <a:avLst/>
+                        </a:prstTxWarp>
+                        <a:noAutofit/>
+                      </wps:bodyPr>
+                    </wps:wsp>
+                  </a:graphicData>
+                </a:graphic>
+                <wp14:sizeRelH relativeFrom="margin">
+                  <wp14:pctWidth>0</wp14:pctWidth>
+                </wp14:sizeRelH>
+                <wp14:sizeRelV relativeFrom="margin">
+                  <wp14:pctHeight>0</wp14:pctHeight>
+                </wp14:sizeRelV>
+              </wp:anchor>
+            </w:drawing>
+          </mc:Choice>
+          <mc:Fallback>
+            <w:pict>
+              <v:shapetype w14:anchorId="2D30B1BD" id="_x0000_t202" coordsize="21600,21600" o:spt="202" path="m,l,21600r21600,l21600,xe">
+                <v:stroke joinstyle="miter"/>
+                <v:path gradientshapeok="t" o:connecttype="rect"/>
+              </v:shapetype>
+              <v:shape id="Text Box 8" o:spid="_x0000_s1026" type="#_x0000_t202" style="position:absolute;left:0;text-align:left;margin-left:304pt;margin-top:.15pt;width:27.65pt;height:10.35pt;z-index:251686912;visibility:visible;mso-wrap-style:square;mso-width-percent:0;mso-height-percent:0;mso-wrap-distance-left:9pt;mso-wrap-distance-top:0;mso-wrap-distance-right:9pt;mso-wrap-distance-bottom:0;mso-position-horizontal:absolute;mso-position-horizontal-relative:text;mso-position-vertical:absolute;mso-position-vertical-relative:text;mso-width-percent:0;mso-height-percent:0;mso-width-relative:margin;mso-height-relative:margin;v-text-anchor:top" o:gfxdata="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" stroked="f">
+                <v:textbox inset="0,0,0,0">
+                  <w:txbxContent>
+                    <w:p>
+                      <w:pPr>
+                        <w:pStyle w:val="Caption"/>
+                        <w:rPr>
+                          <w:rFonts w:ascii="Times New Roman" w:eastAsia="Times New Roman" w:hAnsi="Times New Roman" w:cs="Times New Roman"/>
+                          <w:noProof/>
+                          <w:sz w:val="24"/>
+                          <w:szCs w:val="24"/>
+                        </w:rPr>
+                      </w:pPr>
+                      <w:r>
+                        <w:rPr>
+                          <w:lang w:val="en-US"/>
+                        </w:rPr>
+                        <w:t>DONE</w:t>
+                      </w:r>
+                    </w:p>
+                  </w:txbxContent>
+                </v:textbox>
+              </v:shape>
+            </w:pict>
+          </mc:Fallback>
+        </mc:AlternateContent>
+      </w:r>
+      <w:r>
+        <w:rPr>
+          <w:rFonts w:ascii="Times New Roman" w:eastAsia="Times New Roman" w:hAnsi="Times New Roman" w:cs="Times New Roman"/>
+          <w:noProof/>
+          <w:sz w:val="24"/>
+          <w:szCs w:val="24"/>
+          <w:lang w:eastAsia="en-IN"/>
+        </w:rPr>
+        <mc:AlternateContent>
+          <mc:Choice Requires="wps">
+            <w:drawing>
+              <wp:anchor distT="0" distB="0" distL="114300" distR="114300" simplePos="0" relativeHeight="251683840" behindDoc="0" locked="0" layoutInCell="1" allowOverlap="1" wp14:anchorId="68DEFBDB" wp14:editId="5D77971E">
+                <wp:simplePos x="0" y="0"/>
+                <wp:positionH relativeFrom="column">
+                  <wp:posOffset>2442422</wp:posOffset>
+                </wp:positionH>
+                <wp:positionV relativeFrom="paragraph">
+                  <wp:posOffset>78105</wp:posOffset>
+                </wp:positionV>
+                <wp:extent cx="1380066" cy="0"/>
+                <wp:effectExtent l="0" t="76200" r="10795" b="95250"/>
+                <wp:wrapNone/>
+                <wp:docPr id="6" name="Straight Arrow Connector 6"/>
                 <wp:cNvGraphicFramePr/>
                 <a:graphic xmlns:a="http://schemas.openxmlformats.org/drawingml/2006/main">
                   <a:graphicData uri="http://schemas.microsoft.com/office/word/2010/wordprocessingShape">
                     <wps:wsp>
                       <wps:cNvCnPr/>
                       <wps:spPr>
-                        <a:xfrm flipV="1">
+                        <a:xfrm>
                           <a:off x="0" y="0"/>
-                          <a:ext cx="4131522" cy="8890"/>
+                          <a:ext cx="1380066" cy="0"/>
                         </a:xfrm>
-                        <a:prstGeom prst="line">
+                        <a:prstGeom prst="straightConnector1">
                           <a:avLst/>
                         </a:prstGeom>
+                        <a:ln>
+                          <a:tailEnd type="triangle"/>
+                        </a:ln>
                       </wps:spPr>
                       <wps:style>
                         <a:lnRef idx="1">
@@ -858,322 +952,484 @@
                     </wps:wsp>
                   </a:graphicData>
                 </a:graphic>
-                <wp14:sizeRelH relativeFrom="margin">
-                  <wp14:pctWidth>0</wp14:pctWidth>
-                </wp14:sizeRelH>
-                <wp14:sizeRelV relativeFrom="margin">
-                  <wp14:pctHeight>0</wp14:pctHeight>
-                </wp14:sizeRelV>
               </wp:anchor>
             </w:drawing>
           </mc:Choice>
           <mc:Fallback>
             <w:pict>
-              <v:line w14:anchorId="444FB735" id="Straight Connector 3" o:spid="_x0000_s1026" style="position:absolute;flip:y;z-index:251682816;visibility:visible;mso-wrap-style:square;mso-width-percent:0;mso-height-percent:0;mso-wrap-distance-left:9pt;mso-wrap-distance-top:0;mso-wrap-distance-right:9pt;mso-wrap-distance-bottom:0;mso-position-horizontal:absolute;mso-position-horizontal-relative:text;mso-position-vertical:absolute;mso-position-vertical-relative:text;mso-width-percent:0;mso-height-percent:0;mso-width-relative:margin;mso-height-relative:margin" from="-56.3pt,13.9pt" to="269pt,14.6pt" o:gfxdata="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" strokecolor="#4472c4 [3204]" strokeweight=".5pt">
+              <v:shapetype w14:anchorId="24CA71A8" id="_x0000_t32" coordsize="21600,21600" o:spt="32" o:oned="t" path="m,l21600,21600e" filled="f">
+                <v:path arrowok="t" fillok="f" o:connecttype="none"/>
+                <o:lock v:ext="edit" shapetype="t"/>
+              </v:shapetype>
+              <v:shape id="Straight Arrow Connector 6" o:spid="_x0000_s1026" type="#_x0000_t32" style="position:absolute;margin-left:192.3pt;margin-top:6.15pt;width:108.65pt;height:0;z-index:251683840;visibility:visible;mso-wrap-style:square;mso-wrap-distance-left:9pt;mso-wrap-distance-top:0;mso-wrap-distance-right:9pt;mso-wrap-distance-bottom:0;mso-position-horizontal:absolute;mso-position-horizontal-relative:text;mso-position-vertical:absolute;mso-position-vertical-relative:text" o:gfxdata="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" strokecolor="#4472c4 [3204]" strokeweight=".5pt">
+                <v:stroke endarrow="block" joinstyle="miter"/>
+              </v:shape>
+            </w:pict>
+          </mc:Fallback>
+        </mc:AlternateContent>
+      </w:r>
+      <w:r>
+        <w:rPr>
+          <w:rFonts w:ascii="Times New Roman" w:eastAsia="Times New Roman" w:hAnsi="Times New Roman" w:cs="Times New Roman"/>
+          <w:sz w:val="24"/>
+          <w:szCs w:val="24"/>
+          <w:lang w:eastAsia="en-IN"/>
+        </w:rPr>
+        <w:t xml:space="preserve">Pair Sum </w:t>
+      </w:r>
+    </w:p>
+    <w:p>
+      <w:pPr>
+        <w:numPr>
+          <w:ilvl w:val="0"/>
+          <w:numId w:val="1"/>
+        </w:numPr>
+        <w:spacing w:before="100" w:beforeAutospacing="1" w:after="100" w:afterAutospacing="1" w:line="240" w:lineRule="auto"/>
+        <w:rPr>
+          <w:rFonts w:ascii="Times New Roman" w:eastAsia="Times New Roman" w:hAnsi="Times New Roman" w:cs="Times New Roman"/>
+          <w:sz w:val="24"/>
+          <w:szCs w:val="24"/>
+          <w:lang w:eastAsia="en-IN"/>
+        </w:rPr>
+      </w:pPr>
+      <w:r>
+        <w:rPr>
+          <w:rFonts w:ascii="Times New Roman" w:eastAsia="Times New Roman" w:hAnsi="Times New Roman" w:cs="Times New Roman"/>
+          <w:sz w:val="24"/>
+          <w:szCs w:val="24"/>
+          <w:lang w:eastAsia="en-IN"/>
+        </w:rPr>
+        <w:t xml:space="preserve">Two Sum </w:t>
+      </w:r>
+    </w:p>
+    <w:p>
+      <w:pPr>
+        <w:numPr>
+          <w:ilvl w:val="0"/>
+          <w:numId w:val="1"/>
+        </w:numPr>
+        <w:spacing w:before="100" w:beforeAutospacing="1" w:after="100" w:afterAutospacing="1" w:line="240" w:lineRule="auto"/>
+        <w:rPr>
+          <w:rFonts w:ascii="Times New Roman" w:eastAsia="Times New Roman" w:hAnsi="Times New Roman" w:cs="Times New Roman"/>
+          <w:sz w:val="24"/>
+          <w:szCs w:val="24"/>
+          <w:lang w:eastAsia="en-IN"/>
+        </w:rPr>
+      </w:pPr>
+      <w:r>
+        <w:rPr>
+          <w:rFonts w:ascii="Times New Roman" w:eastAsia="Times New Roman" w:hAnsi="Times New Roman" w:cs="Times New Roman"/>
+          <w:sz w:val="24"/>
+          <w:szCs w:val="24"/>
+          <w:lang w:eastAsia="en-IN"/>
+        </w:rPr>
+        <w:t xml:space="preserve">Majority Element </w:t>
+      </w:r>
+    </w:p>
+    <w:p>
+      <w:pPr>
+        <w:numPr>
+          <w:ilvl w:val="0"/>
+          <w:numId w:val="1"/>
+        </w:numPr>
+        <w:spacing w:before="100" w:beforeAutospacing="1" w:after="100" w:afterAutospacing="1" w:line="240" w:lineRule="auto"/>
+        <w:rPr>
+          <w:rFonts w:ascii="Times New Roman" w:eastAsia="Times New Roman" w:hAnsi="Times New Roman" w:cs="Times New Roman"/>
+          <w:sz w:val="24"/>
+          <w:szCs w:val="24"/>
+          <w:lang w:eastAsia="en-IN"/>
+        </w:rPr>
+      </w:pPr>
+      <w:r>
+        <w:rPr>
+          <w:rFonts w:ascii="Times New Roman" w:eastAsia="Times New Roman" w:hAnsi="Times New Roman" w:cs="Times New Roman"/>
+          <w:sz w:val="24"/>
+          <w:szCs w:val="24"/>
+          <w:lang w:eastAsia="en-IN"/>
+        </w:rPr>
+        <w:t xml:space="preserve">Leaders in Array </w:t>
+      </w:r>
+    </w:p>
+    <w:p>
+      <w:pPr>
+        <w:numPr>
+          <w:ilvl w:val="0"/>
+          <w:numId w:val="1"/>
+        </w:numPr>
+        <w:spacing w:before="100" w:beforeAutospacing="1" w:after="100" w:afterAutospacing="1" w:line="240" w:lineRule="auto"/>
+        <w:rPr>
+          <w:rFonts w:ascii="Times New Roman" w:eastAsia="Times New Roman" w:hAnsi="Times New Roman" w:cs="Times New Roman"/>
+          <w:sz w:val="24"/>
+          <w:szCs w:val="24"/>
+          <w:lang w:eastAsia="en-IN"/>
+        </w:rPr>
+      </w:pPr>
+      <w:r>
+        <w:rPr>
+          <w:rFonts w:ascii="Times New Roman" w:eastAsia="Times New Roman" w:hAnsi="Times New Roman" w:cs="Times New Roman"/>
+          <w:sz w:val="24"/>
+          <w:szCs w:val="24"/>
+          <w:lang w:eastAsia="en-IN"/>
+        </w:rPr>
+        <w:t xml:space="preserve">Equilibrium Index </w:t>
+      </w:r>
+    </w:p>
+    <w:p>
+      <w:pPr>
+        <w:numPr>
+          <w:ilvl w:val="0"/>
+          <w:numId w:val="1"/>
+        </w:numPr>
+        <w:spacing w:before="100" w:beforeAutospacing="1" w:after="100" w:afterAutospacing="1" w:line="240" w:lineRule="auto"/>
+        <w:rPr>
+          <w:rFonts w:ascii="Times New Roman" w:eastAsia="Times New Roman" w:hAnsi="Times New Roman" w:cs="Times New Roman"/>
+          <w:sz w:val="24"/>
+          <w:szCs w:val="24"/>
+          <w:lang w:eastAsia="en-IN"/>
+        </w:rPr>
+      </w:pPr>
+      <w:r>
+        <w:rPr>
+          <w:rFonts w:ascii="Times New Roman" w:eastAsia="Times New Roman" w:hAnsi="Times New Roman" w:cs="Times New Roman"/>
+          <w:sz w:val="24"/>
+          <w:szCs w:val="24"/>
+          <w:lang w:eastAsia="en-IN"/>
+        </w:rPr>
+        <w:t xml:space="preserve">Stock Buy and Sell </w:t>
+      </w:r>
+    </w:p>
+    <w:p>
+      <w:pPr>
+        <w:numPr>
+          <w:ilvl w:val="0"/>
+          <w:numId w:val="1"/>
+        </w:numPr>
+        <w:spacing w:before="100" w:beforeAutospacing="1" w:after="100" w:afterAutospacing="1" w:line="240" w:lineRule="auto"/>
+        <w:rPr>
+          <w:rFonts w:ascii="Times New Roman" w:eastAsia="Times New Roman" w:hAnsi="Times New Roman" w:cs="Times New Roman"/>
+          <w:sz w:val="24"/>
+          <w:szCs w:val="24"/>
+          <w:lang w:eastAsia="en-IN"/>
+        </w:rPr>
+      </w:pPr>
+      <w:proofErr w:type="spellStart"/>
+      <w:r>
+        <w:rPr>
+          <w:rFonts w:ascii="Times New Roman" w:eastAsia="Times New Roman" w:hAnsi="Times New Roman" w:cs="Times New Roman"/>
+          <w:sz w:val="24"/>
+          <w:szCs w:val="24"/>
+          <w:lang w:eastAsia="en-IN"/>
+        </w:rPr>
+        <w:t>Kadane's</w:t>
+      </w:r>
+      <w:proofErr w:type="spellEnd"/>
+      <w:r>
+        <w:rPr>
+          <w:rFonts w:ascii="Times New Roman" w:eastAsia="Times New Roman" w:hAnsi="Times New Roman" w:cs="Times New Roman"/>
+          <w:sz w:val="24"/>
+          <w:szCs w:val="24"/>
+          <w:lang w:eastAsia="en-IN"/>
+        </w:rPr>
+        <w:t xml:space="preserve"> Algorithm </w:t>
+      </w:r>
+    </w:p>
+    <w:p>
+      <w:pPr>
+        <w:spacing w:after="0" w:line="240" w:lineRule="auto"/>
+        <w:rPr>
+          <w:rFonts w:ascii="Times New Roman" w:eastAsia="Times New Roman" w:hAnsi="Times New Roman" w:cs="Times New Roman"/>
+          <w:sz w:val="24"/>
+          <w:szCs w:val="24"/>
+          <w:lang w:eastAsia="en-IN"/>
+        </w:rPr>
+      </w:pPr>
+      <w:r>
+        <w:rPr>
+          <w:rFonts w:ascii="Times New Roman" w:eastAsia="Times New Roman" w:hAnsi="Times New Roman" w:cs="Times New Roman"/>
+          <w:sz w:val="24"/>
+          <w:szCs w:val="24"/>
+          <w:lang w:eastAsia="en-IN"/>
+        </w:rPr>
+        <w:pict w14:anchorId="39F095BD">
+          <v:rect id="_x0000_i1026" style="width:0;height:1.5pt" o:hralign="center" o:hrstd="t" o:hr="t" fillcolor="#a0a0a0" stroked="f"/>
+        </w:pict>
+      </w:r>
+    </w:p>
+    <w:p>
+      <w:pPr>
+        <w:spacing w:before="100" w:beforeAutospacing="1" w:after="100" w:afterAutospacing="1" w:line="240" w:lineRule="auto"/>
+        <w:outlineLvl w:val="1"/>
+        <w:rPr>
+          <w:rFonts w:ascii="Times New Roman" w:eastAsia="Times New Roman" w:hAnsi="Times New Roman" w:cs="Times New Roman"/>
+          <w:b/>
+          <w:bCs/>
+          <w:sz w:val="36"/>
+          <w:szCs w:val="36"/>
+          <w:lang w:eastAsia="en-IN"/>
+        </w:rPr>
+      </w:pPr>
+      <w:r>
+        <w:rPr>
+          <w:rFonts w:ascii="Times New Roman" w:eastAsia="Times New Roman" w:hAnsi="Times New Roman" w:cs="Times New Roman"/>
+          <w:b/>
+          <w:bCs/>
+          <w:sz w:val="36"/>
+          <w:szCs w:val="36"/>
+          <w:lang w:eastAsia="en-IN"/>
+        </w:rPr>
+        <w:t>HashMap / Dictionary (15)</w:t>
+      </w:r>
+    </w:p>
+    <w:p>
+      <w:pPr>
+        <w:numPr>
+          <w:ilvl w:val="0"/>
+          <w:numId w:val="2"/>
+        </w:numPr>
+        <w:spacing w:before="100" w:beforeAutospacing="1" w:after="100" w:afterAutospacing="1" w:line="240" w:lineRule="auto"/>
+        <w:rPr>
+          <w:rFonts w:ascii="Times New Roman" w:eastAsia="Times New Roman" w:hAnsi="Times New Roman" w:cs="Times New Roman"/>
+          <w:sz w:val="24"/>
+          <w:szCs w:val="24"/>
+          <w:lang w:eastAsia="en-IN"/>
+        </w:rPr>
+      </w:pPr>
+      <w:r>
+        <w:rPr>
+          <w:rFonts w:ascii="Times New Roman" w:eastAsia="Times New Roman" w:hAnsi="Times New Roman" w:cs="Times New Roman"/>
+          <w:sz w:val="24"/>
+          <w:szCs w:val="24"/>
+          <w:lang w:eastAsia="en-IN"/>
+        </w:rPr>
+        <w:t xml:space="preserve">Frequency Count </w:t>
+      </w:r>
+    </w:p>
+    <w:p>
+      <w:pPr>
+        <w:numPr>
+          <w:ilvl w:val="0"/>
+          <w:numId w:val="2"/>
+        </w:numPr>
+        <w:spacing w:before="100" w:beforeAutospacing="1" w:after="100" w:afterAutospacing="1" w:line="240" w:lineRule="auto"/>
+        <w:rPr>
+          <w:rFonts w:ascii="Times New Roman" w:eastAsia="Times New Roman" w:hAnsi="Times New Roman" w:cs="Times New Roman"/>
+          <w:sz w:val="24"/>
+          <w:szCs w:val="24"/>
+          <w:lang w:eastAsia="en-IN"/>
+        </w:rPr>
+      </w:pPr>
+      <w:r>
+        <w:rPr>
+          <w:rFonts w:ascii="Times New Roman" w:eastAsia="Times New Roman" w:hAnsi="Times New Roman" w:cs="Times New Roman"/>
+          <w:sz w:val="24"/>
+          <w:szCs w:val="24"/>
+          <w:lang w:eastAsia="en-IN"/>
+        </w:rPr>
+        <w:t xml:space="preserve">Character Frequency </w:t>
+      </w:r>
+    </w:p>
+    <w:p>
+      <w:pPr>
+        <w:numPr>
+          <w:ilvl w:val="0"/>
+          <w:numId w:val="2"/>
+        </w:numPr>
+        <w:spacing w:before="100" w:beforeAutospacing="1" w:after="100" w:afterAutospacing="1" w:line="240" w:lineRule="auto"/>
+        <w:rPr>
+          <w:rFonts w:ascii="Times New Roman" w:eastAsia="Times New Roman" w:hAnsi="Times New Roman" w:cs="Times New Roman"/>
+          <w:sz w:val="24"/>
+          <w:szCs w:val="24"/>
+          <w:lang w:eastAsia="en-IN"/>
+        </w:rPr>
+      </w:pPr>
+      <w:r>
+        <w:rPr>
+          <w:rFonts w:ascii="Times New Roman" w:eastAsia="Times New Roman" w:hAnsi="Times New Roman" w:cs="Times New Roman"/>
+          <w:sz w:val="24"/>
+          <w:szCs w:val="24"/>
+          <w:lang w:eastAsia="en-IN"/>
+        </w:rPr>
+        <w:t xml:space="preserve">Word Frequency </w:t>
+      </w:r>
+    </w:p>
+    <w:p>
+      <w:pPr>
+        <w:numPr>
+          <w:ilvl w:val="0"/>
+          <w:numId w:val="2"/>
+        </w:numPr>
+        <w:spacing w:before="100" w:beforeAutospacing="1" w:after="100" w:afterAutospacing="1" w:line="240" w:lineRule="auto"/>
+        <w:rPr>
+          <w:rFonts w:ascii="Times New Roman" w:eastAsia="Times New Roman" w:hAnsi="Times New Roman" w:cs="Times New Roman"/>
+          <w:sz w:val="24"/>
+          <w:szCs w:val="24"/>
+          <w:lang w:eastAsia="en-IN"/>
+        </w:rPr>
+      </w:pPr>
+      <w:r>
+        <w:rPr>
+          <w:rFonts w:ascii="Times New Roman" w:eastAsia="Times New Roman" w:hAnsi="Times New Roman" w:cs="Times New Roman"/>
+          <w:sz w:val="24"/>
+          <w:szCs w:val="24"/>
+          <w:lang w:eastAsia="en-IN"/>
+        </w:rPr>
+        <w:t xml:space="preserve">Maximum Frequency </w:t>
+      </w:r>
+    </w:p>
+    <w:p>
+      <w:pPr>
+        <w:numPr>
+          <w:ilvl w:val="0"/>
+          <w:numId w:val="2"/>
+        </w:numPr>
+        <w:spacing w:before="100" w:beforeAutospacing="1" w:after="100" w:afterAutospacing="1" w:line="240" w:lineRule="auto"/>
+        <w:rPr>
+          <w:rFonts w:ascii="Times New Roman" w:eastAsia="Times New Roman" w:hAnsi="Times New Roman" w:cs="Times New Roman"/>
+          <w:sz w:val="24"/>
+          <w:szCs w:val="24"/>
+          <w:lang w:eastAsia="en-IN"/>
+        </w:rPr>
+      </w:pPr>
+      <w:r>
+        <w:rPr>
+          <w:rFonts w:ascii="Times New Roman" w:eastAsia="Times New Roman" w:hAnsi="Times New Roman" w:cs="Times New Roman"/>
+          <w:sz w:val="24"/>
+          <w:szCs w:val="24"/>
+          <w:lang w:eastAsia="en-IN"/>
+        </w:rPr>
+        <w:t xml:space="preserve">First Non-Repeating </w:t>
+      </w:r>
+    </w:p>
+    <w:p>
+      <w:pPr>
+        <w:numPr>
+          <w:ilvl w:val="0"/>
+          <w:numId w:val="2"/>
+        </w:numPr>
+        <w:spacing w:before="100" w:beforeAutospacing="1" w:after="100" w:afterAutospacing="1" w:line="240" w:lineRule="auto"/>
+        <w:rPr>
+          <w:rFonts w:ascii="Times New Roman" w:eastAsia="Times New Roman" w:hAnsi="Times New Roman" w:cs="Times New Roman"/>
+          <w:sz w:val="24"/>
+          <w:szCs w:val="24"/>
+          <w:lang w:eastAsia="en-IN"/>
+        </w:rPr>
+      </w:pPr>
+      <w:r>
+        <w:rPr>
+          <w:rFonts w:ascii="Times New Roman" w:eastAsia="Times New Roman" w:hAnsi="Times New Roman" w:cs="Times New Roman"/>
+          <w:sz w:val="24"/>
+          <w:szCs w:val="24"/>
+          <w:lang w:eastAsia="en-IN"/>
+        </w:rPr>
+        <w:t xml:space="preserve">First Repeating </w:t>
+      </w:r>
+    </w:p>
+    <w:p>
+      <w:pPr>
+        <w:numPr>
+          <w:ilvl w:val="0"/>
+          <w:numId w:val="2"/>
+        </w:numPr>
+        <w:spacing w:before="100" w:beforeAutospacing="1" w:after="100" w:afterAutospacing="1" w:line="240" w:lineRule="auto"/>
+        <w:rPr>
+          <w:rFonts w:ascii="Times New Roman" w:eastAsia="Times New Roman" w:hAnsi="Times New Roman" w:cs="Times New Roman"/>
+          <w:sz w:val="24"/>
+          <w:szCs w:val="24"/>
+          <w:lang w:eastAsia="en-IN"/>
+        </w:rPr>
+      </w:pPr>
+      <w:r>
+        <w:rPr>
+          <w:rFonts w:ascii="Times New Roman" w:eastAsia="Times New Roman" w:hAnsi="Times New Roman" w:cs="Times New Roman"/>
+          <w:sz w:val="24"/>
+          <w:szCs w:val="24"/>
+          <w:lang w:eastAsia="en-IN"/>
+        </w:rPr>
+        <w:t xml:space="preserve">Count Duplicates </w:t>
+      </w:r>
+    </w:p>
+    <w:p>
+      <w:pPr>
+        <w:numPr>
+          <w:ilvl w:val="0"/>
+          <w:numId w:val="2"/>
+        </w:numPr>
+        <w:spacing w:before="100" w:beforeAutospacing="1" w:after="100" w:afterAutospacing="1" w:line="240" w:lineRule="auto"/>
+        <w:rPr>
+          <w:rFonts w:ascii="Times New Roman" w:eastAsia="Times New Roman" w:hAnsi="Times New Roman" w:cs="Times New Roman"/>
+          <w:sz w:val="24"/>
+          <w:szCs w:val="24"/>
+          <w:lang w:eastAsia="en-IN"/>
+        </w:rPr>
+      </w:pPr>
+      <w:r>
+        <w:rPr>
+          <w:rFonts w:ascii="Times New Roman" w:eastAsia="Times New Roman" w:hAnsi="Times New Roman" w:cs="Times New Roman"/>
+          <w:noProof/>
+          <w:sz w:val="24"/>
+          <w:szCs w:val="24"/>
+          <w:lang w:eastAsia="en-IN"/>
+        </w:rPr>
+        <mc:AlternateContent>
+          <mc:Choice Requires="wps">
+            <w:drawing>
+              <wp:anchor distT="0" distB="0" distL="114300" distR="114300" simplePos="0" relativeHeight="251687936" behindDoc="0" locked="0" layoutInCell="1" allowOverlap="1" wp14:anchorId="5CDB6AC5" wp14:editId="52AB213B">
+                <wp:simplePos x="0" y="0"/>
+                <wp:positionH relativeFrom="column">
+                  <wp:posOffset>-774065</wp:posOffset>
+                </wp:positionH>
+                <wp:positionV relativeFrom="paragraph">
+                  <wp:posOffset>175472</wp:posOffset>
+                </wp:positionV>
+                <wp:extent cx="4102100" cy="29633"/>
+                <wp:effectExtent l="0" t="0" r="31750" b="27940"/>
+                <wp:wrapNone/>
+                <wp:docPr id="9" name="Straight Connector 9"/>
+                <wp:cNvGraphicFramePr/>
+                <a:graphic xmlns:a="http://schemas.openxmlformats.org/drawingml/2006/main">
+                  <a:graphicData uri="http://schemas.microsoft.com/office/word/2010/wordprocessingShape">
+                    <wps:wsp>
+                      <wps:cNvCnPr/>
+                      <wps:spPr>
+                        <a:xfrm>
+                          <a:off x="0" y="0"/>
+                          <a:ext cx="4102100" cy="29633"/>
+                        </a:xfrm>
+                        <a:prstGeom prst="line">
+                          <a:avLst/>
+                        </a:prstGeom>
+                        <a:ln w="12700"/>
+                      </wps:spPr>
+                      <wps:style>
+                        <a:lnRef idx="1">
+                          <a:schemeClr val="accent1"/>
+                        </a:lnRef>
+                        <a:fillRef idx="0">
+                          <a:schemeClr val="accent1"/>
+                        </a:fillRef>
+                        <a:effectRef idx="0">
+                          <a:schemeClr val="accent1"/>
+                        </a:effectRef>
+                        <a:fontRef idx="minor">
+                          <a:schemeClr val="tx1"/>
+                        </a:fontRef>
+                      </wps:style>
+                      <wps:bodyPr/>
+                    </wps:wsp>
+                  </a:graphicData>
+                </a:graphic>
+              </wp:anchor>
+            </w:drawing>
+          </mc:Choice>
+          <mc:Fallback>
+            <w:pict>
+              <v:line w14:anchorId="1BAD7B26" id="Straight Connector 9" o:spid="_x0000_s1026" style="position:absolute;z-index:251687936;visibility:visible;mso-wrap-style:square;mso-wrap-distance-left:9pt;mso-wrap-distance-top:0;mso-wrap-distance-right:9pt;mso-wrap-distance-bottom:0;mso-position-horizontal:absolute;mso-position-horizontal-relative:text;mso-position-vertical:absolute;mso-position-vertical-relative:text" from="-60.95pt,13.8pt" to="262.05pt,16.15pt" o:gfxdata="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" strokecolor="#4472c4 [3204]" strokeweight="1pt">
                 <v:stroke joinstyle="miter"/>
               </v:line>
             </w:pict>
           </mc:Fallback>
         </mc:AlternateContent>
       </w:r>
-      <w:r>
-        <w:rPr>
-          <w:rFonts w:ascii="Times New Roman" w:eastAsia="Times New Roman" w:hAnsi="Times New Roman" w:cs="Times New Roman"/>
-          <w:sz w:val="24"/>
-          <w:szCs w:val="24"/>
-          <w:lang w:eastAsia="en-IN"/>
-        </w:rPr>
-        <w:t xml:space="preserve">Equilibrium Index </w:t>
-      </w:r>
-    </w:p>
-    <w:p>
-      <w:pPr>
-        <w:numPr>
-          <w:ilvl w:val="0"/>
-          <w:numId w:val="1"/>
-        </w:numPr>
-        <w:spacing w:before="100" w:beforeAutospacing="1" w:after="100" w:afterAutospacing="1" w:line="240" w:lineRule="auto"/>
-        <w:rPr>
-          <w:rFonts w:ascii="Times New Roman" w:eastAsia="Times New Roman" w:hAnsi="Times New Roman" w:cs="Times New Roman"/>
-          <w:sz w:val="24"/>
-          <w:szCs w:val="24"/>
-          <w:lang w:eastAsia="en-IN"/>
-        </w:rPr>
-      </w:pPr>
-      <w:r>
-        <w:rPr>
-          <w:rFonts w:ascii="Times New Roman" w:eastAsia="Times New Roman" w:hAnsi="Times New Roman" w:cs="Times New Roman"/>
-          <w:sz w:val="24"/>
-          <w:szCs w:val="24"/>
-          <w:lang w:eastAsia="en-IN"/>
-        </w:rPr>
-        <w:t xml:space="preserve">Stock Buy and Sell </w:t>
-      </w:r>
-    </w:p>
-    <w:p>
-      <w:pPr>
-        <w:numPr>
-          <w:ilvl w:val="0"/>
-          <w:numId w:val="1"/>
-        </w:numPr>
-        <w:spacing w:before="100" w:beforeAutospacing="1" w:after="100" w:afterAutospacing="1" w:line="240" w:lineRule="auto"/>
-        <w:rPr>
-          <w:rFonts w:ascii="Times New Roman" w:eastAsia="Times New Roman" w:hAnsi="Times New Roman" w:cs="Times New Roman"/>
-          <w:sz w:val="24"/>
-          <w:szCs w:val="24"/>
-          <w:lang w:eastAsia="en-IN"/>
-        </w:rPr>
-      </w:pPr>
-      <w:proofErr w:type="spellStart"/>
-      <w:r>
-        <w:rPr>
-          <w:rFonts w:ascii="Times New Roman" w:eastAsia="Times New Roman" w:hAnsi="Times New Roman" w:cs="Times New Roman"/>
-          <w:sz w:val="24"/>
-          <w:szCs w:val="24"/>
-          <w:lang w:eastAsia="en-IN"/>
-        </w:rPr>
-        <w:t>Kadane's</w:t>
-      </w:r>
-      <w:proofErr w:type="spellEnd"/>
-      <w:r>
-        <w:rPr>
-          <w:rFonts w:ascii="Times New Roman" w:eastAsia="Times New Roman" w:hAnsi="Times New Roman" w:cs="Times New Roman"/>
-          <w:sz w:val="24"/>
-          <w:szCs w:val="24"/>
-          <w:lang w:eastAsia="en-IN"/>
-        </w:rPr>
-        <w:t xml:space="preserve"> Algorithm </w:t>
-      </w:r>
-    </w:p>
-    <w:p>
-      <w:pPr>
-        <w:spacing w:after="0" w:line="240" w:lineRule="auto"/>
-        <w:rPr>
-          <w:rFonts w:ascii="Times New Roman" w:eastAsia="Times New Roman" w:hAnsi="Times New Roman" w:cs="Times New Roman"/>
-          <w:sz w:val="24"/>
-          <w:szCs w:val="24"/>
-          <w:lang w:eastAsia="en-IN"/>
-        </w:rPr>
-      </w:pPr>
-      <w:r>
-        <w:rPr>
-          <w:rFonts w:ascii="Times New Roman" w:eastAsia="Times New Roman" w:hAnsi="Times New Roman" w:cs="Times New Roman"/>
-          <w:sz w:val="24"/>
-          <w:szCs w:val="24"/>
-          <w:lang w:eastAsia="en-IN"/>
-        </w:rPr>
-        <w:pict w14:anchorId="39F095BD">
-          <v:rect id="_x0000_i1026" style="width:0;height:1.5pt" o:hralign="center" o:hrstd="t" o:hr="t" fillcolor="#a0a0a0" stroked="f"/>
-        </w:pict>
-      </w:r>
-    </w:p>
-    <w:p>
-      <w:pPr>
-        <w:spacing w:before="100" w:beforeAutospacing="1" w:after="100" w:afterAutospacing="1" w:line="240" w:lineRule="auto"/>
-        <w:outlineLvl w:val="1"/>
-        <w:rPr>
-          <w:rFonts w:ascii="Times New Roman" w:eastAsia="Times New Roman" w:hAnsi="Times New Roman" w:cs="Times New Roman"/>
-          <w:b/>
-          <w:bCs/>
-          <w:sz w:val="36"/>
-          <w:szCs w:val="36"/>
-          <w:lang w:eastAsia="en-IN"/>
-        </w:rPr>
-      </w:pPr>
-      <w:r>
-        <w:rPr>
-          <w:rFonts w:ascii="Times New Roman" w:eastAsia="Times New Roman" w:hAnsi="Times New Roman" w:cs="Times New Roman"/>
-          <w:b/>
-          <w:bCs/>
-          <w:sz w:val="36"/>
-          <w:szCs w:val="36"/>
-          <w:lang w:eastAsia="en-IN"/>
-        </w:rPr>
-        <w:t>HashMap / Dictionary (15)</w:t>
-      </w:r>
-    </w:p>
-    <w:p>
-      <w:pPr>
-        <w:numPr>
-          <w:ilvl w:val="0"/>
-          <w:numId w:val="2"/>
-        </w:numPr>
-        <w:spacing w:before="100" w:beforeAutospacing="1" w:after="100" w:afterAutospacing="1" w:line="240" w:lineRule="auto"/>
-        <w:rPr>
-          <w:rFonts w:ascii="Times New Roman" w:eastAsia="Times New Roman" w:hAnsi="Times New Roman" w:cs="Times New Roman"/>
-          <w:sz w:val="24"/>
-          <w:szCs w:val="24"/>
-          <w:lang w:eastAsia="en-IN"/>
-        </w:rPr>
-      </w:pPr>
-      <w:r>
-        <w:rPr>
-          <w:rFonts w:ascii="Times New Roman" w:eastAsia="Times New Roman" w:hAnsi="Times New Roman" w:cs="Times New Roman"/>
-          <w:sz w:val="24"/>
-          <w:szCs w:val="24"/>
-          <w:lang w:eastAsia="en-IN"/>
-        </w:rPr>
-        <w:t xml:space="preserve">Frequency Count </w:t>
-      </w:r>
-    </w:p>
-    <w:p>
-      <w:pPr>
-        <w:numPr>
-          <w:ilvl w:val="0"/>
-          <w:numId w:val="2"/>
-        </w:numPr>
-        <w:spacing w:before="100" w:beforeAutospacing="1" w:after="100" w:afterAutospacing="1" w:line="240" w:lineRule="auto"/>
-        <w:rPr>
-          <w:rFonts w:ascii="Times New Roman" w:eastAsia="Times New Roman" w:hAnsi="Times New Roman" w:cs="Times New Roman"/>
-          <w:sz w:val="24"/>
-          <w:szCs w:val="24"/>
-          <w:lang w:eastAsia="en-IN"/>
-        </w:rPr>
-      </w:pPr>
-      <w:r>
-        <w:rPr>
-          <w:rFonts w:ascii="Times New Roman" w:eastAsia="Times New Roman" w:hAnsi="Times New Roman" w:cs="Times New Roman"/>
-          <w:sz w:val="24"/>
-          <w:szCs w:val="24"/>
-          <w:lang w:eastAsia="en-IN"/>
-        </w:rPr>
-        <w:t xml:space="preserve">Character Frequency </w:t>
-      </w:r>
-    </w:p>
-    <w:p>
-      <w:pPr>
-        <w:numPr>
-          <w:ilvl w:val="0"/>
-          <w:numId w:val="2"/>
-        </w:numPr>
-        <w:spacing w:before="100" w:beforeAutospacing="1" w:after="100" w:afterAutospacing="1" w:line="240" w:lineRule="auto"/>
-        <w:rPr>
-          <w:rFonts w:ascii="Times New Roman" w:eastAsia="Times New Roman" w:hAnsi="Times New Roman" w:cs="Times New Roman"/>
-          <w:sz w:val="24"/>
-          <w:szCs w:val="24"/>
-          <w:lang w:eastAsia="en-IN"/>
-        </w:rPr>
-      </w:pPr>
-      <w:r>
-        <w:rPr>
-          <w:rFonts w:ascii="Times New Roman" w:eastAsia="Times New Roman" w:hAnsi="Times New Roman" w:cs="Times New Roman"/>
-          <w:sz w:val="24"/>
-          <w:szCs w:val="24"/>
-          <w:lang w:eastAsia="en-IN"/>
-        </w:rPr>
-        <w:t xml:space="preserve">Word Frequency </w:t>
-      </w:r>
-    </w:p>
-    <w:p>
-      <w:pPr>
-        <w:numPr>
-          <w:ilvl w:val="0"/>
-          <w:numId w:val="2"/>
-        </w:numPr>
-        <w:spacing w:before="100" w:beforeAutospacing="1" w:after="100" w:afterAutospacing="1" w:line="240" w:lineRule="auto"/>
-        <w:rPr>
-          <w:rFonts w:ascii="Times New Roman" w:eastAsia="Times New Roman" w:hAnsi="Times New Roman" w:cs="Times New Roman"/>
-          <w:sz w:val="24"/>
-          <w:szCs w:val="24"/>
-          <w:lang w:eastAsia="en-IN"/>
-        </w:rPr>
-      </w:pPr>
-      <w:r>
-        <w:rPr>
-          <w:rFonts w:ascii="Times New Roman" w:eastAsia="Times New Roman" w:hAnsi="Times New Roman" w:cs="Times New Roman"/>
-          <w:sz w:val="24"/>
-          <w:szCs w:val="24"/>
-          <w:lang w:eastAsia="en-IN"/>
-        </w:rPr>
-        <w:t xml:space="preserve">Maximum Frequency </w:t>
-      </w:r>
-    </w:p>
-    <w:p>
-      <w:pPr>
-        <w:numPr>
-          <w:ilvl w:val="0"/>
-          <w:numId w:val="2"/>
-        </w:numPr>
-        <w:spacing w:before="100" w:beforeAutospacing="1" w:after="100" w:afterAutospacing="1" w:line="240" w:lineRule="auto"/>
-        <w:rPr>
-          <w:rFonts w:ascii="Times New Roman" w:eastAsia="Times New Roman" w:hAnsi="Times New Roman" w:cs="Times New Roman"/>
-          <w:sz w:val="24"/>
-          <w:szCs w:val="24"/>
-          <w:lang w:eastAsia="en-IN"/>
-        </w:rPr>
-      </w:pPr>
-      <w:r>
-        <w:rPr>
-          <w:rFonts w:ascii="Times New Roman" w:eastAsia="Times New Roman" w:hAnsi="Times New Roman" w:cs="Times New Roman"/>
-          <w:sz w:val="24"/>
-          <w:szCs w:val="24"/>
-          <w:lang w:eastAsia="en-IN"/>
-        </w:rPr>
-        <w:t xml:space="preserve">First Non-Repeating </w:t>
-      </w:r>
-    </w:p>
-    <w:p>
-      <w:pPr>
-        <w:numPr>
-          <w:ilvl w:val="0"/>
-          <w:numId w:val="2"/>
-        </w:numPr>
-        <w:spacing w:before="100" w:beforeAutospacing="1" w:after="100" w:afterAutospacing="1" w:line="240" w:lineRule="auto"/>
-        <w:rPr>
-          <w:rFonts w:ascii="Times New Roman" w:eastAsia="Times New Roman" w:hAnsi="Times New Roman" w:cs="Times New Roman"/>
-          <w:sz w:val="24"/>
-          <w:szCs w:val="24"/>
-          <w:lang w:eastAsia="en-IN"/>
-        </w:rPr>
-      </w:pPr>
-      <w:r>
-        <w:rPr>
-          <w:rFonts w:ascii="Times New Roman" w:eastAsia="Times New Roman" w:hAnsi="Times New Roman" w:cs="Times New Roman"/>
-          <w:sz w:val="24"/>
-          <w:szCs w:val="24"/>
-          <w:lang w:eastAsia="en-IN"/>
-        </w:rPr>
-        <w:t xml:space="preserve">First Repeating </w:t>
-      </w:r>
-    </w:p>
-    <w:p>
-      <w:pPr>
-        <w:numPr>
-          <w:ilvl w:val="0"/>
-          <w:numId w:val="2"/>
-        </w:numPr>
-        <w:spacing w:before="100" w:beforeAutospacing="1" w:after="100" w:afterAutospacing="1" w:line="240" w:lineRule="auto"/>
-        <w:rPr>
-          <w:rFonts w:ascii="Times New Roman" w:eastAsia="Times New Roman" w:hAnsi="Times New Roman" w:cs="Times New Roman"/>
-          <w:sz w:val="24"/>
-          <w:szCs w:val="24"/>
-          <w:lang w:eastAsia="en-IN"/>
-        </w:rPr>
-      </w:pPr>
-      <w:r>
-        <w:rPr>
-          <w:rFonts w:ascii="Times New Roman" w:eastAsia="Times New Roman" w:hAnsi="Times New Roman" w:cs="Times New Roman"/>
-          <w:sz w:val="24"/>
-          <w:szCs w:val="24"/>
-          <w:lang w:eastAsia="en-IN"/>
-        </w:rPr>
-        <w:t xml:space="preserve">Count Duplicates </w:t>
-      </w:r>
-    </w:p>
-    <w:p>
-      <w:pPr>
-        <w:numPr>
-          <w:ilvl w:val="0"/>
-          <w:numId w:val="2"/>
-        </w:numPr>
-        <w:spacing w:before="100" w:beforeAutospacing="1" w:after="100" w:afterAutospacing="1" w:line="240" w:lineRule="auto"/>
-        <w:rPr>
-          <w:rFonts w:ascii="Times New Roman" w:eastAsia="Times New Roman" w:hAnsi="Times New Roman" w:cs="Times New Roman"/>
-          <w:sz w:val="24"/>
-          <w:szCs w:val="24"/>
-          <w:lang w:eastAsia="en-IN"/>
-        </w:rPr>
-      </w:pPr>
       <w:r>
         <w:rPr>
           <w:rFonts w:ascii="Times New Roman" w:eastAsia="Times New Roman" w:hAnsi="Times New Roman" w:cs="Times New Roman"/>
@@ -7965,6 +8221,25 @@
       <w:contextualSpacing/>
     </w:pPr>
   </w:style>
+  <w:style w:type="paragraph" w:styleId="Caption">
+    <w:name w:val="caption"/>
+    <w:basedOn w:val="Normal"/>
+    <w:next w:val="Normal"/>
+    <w:uiPriority w:val="35"/>
+    <w:unhideWhenUsed/>
+    <w:qFormat/>
+    <w:rsid w:val="00F53E30"/>
+    <w:pPr>
+      <w:spacing w:after="200" w:line="240" w:lineRule="auto"/>
+    </w:pPr>
+    <w:rPr>
+      <w:i/>
+      <w:iCs/>
+      <w:color w:val="44546A" w:themeColor="text2"/>
+      <w:sz w:val="18"/>
+      <w:szCs w:val="16"/>
+    </w:rPr>
+  </w:style>
 </w:styles>
 </file>
 

</xml_diff>

<commit_message>
updated dsa revision (15-08-2026)
</commit_message>
<xml_diff>
--- a/filter interview list2.docx
+++ b/filter interview list2.docx
@@ -1365,24 +1365,145 @@
       <w:r>
         <w:rPr>
           <w:rFonts w:ascii="Times New Roman" w:eastAsia="Times New Roman" w:hAnsi="Times New Roman" w:cs="Times New Roman"/>
+          <w:sz w:val="24"/>
+          <w:szCs w:val="24"/>
+          <w:lang w:eastAsia="en-IN"/>
+        </w:rPr>
+        <w:t xml:space="preserve">Remove Duplicates </w:t>
+      </w:r>
+    </w:p>
+    <w:p>
+      <w:pPr>
+        <w:numPr>
+          <w:ilvl w:val="0"/>
+          <w:numId w:val="2"/>
+        </w:numPr>
+        <w:spacing w:before="100" w:beforeAutospacing="1" w:after="100" w:afterAutospacing="1" w:line="240" w:lineRule="auto"/>
+        <w:rPr>
+          <w:rFonts w:ascii="Times New Roman" w:eastAsia="Times New Roman" w:hAnsi="Times New Roman" w:cs="Times New Roman"/>
+          <w:sz w:val="24"/>
+          <w:szCs w:val="24"/>
+          <w:lang w:eastAsia="en-IN"/>
+        </w:rPr>
+      </w:pPr>
+      <w:r>
+        <w:rPr>
+          <w:rFonts w:ascii="Times New Roman" w:eastAsia="Times New Roman" w:hAnsi="Times New Roman" w:cs="Times New Roman"/>
+          <w:sz w:val="24"/>
+          <w:szCs w:val="24"/>
+          <w:lang w:eastAsia="en-IN"/>
+        </w:rPr>
+        <w:t xml:space="preserve">Contains Duplicate </w:t>
+      </w:r>
+    </w:p>
+    <w:p>
+      <w:pPr>
+        <w:numPr>
+          <w:ilvl w:val="0"/>
+          <w:numId w:val="2"/>
+        </w:numPr>
+        <w:spacing w:before="100" w:beforeAutospacing="1" w:after="100" w:afterAutospacing="1" w:line="240" w:lineRule="auto"/>
+        <w:rPr>
+          <w:rFonts w:ascii="Times New Roman" w:eastAsia="Times New Roman" w:hAnsi="Times New Roman" w:cs="Times New Roman"/>
+          <w:sz w:val="24"/>
+          <w:szCs w:val="24"/>
+          <w:lang w:eastAsia="en-IN"/>
+        </w:rPr>
+      </w:pPr>
+      <w:r>
+        <w:rPr>
+          <w:rFonts w:ascii="Times New Roman" w:eastAsia="Times New Roman" w:hAnsi="Times New Roman" w:cs="Times New Roman"/>
+          <w:sz w:val="24"/>
+          <w:szCs w:val="24"/>
+          <w:lang w:eastAsia="en-IN"/>
+        </w:rPr>
+        <w:t xml:space="preserve">Missing Number </w:t>
+      </w:r>
+    </w:p>
+    <w:p>
+      <w:pPr>
+        <w:numPr>
+          <w:ilvl w:val="0"/>
+          <w:numId w:val="2"/>
+        </w:numPr>
+        <w:spacing w:before="100" w:beforeAutospacing="1" w:after="100" w:afterAutospacing="1" w:line="240" w:lineRule="auto"/>
+        <w:rPr>
+          <w:rFonts w:ascii="Times New Roman" w:eastAsia="Times New Roman" w:hAnsi="Times New Roman" w:cs="Times New Roman"/>
+          <w:sz w:val="24"/>
+          <w:szCs w:val="24"/>
+          <w:lang w:eastAsia="en-IN"/>
+        </w:rPr>
+      </w:pPr>
+      <w:r>
+        <w:rPr>
+          <w:rFonts w:ascii="Times New Roman" w:eastAsia="Times New Roman" w:hAnsi="Times New Roman" w:cs="Times New Roman"/>
+          <w:sz w:val="24"/>
+          <w:szCs w:val="24"/>
+          <w:lang w:eastAsia="en-IN"/>
+        </w:rPr>
+        <w:t xml:space="preserve">Duplicate Number </w:t>
+      </w:r>
+    </w:p>
+    <w:p>
+      <w:pPr>
+        <w:numPr>
+          <w:ilvl w:val="0"/>
+          <w:numId w:val="2"/>
+        </w:numPr>
+        <w:spacing w:before="100" w:beforeAutospacing="1" w:after="100" w:afterAutospacing="1" w:line="240" w:lineRule="auto"/>
+        <w:rPr>
+          <w:rFonts w:ascii="Times New Roman" w:eastAsia="Times New Roman" w:hAnsi="Times New Roman" w:cs="Times New Roman"/>
+          <w:sz w:val="24"/>
+          <w:szCs w:val="24"/>
+          <w:lang w:eastAsia="en-IN"/>
+        </w:rPr>
+      </w:pPr>
+      <w:r>
+        <w:rPr>
+          <w:rFonts w:ascii="Times New Roman" w:eastAsia="Times New Roman" w:hAnsi="Times New Roman" w:cs="Times New Roman"/>
+          <w:sz w:val="24"/>
+          <w:szCs w:val="24"/>
+          <w:lang w:eastAsia="en-IN"/>
+        </w:rPr>
+        <w:t xml:space="preserve">Group By Frequency </w:t>
+      </w:r>
+    </w:p>
+    <w:p>
+      <w:pPr>
+        <w:numPr>
+          <w:ilvl w:val="0"/>
+          <w:numId w:val="2"/>
+        </w:numPr>
+        <w:spacing w:before="100" w:beforeAutospacing="1" w:after="100" w:afterAutospacing="1" w:line="240" w:lineRule="auto"/>
+        <w:rPr>
+          <w:rFonts w:ascii="Times New Roman" w:eastAsia="Times New Roman" w:hAnsi="Times New Roman" w:cs="Times New Roman"/>
+          <w:sz w:val="24"/>
+          <w:szCs w:val="24"/>
+          <w:lang w:eastAsia="en-IN"/>
+        </w:rPr>
+      </w:pPr>
+      <w:r>
+        <w:rPr>
+          <w:rFonts w:ascii="Times New Roman" w:eastAsia="Times New Roman" w:hAnsi="Times New Roman" w:cs="Times New Roman"/>
           <w:noProof/>
           <w:sz w:val="24"/>
           <w:szCs w:val="24"/>
           <w:lang w:eastAsia="en-IN"/>
         </w:rPr>
+        <w:lastRenderedPageBreak/>
         <mc:AlternateContent>
           <mc:Choice Requires="wps">
             <w:drawing>
-              <wp:anchor distT="0" distB="0" distL="114300" distR="114300" simplePos="0" relativeHeight="251687936" behindDoc="0" locked="0" layoutInCell="1" allowOverlap="1" wp14:anchorId="5CDB6AC5" wp14:editId="52AB213B">
+              <wp:anchor distT="0" distB="0" distL="114300" distR="114300" simplePos="0" relativeHeight="251687936" behindDoc="0" locked="0" layoutInCell="1" allowOverlap="1" wp14:anchorId="5CDB6AC5" wp14:editId="657D8426">
                 <wp:simplePos x="0" y="0"/>
                 <wp:positionH relativeFrom="column">
-                  <wp:posOffset>-774065</wp:posOffset>
+                  <wp:posOffset>-482601</wp:posOffset>
                 </wp:positionH>
                 <wp:positionV relativeFrom="paragraph">
-                  <wp:posOffset>175472</wp:posOffset>
+                  <wp:posOffset>-76200</wp:posOffset>
                 </wp:positionV>
-                <wp:extent cx="4102100" cy="29633"/>
-                <wp:effectExtent l="0" t="0" r="31750" b="27940"/>
+                <wp:extent cx="4157133" cy="4233"/>
+                <wp:effectExtent l="0" t="0" r="34290" b="34290"/>
                 <wp:wrapNone/>
                 <wp:docPr id="9" name="Straight Connector 9"/>
                 <wp:cNvGraphicFramePr/>
@@ -1391,9 +1512,9 @@
                     <wps:wsp>
                       <wps:cNvCnPr/>
                       <wps:spPr>
-                        <a:xfrm>
+                        <a:xfrm flipV="1">
                           <a:off x="0" y="0"/>
-                          <a:ext cx="4102100" cy="29633"/>
+                          <a:ext cx="4157133" cy="4233"/>
                         </a:xfrm>
                         <a:prstGeom prst="line">
                           <a:avLst/>
@@ -1418,12 +1539,18 @@
                     </wps:wsp>
                   </a:graphicData>
                 </a:graphic>
+                <wp14:sizeRelH relativeFrom="margin">
+                  <wp14:pctWidth>0</wp14:pctWidth>
+                </wp14:sizeRelH>
+                <wp14:sizeRelV relativeFrom="margin">
+                  <wp14:pctHeight>0</wp14:pctHeight>
+                </wp14:sizeRelV>
               </wp:anchor>
             </w:drawing>
           </mc:Choice>
           <mc:Fallback>
             <w:pict>
-              <v:line w14:anchorId="1BAD7B26" id="Straight Connector 9" o:spid="_x0000_s1026" style="position:absolute;z-index:251687936;visibility:visible;mso-wrap-style:square;mso-wrap-distance-left:9pt;mso-wrap-distance-top:0;mso-wrap-distance-right:9pt;mso-wrap-distance-bottom:0;mso-position-horizontal:absolute;mso-position-horizontal-relative:text;mso-position-vertical:absolute;mso-position-vertical-relative:text" from="-60.95pt,13.8pt" to="262.05pt,16.15pt" o:gfxdata="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" strokecolor="#4472c4 [3204]" strokeweight="1pt">
+              <v:line w14:anchorId="55D93590" id="Straight Connector 9" o:spid="_x0000_s1026" style="position:absolute;flip:y;z-index:251687936;visibility:visible;mso-wrap-style:square;mso-width-percent:0;mso-height-percent:0;mso-wrap-distance-left:9pt;mso-wrap-distance-top:0;mso-wrap-distance-right:9pt;mso-wrap-distance-bottom:0;mso-position-horizontal:absolute;mso-position-horizontal-relative:text;mso-position-vertical:absolute;mso-position-vertical-relative:text;mso-width-percent:0;mso-height-percent:0;mso-width-relative:margin;mso-height-relative:margin" from="-38pt,-6pt" to="289.35pt,-5.65pt" o:gfxdata="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" strokecolor="#4472c4 [3204]" strokeweight="1pt">
                 <v:stroke joinstyle="miter"/>
               </v:line>
             </w:pict>
@@ -1437,127 +1564,6 @@
           <w:szCs w:val="24"/>
           <w:lang w:eastAsia="en-IN"/>
         </w:rPr>
-        <w:t xml:space="preserve">Remove Duplicates </w:t>
-      </w:r>
-    </w:p>
-    <w:p>
-      <w:pPr>
-        <w:numPr>
-          <w:ilvl w:val="0"/>
-          <w:numId w:val="2"/>
-        </w:numPr>
-        <w:spacing w:before="100" w:beforeAutospacing="1" w:after="100" w:afterAutospacing="1" w:line="240" w:lineRule="auto"/>
-        <w:rPr>
-          <w:rFonts w:ascii="Times New Roman" w:eastAsia="Times New Roman" w:hAnsi="Times New Roman" w:cs="Times New Roman"/>
-          <w:sz w:val="24"/>
-          <w:szCs w:val="24"/>
-          <w:lang w:eastAsia="en-IN"/>
-        </w:rPr>
-      </w:pPr>
-      <w:r>
-        <w:rPr>
-          <w:rFonts w:ascii="Times New Roman" w:eastAsia="Times New Roman" w:hAnsi="Times New Roman" w:cs="Times New Roman"/>
-          <w:sz w:val="24"/>
-          <w:szCs w:val="24"/>
-          <w:lang w:eastAsia="en-IN"/>
-        </w:rPr>
-        <w:t xml:space="preserve">Contains Duplicate </w:t>
-      </w:r>
-    </w:p>
-    <w:p>
-      <w:pPr>
-        <w:numPr>
-          <w:ilvl w:val="0"/>
-          <w:numId w:val="2"/>
-        </w:numPr>
-        <w:spacing w:before="100" w:beforeAutospacing="1" w:after="100" w:afterAutospacing="1" w:line="240" w:lineRule="auto"/>
-        <w:rPr>
-          <w:rFonts w:ascii="Times New Roman" w:eastAsia="Times New Roman" w:hAnsi="Times New Roman" w:cs="Times New Roman"/>
-          <w:sz w:val="24"/>
-          <w:szCs w:val="24"/>
-          <w:lang w:eastAsia="en-IN"/>
-        </w:rPr>
-      </w:pPr>
-      <w:r>
-        <w:rPr>
-          <w:rFonts w:ascii="Times New Roman" w:eastAsia="Times New Roman" w:hAnsi="Times New Roman" w:cs="Times New Roman"/>
-          <w:sz w:val="24"/>
-          <w:szCs w:val="24"/>
-          <w:lang w:eastAsia="en-IN"/>
-        </w:rPr>
-        <w:t xml:space="preserve">Missing Number </w:t>
-      </w:r>
-    </w:p>
-    <w:p>
-      <w:pPr>
-        <w:numPr>
-          <w:ilvl w:val="0"/>
-          <w:numId w:val="2"/>
-        </w:numPr>
-        <w:spacing w:before="100" w:beforeAutospacing="1" w:after="100" w:afterAutospacing="1" w:line="240" w:lineRule="auto"/>
-        <w:rPr>
-          <w:rFonts w:ascii="Times New Roman" w:eastAsia="Times New Roman" w:hAnsi="Times New Roman" w:cs="Times New Roman"/>
-          <w:sz w:val="24"/>
-          <w:szCs w:val="24"/>
-          <w:lang w:eastAsia="en-IN"/>
-        </w:rPr>
-      </w:pPr>
-      <w:r>
-        <w:rPr>
-          <w:rFonts w:ascii="Times New Roman" w:eastAsia="Times New Roman" w:hAnsi="Times New Roman" w:cs="Times New Roman"/>
-          <w:sz w:val="24"/>
-          <w:szCs w:val="24"/>
-          <w:lang w:eastAsia="en-IN"/>
-        </w:rPr>
-        <w:t xml:space="preserve">Duplicate Number </w:t>
-      </w:r>
-    </w:p>
-    <w:p>
-      <w:pPr>
-        <w:numPr>
-          <w:ilvl w:val="0"/>
-          <w:numId w:val="2"/>
-        </w:numPr>
-        <w:spacing w:before="100" w:beforeAutospacing="1" w:after="100" w:afterAutospacing="1" w:line="240" w:lineRule="auto"/>
-        <w:rPr>
-          <w:rFonts w:ascii="Times New Roman" w:eastAsia="Times New Roman" w:hAnsi="Times New Roman" w:cs="Times New Roman"/>
-          <w:sz w:val="24"/>
-          <w:szCs w:val="24"/>
-          <w:lang w:eastAsia="en-IN"/>
-        </w:rPr>
-      </w:pPr>
-      <w:r>
-        <w:rPr>
-          <w:rFonts w:ascii="Times New Roman" w:eastAsia="Times New Roman" w:hAnsi="Times New Roman" w:cs="Times New Roman"/>
-          <w:sz w:val="24"/>
-          <w:szCs w:val="24"/>
-          <w:lang w:eastAsia="en-IN"/>
-        </w:rPr>
-        <w:t xml:space="preserve">Group By Frequency </w:t>
-      </w:r>
-    </w:p>
-    <w:p>
-      <w:pPr>
-        <w:numPr>
-          <w:ilvl w:val="0"/>
-          <w:numId w:val="2"/>
-        </w:numPr>
-        <w:spacing w:before="100" w:beforeAutospacing="1" w:after="100" w:afterAutospacing="1" w:line="240" w:lineRule="auto"/>
-        <w:rPr>
-          <w:rFonts w:ascii="Times New Roman" w:eastAsia="Times New Roman" w:hAnsi="Times New Roman" w:cs="Times New Roman"/>
-          <w:sz w:val="24"/>
-          <w:szCs w:val="24"/>
-          <w:lang w:eastAsia="en-IN"/>
-        </w:rPr>
-      </w:pPr>
-      <w:r>
-        <w:rPr>
-          <w:rFonts w:ascii="Times New Roman" w:eastAsia="Times New Roman" w:hAnsi="Times New Roman" w:cs="Times New Roman"/>
-          <w:sz w:val="24"/>
-          <w:szCs w:val="24"/>
-          <w:lang w:eastAsia="en-IN"/>
-        </w:rPr>
-        <w:lastRenderedPageBreak/>
         <w:t xml:space="preserve">Check Anagram </w:t>
       </w:r>
     </w:p>

</xml_diff>

<commit_message>
updated dsa revision (18-08-2026)
</commit_message>
<xml_diff>
--- a/filter interview list2.docx
+++ b/filter interview list2.docx
@@ -1605,6 +1605,174 @@
       <w:r>
         <w:rPr>
           <w:rFonts w:ascii="Times New Roman" w:eastAsia="Times New Roman" w:hAnsi="Times New Roman" w:cs="Times New Roman"/>
+          <w:sz w:val="24"/>
+          <w:szCs w:val="24"/>
+          <w:lang w:eastAsia="en-IN"/>
+        </w:rPr>
+        <w:t xml:space="preserve">Reverse String </w:t>
+      </w:r>
+    </w:p>
+    <w:p>
+      <w:pPr>
+        <w:numPr>
+          <w:ilvl w:val="0"/>
+          <w:numId w:val="3"/>
+        </w:numPr>
+        <w:spacing w:before="100" w:beforeAutospacing="1" w:after="100" w:afterAutospacing="1" w:line="240" w:lineRule="auto"/>
+        <w:rPr>
+          <w:rFonts w:ascii="Times New Roman" w:eastAsia="Times New Roman" w:hAnsi="Times New Roman" w:cs="Times New Roman"/>
+          <w:sz w:val="24"/>
+          <w:szCs w:val="24"/>
+          <w:lang w:eastAsia="en-IN"/>
+        </w:rPr>
+      </w:pPr>
+      <w:r>
+        <w:rPr>
+          <w:rFonts w:ascii="Times New Roman" w:eastAsia="Times New Roman" w:hAnsi="Times New Roman" w:cs="Times New Roman"/>
+          <w:sz w:val="24"/>
+          <w:szCs w:val="24"/>
+          <w:lang w:eastAsia="en-IN"/>
+        </w:rPr>
+        <w:t xml:space="preserve">Reverse Words </w:t>
+      </w:r>
+    </w:p>
+    <w:p>
+      <w:pPr>
+        <w:numPr>
+          <w:ilvl w:val="0"/>
+          <w:numId w:val="3"/>
+        </w:numPr>
+        <w:spacing w:before="100" w:beforeAutospacing="1" w:after="100" w:afterAutospacing="1" w:line="240" w:lineRule="auto"/>
+        <w:rPr>
+          <w:rFonts w:ascii="Times New Roman" w:eastAsia="Times New Roman" w:hAnsi="Times New Roman" w:cs="Times New Roman"/>
+          <w:sz w:val="24"/>
+          <w:szCs w:val="24"/>
+          <w:lang w:eastAsia="en-IN"/>
+        </w:rPr>
+      </w:pPr>
+      <w:r>
+        <w:rPr>
+          <w:rFonts w:ascii="Times New Roman" w:eastAsia="Times New Roman" w:hAnsi="Times New Roman" w:cs="Times New Roman"/>
+          <w:sz w:val="24"/>
+          <w:szCs w:val="24"/>
+          <w:lang w:eastAsia="en-IN"/>
+        </w:rPr>
+        <w:t xml:space="preserve">Palindrome </w:t>
+      </w:r>
+    </w:p>
+    <w:p>
+      <w:pPr>
+        <w:numPr>
+          <w:ilvl w:val="0"/>
+          <w:numId w:val="3"/>
+        </w:numPr>
+        <w:spacing w:before="100" w:beforeAutospacing="1" w:after="100" w:afterAutospacing="1" w:line="240" w:lineRule="auto"/>
+        <w:rPr>
+          <w:rFonts w:ascii="Times New Roman" w:eastAsia="Times New Roman" w:hAnsi="Times New Roman" w:cs="Times New Roman"/>
+          <w:sz w:val="24"/>
+          <w:szCs w:val="24"/>
+          <w:lang w:eastAsia="en-IN"/>
+        </w:rPr>
+      </w:pPr>
+      <w:r>
+        <w:rPr>
+          <w:rFonts w:ascii="Times New Roman" w:eastAsia="Times New Roman" w:hAnsi="Times New Roman" w:cs="Times New Roman"/>
+          <w:sz w:val="24"/>
+          <w:szCs w:val="24"/>
+          <w:lang w:eastAsia="en-IN"/>
+        </w:rPr>
+        <w:t xml:space="preserve">Valid Palindrome </w:t>
+      </w:r>
+    </w:p>
+    <w:p>
+      <w:pPr>
+        <w:numPr>
+          <w:ilvl w:val="0"/>
+          <w:numId w:val="3"/>
+        </w:numPr>
+        <w:spacing w:before="100" w:beforeAutospacing="1" w:after="100" w:afterAutospacing="1" w:line="240" w:lineRule="auto"/>
+        <w:rPr>
+          <w:rFonts w:ascii="Times New Roman" w:eastAsia="Times New Roman" w:hAnsi="Times New Roman" w:cs="Times New Roman"/>
+          <w:sz w:val="24"/>
+          <w:szCs w:val="24"/>
+          <w:lang w:eastAsia="en-IN"/>
+        </w:rPr>
+      </w:pPr>
+      <w:r>
+        <w:rPr>
+          <w:rFonts w:ascii="Times New Roman" w:eastAsia="Times New Roman" w:hAnsi="Times New Roman" w:cs="Times New Roman"/>
+          <w:sz w:val="24"/>
+          <w:szCs w:val="24"/>
+          <w:lang w:eastAsia="en-IN"/>
+        </w:rPr>
+        <w:t xml:space="preserve">Character Frequency </w:t>
+      </w:r>
+    </w:p>
+    <w:p>
+      <w:pPr>
+        <w:numPr>
+          <w:ilvl w:val="0"/>
+          <w:numId w:val="3"/>
+        </w:numPr>
+        <w:spacing w:before="100" w:beforeAutospacing="1" w:after="100" w:afterAutospacing="1" w:line="240" w:lineRule="auto"/>
+        <w:rPr>
+          <w:rFonts w:ascii="Times New Roman" w:eastAsia="Times New Roman" w:hAnsi="Times New Roman" w:cs="Times New Roman"/>
+          <w:sz w:val="24"/>
+          <w:szCs w:val="24"/>
+          <w:lang w:eastAsia="en-IN"/>
+        </w:rPr>
+      </w:pPr>
+      <w:r>
+        <w:rPr>
+          <w:rFonts w:ascii="Times New Roman" w:eastAsia="Times New Roman" w:hAnsi="Times New Roman" w:cs="Times New Roman"/>
+          <w:sz w:val="24"/>
+          <w:szCs w:val="24"/>
+          <w:lang w:eastAsia="en-IN"/>
+        </w:rPr>
+        <w:t xml:space="preserve">Remove Spaces </w:t>
+      </w:r>
+    </w:p>
+    <w:p>
+      <w:pPr>
+        <w:numPr>
+          <w:ilvl w:val="0"/>
+          <w:numId w:val="3"/>
+        </w:numPr>
+        <w:spacing w:before="100" w:beforeAutospacing="1" w:after="100" w:afterAutospacing="1" w:line="240" w:lineRule="auto"/>
+        <w:rPr>
+          <w:rFonts w:ascii="Times New Roman" w:eastAsia="Times New Roman" w:hAnsi="Times New Roman" w:cs="Times New Roman"/>
+          <w:sz w:val="24"/>
+          <w:szCs w:val="24"/>
+          <w:lang w:eastAsia="en-IN"/>
+        </w:rPr>
+      </w:pPr>
+      <w:r>
+        <w:rPr>
+          <w:rFonts w:ascii="Times New Roman" w:eastAsia="Times New Roman" w:hAnsi="Times New Roman" w:cs="Times New Roman"/>
+          <w:sz w:val="24"/>
+          <w:szCs w:val="24"/>
+          <w:lang w:eastAsia="en-IN"/>
+        </w:rPr>
+        <w:t xml:space="preserve">Remove Duplicates </w:t>
+      </w:r>
+    </w:p>
+    <w:p>
+      <w:pPr>
+        <w:numPr>
+          <w:ilvl w:val="0"/>
+          <w:numId w:val="3"/>
+        </w:numPr>
+        <w:spacing w:before="100" w:beforeAutospacing="1" w:after="100" w:afterAutospacing="1" w:line="240" w:lineRule="auto"/>
+        <w:rPr>
+          <w:rFonts w:ascii="Times New Roman" w:eastAsia="Times New Roman" w:hAnsi="Times New Roman" w:cs="Times New Roman"/>
+          <w:sz w:val="24"/>
+          <w:szCs w:val="24"/>
+          <w:lang w:eastAsia="en-IN"/>
+        </w:rPr>
+      </w:pPr>
+      <w:r>
+        <w:rPr>
+          <w:rFonts w:ascii="Times New Roman" w:eastAsia="Times New Roman" w:hAnsi="Times New Roman" w:cs="Times New Roman"/>
           <w:noProof/>
           <w:sz w:val="24"/>
           <w:szCs w:val="24"/>
@@ -1613,303 +1781,13 @@
         <mc:AlternateContent>
           <mc:Choice Requires="wps">
             <w:drawing>
-              <wp:anchor distT="0" distB="0" distL="114300" distR="114300" simplePos="0" relativeHeight="251687936" behindDoc="0" locked="0" layoutInCell="1" allowOverlap="1" wp14:anchorId="5CDB6AC5" wp14:editId="2808C791">
+              <wp:anchor distT="0" distB="0" distL="114300" distR="114300" simplePos="0" relativeHeight="251659264" behindDoc="0" locked="0" layoutInCell="1" allowOverlap="1" wp14:anchorId="246EC534" wp14:editId="1A91D5CE">
                 <wp:simplePos x="0" y="0"/>
-                <wp:positionH relativeFrom="column">
-                  <wp:posOffset>-334434</wp:posOffset>
+                <wp:positionH relativeFrom="margin">
+                  <wp:posOffset>-230505</wp:posOffset>
                 </wp:positionH>
                 <wp:positionV relativeFrom="paragraph">
-                  <wp:posOffset>145203</wp:posOffset>
-                </wp:positionV>
-                <wp:extent cx="4157133" cy="4233"/>
-                <wp:effectExtent l="0" t="0" r="34290" b="34290"/>
-                <wp:wrapNone/>
-                <wp:docPr id="9" name="Straight Connector 9"/>
-                <wp:cNvGraphicFramePr/>
-                <a:graphic xmlns:a="http://schemas.openxmlformats.org/drawingml/2006/main">
-                  <a:graphicData uri="http://schemas.microsoft.com/office/word/2010/wordprocessingShape">
-                    <wps:wsp>
-                      <wps:cNvCnPr/>
-                      <wps:spPr>
-                        <a:xfrm flipV="1">
-                          <a:off x="0" y="0"/>
-                          <a:ext cx="4157133" cy="4233"/>
-                        </a:xfrm>
-                        <a:prstGeom prst="line">
-                          <a:avLst/>
-                        </a:prstGeom>
-                        <a:ln w="12700"/>
-                      </wps:spPr>
-                      <wps:style>
-                        <a:lnRef idx="1">
-                          <a:schemeClr val="accent1"/>
-                        </a:lnRef>
-                        <a:fillRef idx="0">
-                          <a:schemeClr val="accent1"/>
-                        </a:fillRef>
-                        <a:effectRef idx="0">
-                          <a:schemeClr val="accent1"/>
-                        </a:effectRef>
-                        <a:fontRef idx="minor">
-                          <a:schemeClr val="tx1"/>
-                        </a:fontRef>
-                      </wps:style>
-                      <wps:bodyPr/>
-                    </wps:wsp>
-                  </a:graphicData>
-                </a:graphic>
-                <wp14:sizeRelH relativeFrom="margin">
-                  <wp14:pctWidth>0</wp14:pctWidth>
-                </wp14:sizeRelH>
-                <wp14:sizeRelV relativeFrom="margin">
-                  <wp14:pctHeight>0</wp14:pctHeight>
-                </wp14:sizeRelV>
-              </wp:anchor>
-            </w:drawing>
-          </mc:Choice>
-          <mc:Fallback>
-            <w:pict>
-              <v:line w14:anchorId="3567853A" id="Straight Connector 9" o:spid="_x0000_s1026" style="position:absolute;flip:y;z-index:251687936;visibility:visible;mso-wrap-style:square;mso-width-percent:0;mso-height-percent:0;mso-wrap-distance-left:9pt;mso-wrap-distance-top:0;mso-wrap-distance-right:9pt;mso-wrap-distance-bottom:0;mso-position-horizontal:absolute;mso-position-horizontal-relative:text;mso-position-vertical:absolute;mso-position-vertical-relative:text;mso-width-percent:0;mso-height-percent:0;mso-width-relative:margin;mso-height-relative:margin" from="-26.35pt,11.45pt" to="301pt,11.8pt" o:gfxdata="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" strokecolor="#4472c4 [3204]" strokeweight="1pt">
-                <v:stroke joinstyle="miter"/>
-              </v:line>
-            </w:pict>
-          </mc:Fallback>
-        </mc:AlternateContent>
-      </w:r>
-      <w:r>
-        <w:rPr>
-          <w:rFonts w:ascii="Times New Roman" w:eastAsia="Times New Roman" w:hAnsi="Times New Roman" w:cs="Times New Roman"/>
-          <w:sz w:val="24"/>
-          <w:szCs w:val="24"/>
-          <w:lang w:eastAsia="en-IN"/>
-        </w:rPr>
-        <w:t xml:space="preserve">Reverse String </w:t>
-      </w:r>
-    </w:p>
-    <w:p>
-      <w:pPr>
-        <w:numPr>
-          <w:ilvl w:val="0"/>
-          <w:numId w:val="3"/>
-        </w:numPr>
-        <w:spacing w:before="100" w:beforeAutospacing="1" w:after="100" w:afterAutospacing="1" w:line="240" w:lineRule="auto"/>
-        <w:rPr>
-          <w:rFonts w:ascii="Times New Roman" w:eastAsia="Times New Roman" w:hAnsi="Times New Roman" w:cs="Times New Roman"/>
-          <w:sz w:val="24"/>
-          <w:szCs w:val="24"/>
-          <w:lang w:eastAsia="en-IN"/>
-        </w:rPr>
-      </w:pPr>
-      <w:r>
-        <w:rPr>
-          <w:rFonts w:ascii="Times New Roman" w:eastAsia="Times New Roman" w:hAnsi="Times New Roman" w:cs="Times New Roman"/>
-          <w:sz w:val="24"/>
-          <w:szCs w:val="24"/>
-          <w:lang w:eastAsia="en-IN"/>
-        </w:rPr>
-        <w:t xml:space="preserve">Reverse Words </w:t>
-      </w:r>
-    </w:p>
-    <w:p>
-      <w:pPr>
-        <w:numPr>
-          <w:ilvl w:val="0"/>
-          <w:numId w:val="3"/>
-        </w:numPr>
-        <w:spacing w:before="100" w:beforeAutospacing="1" w:after="100" w:afterAutospacing="1" w:line="240" w:lineRule="auto"/>
-        <w:rPr>
-          <w:rFonts w:ascii="Times New Roman" w:eastAsia="Times New Roman" w:hAnsi="Times New Roman" w:cs="Times New Roman"/>
-          <w:sz w:val="24"/>
-          <w:szCs w:val="24"/>
-          <w:lang w:eastAsia="en-IN"/>
-        </w:rPr>
-      </w:pPr>
-      <w:r>
-        <w:rPr>
-          <w:rFonts w:ascii="Times New Roman" w:eastAsia="Times New Roman" w:hAnsi="Times New Roman" w:cs="Times New Roman"/>
-          <w:sz w:val="24"/>
-          <w:szCs w:val="24"/>
-          <w:lang w:eastAsia="en-IN"/>
-        </w:rPr>
-        <w:t xml:space="preserve">Palindrome </w:t>
-      </w:r>
-    </w:p>
-    <w:p>
-      <w:pPr>
-        <w:numPr>
-          <w:ilvl w:val="0"/>
-          <w:numId w:val="3"/>
-        </w:numPr>
-        <w:spacing w:before="100" w:beforeAutospacing="1" w:after="100" w:afterAutospacing="1" w:line="240" w:lineRule="auto"/>
-        <w:rPr>
-          <w:rFonts w:ascii="Times New Roman" w:eastAsia="Times New Roman" w:hAnsi="Times New Roman" w:cs="Times New Roman"/>
-          <w:sz w:val="24"/>
-          <w:szCs w:val="24"/>
-          <w:lang w:eastAsia="en-IN"/>
-        </w:rPr>
-      </w:pPr>
-      <w:r>
-        <w:rPr>
-          <w:rFonts w:ascii="Times New Roman" w:eastAsia="Times New Roman" w:hAnsi="Times New Roman" w:cs="Times New Roman"/>
-          <w:sz w:val="24"/>
-          <w:szCs w:val="24"/>
-          <w:lang w:eastAsia="en-IN"/>
-        </w:rPr>
-        <w:t xml:space="preserve">Valid Palindrome </w:t>
-      </w:r>
-    </w:p>
-    <w:p>
-      <w:pPr>
-        <w:numPr>
-          <w:ilvl w:val="0"/>
-          <w:numId w:val="3"/>
-        </w:numPr>
-        <w:spacing w:before="100" w:beforeAutospacing="1" w:after="100" w:afterAutospacing="1" w:line="240" w:lineRule="auto"/>
-        <w:rPr>
-          <w:rFonts w:ascii="Times New Roman" w:eastAsia="Times New Roman" w:hAnsi="Times New Roman" w:cs="Times New Roman"/>
-          <w:sz w:val="24"/>
-          <w:szCs w:val="24"/>
-          <w:lang w:eastAsia="en-IN"/>
-        </w:rPr>
-      </w:pPr>
-      <w:r>
-        <w:rPr>
-          <w:rFonts w:ascii="Times New Roman" w:eastAsia="Times New Roman" w:hAnsi="Times New Roman" w:cs="Times New Roman"/>
-          <w:sz w:val="24"/>
-          <w:szCs w:val="24"/>
-          <w:lang w:eastAsia="en-IN"/>
-        </w:rPr>
-        <w:t xml:space="preserve">Character Frequency </w:t>
-      </w:r>
-    </w:p>
-    <w:p>
-      <w:pPr>
-        <w:numPr>
-          <w:ilvl w:val="0"/>
-          <w:numId w:val="3"/>
-        </w:numPr>
-        <w:spacing w:before="100" w:beforeAutospacing="1" w:after="100" w:afterAutospacing="1" w:line="240" w:lineRule="auto"/>
-        <w:rPr>
-          <w:rFonts w:ascii="Times New Roman" w:eastAsia="Times New Roman" w:hAnsi="Times New Roman" w:cs="Times New Roman"/>
-          <w:sz w:val="24"/>
-          <w:szCs w:val="24"/>
-          <w:lang w:eastAsia="en-IN"/>
-        </w:rPr>
-      </w:pPr>
-      <w:r>
-        <w:rPr>
-          <w:rFonts w:ascii="Times New Roman" w:eastAsia="Times New Roman" w:hAnsi="Times New Roman" w:cs="Times New Roman"/>
-          <w:sz w:val="24"/>
-          <w:szCs w:val="24"/>
-          <w:lang w:eastAsia="en-IN"/>
-        </w:rPr>
-        <w:t xml:space="preserve">Remove Spaces </w:t>
-      </w:r>
-    </w:p>
-    <w:p>
-      <w:pPr>
-        <w:numPr>
-          <w:ilvl w:val="0"/>
-          <w:numId w:val="3"/>
-        </w:numPr>
-        <w:spacing w:before="100" w:beforeAutospacing="1" w:after="100" w:afterAutospacing="1" w:line="240" w:lineRule="auto"/>
-        <w:rPr>
-          <w:rFonts w:ascii="Times New Roman" w:eastAsia="Times New Roman" w:hAnsi="Times New Roman" w:cs="Times New Roman"/>
-          <w:sz w:val="24"/>
-          <w:szCs w:val="24"/>
-          <w:lang w:eastAsia="en-IN"/>
-        </w:rPr>
-      </w:pPr>
-      <w:r>
-        <w:rPr>
-          <w:rFonts w:ascii="Times New Roman" w:eastAsia="Times New Roman" w:hAnsi="Times New Roman" w:cs="Times New Roman"/>
-          <w:sz w:val="24"/>
-          <w:szCs w:val="24"/>
-          <w:lang w:eastAsia="en-IN"/>
-        </w:rPr>
-        <w:t xml:space="preserve">Remove Duplicates </w:t>
-      </w:r>
-    </w:p>
-    <w:p>
-      <w:pPr>
-        <w:numPr>
-          <w:ilvl w:val="0"/>
-          <w:numId w:val="3"/>
-        </w:numPr>
-        <w:spacing w:before="100" w:beforeAutospacing="1" w:after="100" w:afterAutospacing="1" w:line="240" w:lineRule="auto"/>
-        <w:rPr>
-          <w:rFonts w:ascii="Times New Roman" w:eastAsia="Times New Roman" w:hAnsi="Times New Roman" w:cs="Times New Roman"/>
-          <w:sz w:val="24"/>
-          <w:szCs w:val="24"/>
-          <w:lang w:eastAsia="en-IN"/>
-        </w:rPr>
-      </w:pPr>
-      <w:r>
-        <w:rPr>
-          <w:rFonts w:ascii="Times New Roman" w:eastAsia="Times New Roman" w:hAnsi="Times New Roman" w:cs="Times New Roman"/>
-          <w:sz w:val="24"/>
-          <w:szCs w:val="24"/>
-          <w:lang w:eastAsia="en-IN"/>
-        </w:rPr>
-        <w:t xml:space="preserve">Count Vowels </w:t>
-      </w:r>
-    </w:p>
-    <w:p>
-      <w:pPr>
-        <w:numPr>
-          <w:ilvl w:val="0"/>
-          <w:numId w:val="3"/>
-        </w:numPr>
-        <w:spacing w:before="100" w:beforeAutospacing="1" w:after="100" w:afterAutospacing="1" w:line="240" w:lineRule="auto"/>
-        <w:rPr>
-          <w:rFonts w:ascii="Times New Roman" w:eastAsia="Times New Roman" w:hAnsi="Times New Roman" w:cs="Times New Roman"/>
-          <w:sz w:val="24"/>
-          <w:szCs w:val="24"/>
-          <w:lang w:eastAsia="en-IN"/>
-        </w:rPr>
-      </w:pPr>
-      <w:r>
-        <w:rPr>
-          <w:rFonts w:ascii="Times New Roman" w:eastAsia="Times New Roman" w:hAnsi="Times New Roman" w:cs="Times New Roman"/>
-          <w:sz w:val="24"/>
-          <w:szCs w:val="24"/>
-          <w:lang w:eastAsia="en-IN"/>
-        </w:rPr>
-        <w:t xml:space="preserve">String Compression </w:t>
-      </w:r>
-    </w:p>
-    <w:p>
-      <w:pPr>
-        <w:numPr>
-          <w:ilvl w:val="0"/>
-          <w:numId w:val="3"/>
-        </w:numPr>
-        <w:spacing w:before="100" w:beforeAutospacing="1" w:after="100" w:afterAutospacing="1" w:line="240" w:lineRule="auto"/>
-        <w:rPr>
-          <w:rFonts w:ascii="Times New Roman" w:eastAsia="Times New Roman" w:hAnsi="Times New Roman" w:cs="Times New Roman"/>
-          <w:sz w:val="24"/>
-          <w:szCs w:val="24"/>
-          <w:lang w:eastAsia="en-IN"/>
-        </w:rPr>
-      </w:pPr>
-      <w:r>
-        <w:rPr>
-          <w:rFonts w:ascii="Times New Roman" w:eastAsia="Times New Roman" w:hAnsi="Times New Roman" w:cs="Times New Roman"/>
-          <w:noProof/>
-          <w:sz w:val="24"/>
-          <w:szCs w:val="24"/>
-          <w:lang w:eastAsia="en-IN"/>
-        </w:rPr>
-        <mc:AlternateContent>
-          <mc:Choice Requires="wps">
-            <w:drawing>
-              <wp:anchor distT="0" distB="0" distL="114300" distR="114300" simplePos="0" relativeHeight="251659264" behindDoc="0" locked="0" layoutInCell="1" allowOverlap="1" wp14:anchorId="246EC534" wp14:editId="7D7FEC6E">
-                <wp:simplePos x="0" y="0"/>
-                <wp:positionH relativeFrom="margin">
-                  <wp:posOffset>-192708</wp:posOffset>
-                </wp:positionH>
-                <wp:positionV relativeFrom="paragraph">
-                  <wp:posOffset>178224</wp:posOffset>
+                  <wp:posOffset>181186</wp:posOffset>
                 </wp:positionV>
                 <wp:extent cx="2711395" cy="7951"/>
                 <wp:effectExtent l="0" t="0" r="32385" b="30480"/>
@@ -1952,7 +1830,7 @@
           </mc:Choice>
           <mc:Fallback>
             <w:pict>
-              <v:line w14:anchorId="23DCDB9F" id="Straight Connector 2" o:spid="_x0000_s1026" style="position:absolute;flip:y;z-index:251659264;visibility:visible;mso-wrap-style:square;mso-wrap-distance-left:9pt;mso-wrap-distance-top:0;mso-wrap-distance-right:9pt;mso-wrap-distance-bottom:0;mso-position-horizontal:absolute;mso-position-horizontal-relative:margin;mso-position-vertical:absolute;mso-position-vertical-relative:text" from="-15.15pt,14.05pt" to="198.35pt,14.7pt" o:gfxdata="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" strokecolor="#4472c4 [3204]" strokeweight=".5pt">
+              <v:line w14:anchorId="1A7F01AD" id="Straight Connector 2" o:spid="_x0000_s1026" style="position:absolute;flip:y;z-index:251659264;visibility:visible;mso-wrap-style:square;mso-wrap-distance-left:9pt;mso-wrap-distance-top:0;mso-wrap-distance-right:9pt;mso-wrap-distance-bottom:0;mso-position-horizontal:absolute;mso-position-horizontal-relative:margin;mso-position-vertical:absolute;mso-position-vertical-relative:text" from="-18.15pt,14.25pt" to="195.35pt,14.9pt" o:gfxdata="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" strokecolor="#4472c4 [3204]" strokeweight=".5pt">
                 <v:stroke joinstyle="miter"/>
                 <w10:wrap anchorx="margin"/>
               </v:line>
@@ -1960,6 +1838,54 @@
           </mc:Fallback>
         </mc:AlternateContent>
       </w:r>
+      <w:r>
+        <w:rPr>
+          <w:rFonts w:ascii="Times New Roman" w:eastAsia="Times New Roman" w:hAnsi="Times New Roman" w:cs="Times New Roman"/>
+          <w:sz w:val="24"/>
+          <w:szCs w:val="24"/>
+          <w:lang w:eastAsia="en-IN"/>
+        </w:rPr>
+        <w:t xml:space="preserve">Count Vowels </w:t>
+      </w:r>
+    </w:p>
+    <w:p>
+      <w:pPr>
+        <w:numPr>
+          <w:ilvl w:val="0"/>
+          <w:numId w:val="3"/>
+        </w:numPr>
+        <w:spacing w:before="100" w:beforeAutospacing="1" w:after="100" w:afterAutospacing="1" w:line="240" w:lineRule="auto"/>
+        <w:rPr>
+          <w:rFonts w:ascii="Times New Roman" w:eastAsia="Times New Roman" w:hAnsi="Times New Roman" w:cs="Times New Roman"/>
+          <w:sz w:val="24"/>
+          <w:szCs w:val="24"/>
+          <w:lang w:eastAsia="en-IN"/>
+        </w:rPr>
+      </w:pPr>
+      <w:r>
+        <w:rPr>
+          <w:rFonts w:ascii="Times New Roman" w:eastAsia="Times New Roman" w:hAnsi="Times New Roman" w:cs="Times New Roman"/>
+          <w:sz w:val="24"/>
+          <w:szCs w:val="24"/>
+          <w:lang w:eastAsia="en-IN"/>
+        </w:rPr>
+        <w:t xml:space="preserve">String Compression </w:t>
+      </w:r>
+    </w:p>
+    <w:p>
+      <w:pPr>
+        <w:numPr>
+          <w:ilvl w:val="0"/>
+          <w:numId w:val="3"/>
+        </w:numPr>
+        <w:spacing w:before="100" w:beforeAutospacing="1" w:after="100" w:afterAutospacing="1" w:line="240" w:lineRule="auto"/>
+        <w:rPr>
+          <w:rFonts w:ascii="Times New Roman" w:eastAsia="Times New Roman" w:hAnsi="Times New Roman" w:cs="Times New Roman"/>
+          <w:sz w:val="24"/>
+          <w:szCs w:val="24"/>
+          <w:lang w:eastAsia="en-IN"/>
+        </w:rPr>
+      </w:pPr>
       <w:r>
         <w:rPr>
           <w:rFonts w:ascii="Times New Roman" w:eastAsia="Times New Roman" w:hAnsi="Times New Roman" w:cs="Times New Roman"/>

</xml_diff>

<commit_message>
updated dsa revision + new questions (20-08-2026)
</commit_message>
<xml_diff>
--- a/filter interview list2.docx
+++ b/filter interview list2.docx
@@ -1917,6 +1917,233 @@
       <w:r>
         <w:rPr>
           <w:rFonts w:ascii="Times New Roman" w:eastAsia="Times New Roman" w:hAnsi="Times New Roman" w:cs="Times New Roman"/>
+          <w:sz w:val="24"/>
+          <w:szCs w:val="24"/>
+          <w:lang w:eastAsia="en-IN"/>
+        </w:rPr>
+        <w:t xml:space="preserve">Isomorphic Strings </w:t>
+      </w:r>
+    </w:p>
+    <w:p>
+      <w:pPr>
+        <w:numPr>
+          <w:ilvl w:val="0"/>
+          <w:numId w:val="3"/>
+        </w:numPr>
+        <w:spacing w:before="100" w:beforeAutospacing="1" w:after="100" w:afterAutospacing="1" w:line="240" w:lineRule="auto"/>
+        <w:rPr>
+          <w:rFonts w:ascii="Times New Roman" w:eastAsia="Times New Roman" w:hAnsi="Times New Roman" w:cs="Times New Roman"/>
+          <w:sz w:val="24"/>
+          <w:szCs w:val="24"/>
+          <w:lang w:eastAsia="en-IN"/>
+        </w:rPr>
+      </w:pPr>
+      <w:r>
+        <w:rPr>
+          <w:rFonts w:ascii="Times New Roman" w:eastAsia="Times New Roman" w:hAnsi="Times New Roman" w:cs="Times New Roman"/>
+          <w:sz w:val="24"/>
+          <w:szCs w:val="24"/>
+          <w:lang w:eastAsia="en-IN"/>
+        </w:rPr>
+        <w:t>Reverse Vowels / Reverse Only Letters</w:t>
+      </w:r>
+    </w:p>
+    <w:p>
+      <w:pPr>
+        <w:spacing w:after="0" w:line="240" w:lineRule="auto"/>
+        <w:rPr>
+          <w:rFonts w:ascii="Times New Roman" w:eastAsia="Times New Roman" w:hAnsi="Times New Roman" w:cs="Times New Roman"/>
+          <w:sz w:val="24"/>
+          <w:szCs w:val="24"/>
+          <w:lang w:eastAsia="en-IN"/>
+        </w:rPr>
+      </w:pPr>
+      <w:r>
+        <w:rPr>
+          <w:rFonts w:ascii="Times New Roman" w:eastAsia="Times New Roman" w:hAnsi="Times New Roman" w:cs="Times New Roman"/>
+          <w:sz w:val="24"/>
+          <w:szCs w:val="24"/>
+          <w:lang w:eastAsia="en-IN"/>
+        </w:rPr>
+        <w:pict w14:anchorId="5ACE0CD4">
+          <v:rect id="_x0000_i1028" style="width:0;height:1.5pt" o:hralign="center" o:hrstd="t" o:hr="t" fillcolor="#a0a0a0" stroked="f"/>
+        </w:pict>
+      </w:r>
+    </w:p>
+    <w:p>
+      <w:pPr>
+        <w:spacing w:before="100" w:beforeAutospacing="1" w:after="100" w:afterAutospacing="1" w:line="240" w:lineRule="auto"/>
+        <w:outlineLvl w:val="1"/>
+        <w:rPr>
+          <w:rFonts w:ascii="Times New Roman" w:eastAsia="Times New Roman" w:hAnsi="Times New Roman" w:cs="Times New Roman"/>
+          <w:b/>
+          <w:bCs/>
+          <w:sz w:val="36"/>
+          <w:szCs w:val="36"/>
+          <w:lang w:eastAsia="en-IN"/>
+        </w:rPr>
+      </w:pPr>
+      <w:r>
+        <w:rPr>
+          <w:rFonts w:ascii="Times New Roman" w:eastAsia="Times New Roman" w:hAnsi="Times New Roman" w:cs="Times New Roman"/>
+          <w:b/>
+          <w:bCs/>
+          <w:sz w:val="36"/>
+          <w:szCs w:val="36"/>
+          <w:lang w:eastAsia="en-IN"/>
+        </w:rPr>
+        <w:t>Two Pointers (7)</w:t>
+      </w:r>
+    </w:p>
+    <w:p>
+      <w:pPr>
+        <w:numPr>
+          <w:ilvl w:val="0"/>
+          <w:numId w:val="4"/>
+        </w:numPr>
+        <w:spacing w:before="100" w:beforeAutospacing="1" w:after="100" w:afterAutospacing="1" w:line="240" w:lineRule="auto"/>
+        <w:rPr>
+          <w:rFonts w:ascii="Times New Roman" w:eastAsia="Times New Roman" w:hAnsi="Times New Roman" w:cs="Times New Roman"/>
+          <w:sz w:val="24"/>
+          <w:szCs w:val="24"/>
+          <w:lang w:eastAsia="en-IN"/>
+        </w:rPr>
+      </w:pPr>
+      <w:r>
+        <w:rPr>
+          <w:rFonts w:ascii="Times New Roman" w:eastAsia="Times New Roman" w:hAnsi="Times New Roman" w:cs="Times New Roman"/>
+          <w:sz w:val="24"/>
+          <w:szCs w:val="24"/>
+          <w:lang w:eastAsia="en-IN"/>
+        </w:rPr>
+        <w:t xml:space="preserve">Reverse Array </w:t>
+      </w:r>
+      <w:r>
+        <w:rPr>
+          <w:rFonts w:ascii="Times New Roman" w:eastAsia="Times New Roman" w:hAnsi="Times New Roman" w:cs="Times New Roman"/>
+          <w:sz w:val="24"/>
+          <w:szCs w:val="24"/>
+          <w:lang w:eastAsia="en-IN"/>
+        </w:rPr>
+        <w:t>(done)</w:t>
+      </w:r>
+    </w:p>
+    <w:p>
+      <w:pPr>
+        <w:numPr>
+          <w:ilvl w:val="0"/>
+          <w:numId w:val="4"/>
+        </w:numPr>
+        <w:spacing w:before="100" w:beforeAutospacing="1" w:after="100" w:afterAutospacing="1" w:line="240" w:lineRule="auto"/>
+        <w:rPr>
+          <w:rFonts w:ascii="Times New Roman" w:eastAsia="Times New Roman" w:hAnsi="Times New Roman" w:cs="Times New Roman"/>
+          <w:sz w:val="24"/>
+          <w:szCs w:val="24"/>
+          <w:lang w:eastAsia="en-IN"/>
+        </w:rPr>
+      </w:pPr>
+      <w:r>
+        <w:rPr>
+          <w:rFonts w:ascii="Times New Roman" w:eastAsia="Times New Roman" w:hAnsi="Times New Roman" w:cs="Times New Roman"/>
+          <w:sz w:val="24"/>
+          <w:szCs w:val="24"/>
+          <w:lang w:eastAsia="en-IN"/>
+        </w:rPr>
+        <w:t xml:space="preserve">Reverse String </w:t>
+      </w:r>
+      <w:r>
+        <w:rPr>
+          <w:rFonts w:ascii="Times New Roman" w:eastAsia="Times New Roman" w:hAnsi="Times New Roman" w:cs="Times New Roman"/>
+          <w:sz w:val="24"/>
+          <w:szCs w:val="24"/>
+          <w:lang w:eastAsia="en-IN"/>
+        </w:rPr>
+        <w:t>(done)</w:t>
+      </w:r>
+    </w:p>
+    <w:p>
+      <w:pPr>
+        <w:numPr>
+          <w:ilvl w:val="0"/>
+          <w:numId w:val="4"/>
+        </w:numPr>
+        <w:spacing w:before="100" w:beforeAutospacing="1" w:after="100" w:afterAutospacing="1" w:line="240" w:lineRule="auto"/>
+        <w:rPr>
+          <w:rFonts w:ascii="Times New Roman" w:eastAsia="Times New Roman" w:hAnsi="Times New Roman" w:cs="Times New Roman"/>
+          <w:sz w:val="24"/>
+          <w:szCs w:val="24"/>
+          <w:lang w:eastAsia="en-IN"/>
+        </w:rPr>
+      </w:pPr>
+      <w:r>
+        <w:rPr>
+          <w:rFonts w:ascii="Times New Roman" w:eastAsia="Times New Roman" w:hAnsi="Times New Roman" w:cs="Times New Roman"/>
+          <w:sz w:val="24"/>
+          <w:szCs w:val="24"/>
+          <w:lang w:eastAsia="en-IN"/>
+        </w:rPr>
+        <w:t xml:space="preserve">Move Zeroes </w:t>
+      </w:r>
+      <w:r>
+        <w:rPr>
+          <w:rFonts w:ascii="Times New Roman" w:eastAsia="Times New Roman" w:hAnsi="Times New Roman" w:cs="Times New Roman"/>
+          <w:sz w:val="24"/>
+          <w:szCs w:val="24"/>
+          <w:lang w:eastAsia="en-IN"/>
+        </w:rPr>
+        <w:t>(done)</w:t>
+      </w:r>
+    </w:p>
+    <w:p>
+      <w:pPr>
+        <w:numPr>
+          <w:ilvl w:val="0"/>
+          <w:numId w:val="4"/>
+        </w:numPr>
+        <w:spacing w:before="100" w:beforeAutospacing="1" w:after="100" w:afterAutospacing="1" w:line="240" w:lineRule="auto"/>
+        <w:rPr>
+          <w:rFonts w:ascii="Times New Roman" w:eastAsia="Times New Roman" w:hAnsi="Times New Roman" w:cs="Times New Roman"/>
+          <w:sz w:val="24"/>
+          <w:szCs w:val="24"/>
+          <w:lang w:eastAsia="en-IN"/>
+        </w:rPr>
+      </w:pPr>
+      <w:r>
+        <w:rPr>
+          <w:rFonts w:ascii="Times New Roman" w:eastAsia="Times New Roman" w:hAnsi="Times New Roman" w:cs="Times New Roman"/>
+          <w:sz w:val="24"/>
+          <w:szCs w:val="24"/>
+          <w:lang w:eastAsia="en-IN"/>
+        </w:rPr>
+        <w:t xml:space="preserve">Remove Duplicates </w:t>
+      </w:r>
+      <w:r>
+        <w:rPr>
+          <w:rFonts w:ascii="Times New Roman" w:eastAsia="Times New Roman" w:hAnsi="Times New Roman" w:cs="Times New Roman"/>
+          <w:sz w:val="24"/>
+          <w:szCs w:val="24"/>
+          <w:lang w:eastAsia="en-IN"/>
+        </w:rPr>
+        <w:t>(done)</w:t>
+      </w:r>
+    </w:p>
+    <w:p>
+      <w:pPr>
+        <w:numPr>
+          <w:ilvl w:val="0"/>
+          <w:numId w:val="4"/>
+        </w:numPr>
+        <w:spacing w:before="100" w:beforeAutospacing="1" w:after="100" w:afterAutospacing="1" w:line="240" w:lineRule="auto"/>
+        <w:rPr>
+          <w:rFonts w:ascii="Times New Roman" w:eastAsia="Times New Roman" w:hAnsi="Times New Roman" w:cs="Times New Roman"/>
+          <w:sz w:val="24"/>
+          <w:szCs w:val="24"/>
+          <w:lang w:eastAsia="en-IN"/>
+        </w:rPr>
+      </w:pPr>
+      <w:r>
+        <w:rPr>
+          <w:rFonts w:ascii="Times New Roman" w:eastAsia="Times New Roman" w:hAnsi="Times New Roman" w:cs="Times New Roman"/>
           <w:noProof/>
           <w:sz w:val="24"/>
           <w:szCs w:val="24"/>
@@ -1925,27 +2152,27 @@
         <mc:AlternateContent>
           <mc:Choice Requires="wps">
             <w:drawing>
-              <wp:anchor distT="0" distB="0" distL="114300" distR="114300" simplePos="0" relativeHeight="251659264" behindDoc="0" locked="0" layoutInCell="1" allowOverlap="1" wp14:anchorId="246EC534" wp14:editId="23F1DD58">
+              <wp:anchor distT="0" distB="0" distL="114300" distR="114300" simplePos="0" relativeHeight="251687936" behindDoc="0" locked="0" layoutInCell="1" allowOverlap="1" wp14:anchorId="3E082B10" wp14:editId="0E9DA79D">
                 <wp:simplePos x="0" y="0"/>
-                <wp:positionH relativeFrom="margin">
-                  <wp:posOffset>-178435</wp:posOffset>
+                <wp:positionH relativeFrom="column">
+                  <wp:posOffset>23075</wp:posOffset>
                 </wp:positionH>
                 <wp:positionV relativeFrom="paragraph">
-                  <wp:posOffset>158998</wp:posOffset>
+                  <wp:posOffset>2630</wp:posOffset>
                 </wp:positionV>
-                <wp:extent cx="2711395" cy="7951"/>
-                <wp:effectExtent l="0" t="0" r="32385" b="30480"/>
+                <wp:extent cx="2893197" cy="2885"/>
+                <wp:effectExtent l="0" t="0" r="21590" b="35560"/>
                 <wp:wrapNone/>
-                <wp:docPr id="2" name="Straight Connector 2"/>
+                <wp:docPr id="7" name="Straight Connector 7"/>
                 <wp:cNvGraphicFramePr/>
                 <a:graphic xmlns:a="http://schemas.openxmlformats.org/drawingml/2006/main">
                   <a:graphicData uri="http://schemas.microsoft.com/office/word/2010/wordprocessingShape">
                     <wps:wsp>
                       <wps:cNvCnPr/>
                       <wps:spPr>
-                        <a:xfrm flipV="1">
+                        <a:xfrm>
                           <a:off x="0" y="0"/>
-                          <a:ext cx="2711395" cy="7951"/>
+                          <a:ext cx="2893197" cy="2885"/>
                         </a:xfrm>
                         <a:prstGeom prst="line">
                           <a:avLst/>
@@ -1974,241 +2201,13 @@
           </mc:Choice>
           <mc:Fallback>
             <w:pict>
-              <v:line w14:anchorId="043F9012" id="Straight Connector 2" o:spid="_x0000_s1026" style="position:absolute;flip:y;z-index:251659264;visibility:visible;mso-wrap-style:square;mso-wrap-distance-left:9pt;mso-wrap-distance-top:0;mso-wrap-distance-right:9pt;mso-wrap-distance-bottom:0;mso-position-horizontal:absolute;mso-position-horizontal-relative:margin;mso-position-vertical:absolute;mso-position-vertical-relative:text" from="-14.05pt,12.5pt" to="199.45pt,13.15pt" o:gfxdata="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" strokecolor="#4472c4 [3204]" strokeweight=".5pt">
+              <v:line w14:anchorId="70A87A05" id="Straight Connector 7" o:spid="_x0000_s1026" style="position:absolute;z-index:251687936;visibility:visible;mso-wrap-style:square;mso-wrap-distance-left:9pt;mso-wrap-distance-top:0;mso-wrap-distance-right:9pt;mso-wrap-distance-bottom:0;mso-position-horizontal:absolute;mso-position-horizontal-relative:text;mso-position-vertical:absolute;mso-position-vertical-relative:text" from="1.8pt,.2pt" to="229.6pt,.45pt" o:gfxdata="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" strokecolor="#4472c4 [3204]" strokeweight=".5pt">
                 <v:stroke joinstyle="miter"/>
-                <w10:wrap anchorx="margin"/>
               </v:line>
             </w:pict>
           </mc:Fallback>
         </mc:AlternateContent>
       </w:r>
-      <w:r>
-        <w:rPr>
-          <w:rFonts w:ascii="Times New Roman" w:eastAsia="Times New Roman" w:hAnsi="Times New Roman" w:cs="Times New Roman"/>
-          <w:sz w:val="24"/>
-          <w:szCs w:val="24"/>
-          <w:lang w:eastAsia="en-IN"/>
-        </w:rPr>
-        <w:t xml:space="preserve">Isomorphic Strings </w:t>
-      </w:r>
-    </w:p>
-    <w:p>
-      <w:pPr>
-        <w:numPr>
-          <w:ilvl w:val="0"/>
-          <w:numId w:val="3"/>
-        </w:numPr>
-        <w:spacing w:before="100" w:beforeAutospacing="1" w:after="100" w:afterAutospacing="1" w:line="240" w:lineRule="auto"/>
-        <w:rPr>
-          <w:rFonts w:ascii="Times New Roman" w:eastAsia="Times New Roman" w:hAnsi="Times New Roman" w:cs="Times New Roman"/>
-          <w:sz w:val="24"/>
-          <w:szCs w:val="24"/>
-          <w:lang w:eastAsia="en-IN"/>
-        </w:rPr>
-      </w:pPr>
-      <w:r>
-        <w:rPr>
-          <w:rFonts w:ascii="Times New Roman" w:eastAsia="Times New Roman" w:hAnsi="Times New Roman" w:cs="Times New Roman"/>
-          <w:sz w:val="24"/>
-          <w:szCs w:val="24"/>
-          <w:lang w:eastAsia="en-IN"/>
-        </w:rPr>
-        <w:t>Reverse Vowels / Reverse Only Letters</w:t>
-      </w:r>
-    </w:p>
-    <w:p>
-      <w:pPr>
-        <w:spacing w:after="0" w:line="240" w:lineRule="auto"/>
-        <w:rPr>
-          <w:rFonts w:ascii="Times New Roman" w:eastAsia="Times New Roman" w:hAnsi="Times New Roman" w:cs="Times New Roman"/>
-          <w:sz w:val="24"/>
-          <w:szCs w:val="24"/>
-          <w:lang w:eastAsia="en-IN"/>
-        </w:rPr>
-      </w:pPr>
-      <w:r>
-        <w:rPr>
-          <w:rFonts w:ascii="Times New Roman" w:eastAsia="Times New Roman" w:hAnsi="Times New Roman" w:cs="Times New Roman"/>
-          <w:sz w:val="24"/>
-          <w:szCs w:val="24"/>
-          <w:lang w:eastAsia="en-IN"/>
-        </w:rPr>
-        <w:pict w14:anchorId="5ACE0CD4">
-          <v:rect id="_x0000_i1028" style="width:0;height:1.5pt" o:hralign="center" o:hrstd="t" o:hr="t" fillcolor="#a0a0a0" stroked="f"/>
-        </w:pict>
-      </w:r>
-    </w:p>
-    <w:p>
-      <w:pPr>
-        <w:spacing w:before="100" w:beforeAutospacing="1" w:after="100" w:afterAutospacing="1" w:line="240" w:lineRule="auto"/>
-        <w:outlineLvl w:val="1"/>
-        <w:rPr>
-          <w:rFonts w:ascii="Times New Roman" w:eastAsia="Times New Roman" w:hAnsi="Times New Roman" w:cs="Times New Roman"/>
-          <w:b/>
-          <w:bCs/>
-          <w:sz w:val="36"/>
-          <w:szCs w:val="36"/>
-          <w:lang w:eastAsia="en-IN"/>
-        </w:rPr>
-      </w:pPr>
-      <w:r>
-        <w:rPr>
-          <w:rFonts w:ascii="Times New Roman" w:eastAsia="Times New Roman" w:hAnsi="Times New Roman" w:cs="Times New Roman"/>
-          <w:b/>
-          <w:bCs/>
-          <w:sz w:val="36"/>
-          <w:szCs w:val="36"/>
-          <w:lang w:eastAsia="en-IN"/>
-        </w:rPr>
-        <w:t>Two Pointers (7)</w:t>
-      </w:r>
-    </w:p>
-    <w:p>
-      <w:pPr>
-        <w:numPr>
-          <w:ilvl w:val="0"/>
-          <w:numId w:val="4"/>
-        </w:numPr>
-        <w:spacing w:before="100" w:beforeAutospacing="1" w:after="100" w:afterAutospacing="1" w:line="240" w:lineRule="auto"/>
-        <w:rPr>
-          <w:rFonts w:ascii="Times New Roman" w:eastAsia="Times New Roman" w:hAnsi="Times New Roman" w:cs="Times New Roman"/>
-          <w:sz w:val="24"/>
-          <w:szCs w:val="24"/>
-          <w:lang w:eastAsia="en-IN"/>
-        </w:rPr>
-      </w:pPr>
-      <w:r>
-        <w:rPr>
-          <w:rFonts w:ascii="Times New Roman" w:eastAsia="Times New Roman" w:hAnsi="Times New Roman" w:cs="Times New Roman"/>
-          <w:sz w:val="24"/>
-          <w:szCs w:val="24"/>
-          <w:lang w:eastAsia="en-IN"/>
-        </w:rPr>
-        <w:t xml:space="preserve">Reverse Array </w:t>
-      </w:r>
-      <w:r>
-        <w:rPr>
-          <w:rFonts w:ascii="Times New Roman" w:eastAsia="Times New Roman" w:hAnsi="Times New Roman" w:cs="Times New Roman"/>
-          <w:sz w:val="24"/>
-          <w:szCs w:val="24"/>
-          <w:lang w:eastAsia="en-IN"/>
-        </w:rPr>
-        <w:t>(done)</w:t>
-      </w:r>
-    </w:p>
-    <w:p>
-      <w:pPr>
-        <w:numPr>
-          <w:ilvl w:val="0"/>
-          <w:numId w:val="4"/>
-        </w:numPr>
-        <w:spacing w:before="100" w:beforeAutospacing="1" w:after="100" w:afterAutospacing="1" w:line="240" w:lineRule="auto"/>
-        <w:rPr>
-          <w:rFonts w:ascii="Times New Roman" w:eastAsia="Times New Roman" w:hAnsi="Times New Roman" w:cs="Times New Roman"/>
-          <w:sz w:val="24"/>
-          <w:szCs w:val="24"/>
-          <w:lang w:eastAsia="en-IN"/>
-        </w:rPr>
-      </w:pPr>
-      <w:r>
-        <w:rPr>
-          <w:rFonts w:ascii="Times New Roman" w:eastAsia="Times New Roman" w:hAnsi="Times New Roman" w:cs="Times New Roman"/>
-          <w:sz w:val="24"/>
-          <w:szCs w:val="24"/>
-          <w:lang w:eastAsia="en-IN"/>
-        </w:rPr>
-        <w:t xml:space="preserve">Reverse String </w:t>
-      </w:r>
-      <w:r>
-        <w:rPr>
-          <w:rFonts w:ascii="Times New Roman" w:eastAsia="Times New Roman" w:hAnsi="Times New Roman" w:cs="Times New Roman"/>
-          <w:sz w:val="24"/>
-          <w:szCs w:val="24"/>
-          <w:lang w:eastAsia="en-IN"/>
-        </w:rPr>
-        <w:t>(done)</w:t>
-      </w:r>
-    </w:p>
-    <w:p>
-      <w:pPr>
-        <w:numPr>
-          <w:ilvl w:val="0"/>
-          <w:numId w:val="4"/>
-        </w:numPr>
-        <w:spacing w:before="100" w:beforeAutospacing="1" w:after="100" w:afterAutospacing="1" w:line="240" w:lineRule="auto"/>
-        <w:rPr>
-          <w:rFonts w:ascii="Times New Roman" w:eastAsia="Times New Roman" w:hAnsi="Times New Roman" w:cs="Times New Roman"/>
-          <w:sz w:val="24"/>
-          <w:szCs w:val="24"/>
-          <w:lang w:eastAsia="en-IN"/>
-        </w:rPr>
-      </w:pPr>
-      <w:r>
-        <w:rPr>
-          <w:rFonts w:ascii="Times New Roman" w:eastAsia="Times New Roman" w:hAnsi="Times New Roman" w:cs="Times New Roman"/>
-          <w:sz w:val="24"/>
-          <w:szCs w:val="24"/>
-          <w:lang w:eastAsia="en-IN"/>
-        </w:rPr>
-        <w:t xml:space="preserve">Move Zeroes </w:t>
-      </w:r>
-      <w:r>
-        <w:rPr>
-          <w:rFonts w:ascii="Times New Roman" w:eastAsia="Times New Roman" w:hAnsi="Times New Roman" w:cs="Times New Roman"/>
-          <w:sz w:val="24"/>
-          <w:szCs w:val="24"/>
-          <w:lang w:eastAsia="en-IN"/>
-        </w:rPr>
-        <w:t>(done)</w:t>
-      </w:r>
-    </w:p>
-    <w:p>
-      <w:pPr>
-        <w:numPr>
-          <w:ilvl w:val="0"/>
-          <w:numId w:val="4"/>
-        </w:numPr>
-        <w:spacing w:before="100" w:beforeAutospacing="1" w:after="100" w:afterAutospacing="1" w:line="240" w:lineRule="auto"/>
-        <w:rPr>
-          <w:rFonts w:ascii="Times New Roman" w:eastAsia="Times New Roman" w:hAnsi="Times New Roman" w:cs="Times New Roman"/>
-          <w:sz w:val="24"/>
-          <w:szCs w:val="24"/>
-          <w:lang w:eastAsia="en-IN"/>
-        </w:rPr>
-      </w:pPr>
-      <w:r>
-        <w:rPr>
-          <w:rFonts w:ascii="Times New Roman" w:eastAsia="Times New Roman" w:hAnsi="Times New Roman" w:cs="Times New Roman"/>
-          <w:sz w:val="24"/>
-          <w:szCs w:val="24"/>
-          <w:lang w:eastAsia="en-IN"/>
-        </w:rPr>
-        <w:t xml:space="preserve">Remove Duplicates </w:t>
-      </w:r>
-      <w:r>
-        <w:rPr>
-          <w:rFonts w:ascii="Times New Roman" w:eastAsia="Times New Roman" w:hAnsi="Times New Roman" w:cs="Times New Roman"/>
-          <w:sz w:val="24"/>
-          <w:szCs w:val="24"/>
-          <w:lang w:eastAsia="en-IN"/>
-        </w:rPr>
-        <w:t>(done)</w:t>
-      </w:r>
-    </w:p>
-    <w:p>
-      <w:pPr>
-        <w:numPr>
-          <w:ilvl w:val="0"/>
-          <w:numId w:val="4"/>
-        </w:numPr>
-        <w:spacing w:before="100" w:beforeAutospacing="1" w:after="100" w:afterAutospacing="1" w:line="240" w:lineRule="auto"/>
-        <w:rPr>
-          <w:rFonts w:ascii="Times New Roman" w:eastAsia="Times New Roman" w:hAnsi="Times New Roman" w:cs="Times New Roman"/>
-          <w:sz w:val="24"/>
-          <w:szCs w:val="24"/>
-          <w:lang w:eastAsia="en-IN"/>
-        </w:rPr>
-      </w:pPr>
       <w:r>
         <w:rPr>
           <w:rFonts w:ascii="Times New Roman" w:eastAsia="Times New Roman" w:hAnsi="Times New Roman" w:cs="Times New Roman"/>

</xml_diff>

<commit_message>
updated dsa revision (22-08-2026)
</commit_message>
<xml_diff>
--- a/filter interview list2.docx
+++ b/filter interview list2.docx
@@ -2144,6 +2144,167 @@
       <w:r>
         <w:rPr>
           <w:rFonts w:ascii="Times New Roman" w:eastAsia="Times New Roman" w:hAnsi="Times New Roman" w:cs="Times New Roman"/>
+          <w:sz w:val="24"/>
+          <w:szCs w:val="24"/>
+          <w:lang w:eastAsia="en-IN"/>
+        </w:rPr>
+        <w:t xml:space="preserve">Remove Element </w:t>
+      </w:r>
+    </w:p>
+    <w:p>
+      <w:pPr>
+        <w:numPr>
+          <w:ilvl w:val="0"/>
+          <w:numId w:val="4"/>
+        </w:numPr>
+        <w:spacing w:before="100" w:beforeAutospacing="1" w:after="100" w:afterAutospacing="1" w:line="240" w:lineRule="auto"/>
+        <w:rPr>
+          <w:rFonts w:ascii="Times New Roman" w:eastAsia="Times New Roman" w:hAnsi="Times New Roman" w:cs="Times New Roman"/>
+          <w:sz w:val="24"/>
+          <w:szCs w:val="24"/>
+          <w:lang w:eastAsia="en-IN"/>
+        </w:rPr>
+      </w:pPr>
+      <w:r>
+        <w:rPr>
+          <w:rFonts w:ascii="Times New Roman" w:eastAsia="Times New Roman" w:hAnsi="Times New Roman" w:cs="Times New Roman"/>
+          <w:sz w:val="24"/>
+          <w:szCs w:val="24"/>
+          <w:lang w:eastAsia="en-IN"/>
+        </w:rPr>
+        <w:t xml:space="preserve">Sorted Two Sum </w:t>
+      </w:r>
+    </w:p>
+    <w:p>
+      <w:pPr>
+        <w:numPr>
+          <w:ilvl w:val="0"/>
+          <w:numId w:val="4"/>
+        </w:numPr>
+        <w:spacing w:before="100" w:beforeAutospacing="1" w:after="100" w:afterAutospacing="1" w:line="240" w:lineRule="auto"/>
+        <w:rPr>
+          <w:rFonts w:ascii="Times New Roman" w:eastAsia="Times New Roman" w:hAnsi="Times New Roman" w:cs="Times New Roman"/>
+          <w:sz w:val="24"/>
+          <w:szCs w:val="24"/>
+          <w:lang w:eastAsia="en-IN"/>
+        </w:rPr>
+      </w:pPr>
+      <w:r>
+        <w:rPr>
+          <w:rFonts w:ascii="Times New Roman" w:eastAsia="Times New Roman" w:hAnsi="Times New Roman" w:cs="Times New Roman"/>
+          <w:sz w:val="24"/>
+          <w:szCs w:val="24"/>
+          <w:lang w:eastAsia="en-IN"/>
+        </w:rPr>
+        <w:t>Merge Sorted Arrays</w:t>
+      </w:r>
+      <w:r>
+        <w:rPr>
+          <w:rFonts w:ascii="Times New Roman" w:eastAsia="Times New Roman" w:hAnsi="Times New Roman" w:cs="Times New Roman"/>
+          <w:sz w:val="24"/>
+          <w:szCs w:val="24"/>
+          <w:lang w:eastAsia="en-IN"/>
+        </w:rPr>
+        <w:t>(done)</w:t>
+      </w:r>
+      <w:r>
+        <w:rPr>
+          <w:rFonts w:ascii="Times New Roman" w:eastAsia="Times New Roman" w:hAnsi="Times New Roman" w:cs="Times New Roman"/>
+          <w:sz w:val="24"/>
+          <w:szCs w:val="24"/>
+          <w:lang w:eastAsia="en-IN"/>
+        </w:rPr>
+        <w:t xml:space="preserve"> </w:t>
+      </w:r>
+    </w:p>
+    <w:p>
+      <w:pPr>
+        <w:spacing w:after="0" w:line="240" w:lineRule="auto"/>
+        <w:rPr>
+          <w:rFonts w:ascii="Times New Roman" w:eastAsia="Times New Roman" w:hAnsi="Times New Roman" w:cs="Times New Roman"/>
+          <w:sz w:val="24"/>
+          <w:szCs w:val="24"/>
+          <w:lang w:eastAsia="en-IN"/>
+        </w:rPr>
+      </w:pPr>
+      <w:r>
+        <w:rPr>
+          <w:rFonts w:ascii="Times New Roman" w:eastAsia="Times New Roman" w:hAnsi="Times New Roman" w:cs="Times New Roman"/>
+          <w:sz w:val="24"/>
+          <w:szCs w:val="24"/>
+          <w:lang w:eastAsia="en-IN"/>
+        </w:rPr>
+        <w:pict w14:anchorId="2DCF06FF">
+          <v:rect id="_x0000_i1029" style="width:0;height:1.5pt" o:hralign="center" o:hrstd="t" o:hr="t" fillcolor="#a0a0a0" stroked="f"/>
+        </w:pict>
+      </w:r>
+    </w:p>
+    <w:p>
+      <w:pPr>
+        <w:spacing w:before="100" w:beforeAutospacing="1" w:after="100" w:afterAutospacing="1" w:line="240" w:lineRule="auto"/>
+        <w:outlineLvl w:val="1"/>
+        <w:rPr>
+          <w:rFonts w:ascii="Times New Roman" w:eastAsia="Times New Roman" w:hAnsi="Times New Roman" w:cs="Times New Roman"/>
+          <w:b/>
+          <w:bCs/>
+          <w:sz w:val="36"/>
+          <w:szCs w:val="36"/>
+          <w:lang w:eastAsia="en-IN"/>
+        </w:rPr>
+      </w:pPr>
+      <w:r>
+        <w:rPr>
+          <w:rFonts w:ascii="Times New Roman" w:eastAsia="Times New Roman" w:hAnsi="Times New Roman" w:cs="Times New Roman"/>
+          <w:b/>
+          <w:bCs/>
+          <w:sz w:val="36"/>
+          <w:szCs w:val="36"/>
+          <w:lang w:eastAsia="en-IN"/>
+        </w:rPr>
+        <w:t>Sliding Window (6)</w:t>
+      </w:r>
+    </w:p>
+    <w:p>
+      <w:pPr>
+        <w:numPr>
+          <w:ilvl w:val="0"/>
+          <w:numId w:val="5"/>
+        </w:numPr>
+        <w:spacing w:before="100" w:beforeAutospacing="1" w:after="100" w:afterAutospacing="1" w:line="240" w:lineRule="auto"/>
+        <w:rPr>
+          <w:rFonts w:ascii="Times New Roman" w:eastAsia="Times New Roman" w:hAnsi="Times New Roman" w:cs="Times New Roman"/>
+          <w:sz w:val="24"/>
+          <w:szCs w:val="24"/>
+          <w:lang w:eastAsia="en-IN"/>
+        </w:rPr>
+      </w:pPr>
+      <w:r>
+        <w:rPr>
+          <w:rFonts w:ascii="Times New Roman" w:eastAsia="Times New Roman" w:hAnsi="Times New Roman" w:cs="Times New Roman"/>
+          <w:sz w:val="24"/>
+          <w:szCs w:val="24"/>
+          <w:lang w:eastAsia="en-IN"/>
+        </w:rPr>
+        <w:t xml:space="preserve">Maximum Sum Subarray of Size K </w:t>
+      </w:r>
+    </w:p>
+    <w:p>
+      <w:pPr>
+        <w:numPr>
+          <w:ilvl w:val="0"/>
+          <w:numId w:val="5"/>
+        </w:numPr>
+        <w:spacing w:before="100" w:beforeAutospacing="1" w:after="100" w:afterAutospacing="1" w:line="240" w:lineRule="auto"/>
+        <w:rPr>
+          <w:rFonts w:ascii="Times New Roman" w:eastAsia="Times New Roman" w:hAnsi="Times New Roman" w:cs="Times New Roman"/>
+          <w:sz w:val="24"/>
+          <w:szCs w:val="24"/>
+          <w:lang w:eastAsia="en-IN"/>
+        </w:rPr>
+      </w:pPr>
+      <w:r>
+        <w:rPr>
+          <w:rFonts w:ascii="Times New Roman" w:eastAsia="Times New Roman" w:hAnsi="Times New Roman" w:cs="Times New Roman"/>
           <w:noProof/>
           <w:sz w:val="24"/>
           <w:szCs w:val="24"/>
@@ -2152,13 +2313,13 @@
         <mc:AlternateContent>
           <mc:Choice Requires="wps">
             <w:drawing>
-              <wp:anchor distT="0" distB="0" distL="114300" distR="114300" simplePos="0" relativeHeight="251687936" behindDoc="0" locked="0" layoutInCell="1" allowOverlap="1" wp14:anchorId="3E082B10" wp14:editId="0E9DA79D">
+              <wp:anchor distT="0" distB="0" distL="114300" distR="114300" simplePos="0" relativeHeight="251687936" behindDoc="0" locked="0" layoutInCell="1" allowOverlap="1" wp14:anchorId="3E082B10" wp14:editId="7388BFF4">
                 <wp:simplePos x="0" y="0"/>
                 <wp:positionH relativeFrom="column">
-                  <wp:posOffset>23075</wp:posOffset>
+                  <wp:posOffset>50690</wp:posOffset>
                 </wp:positionH>
                 <wp:positionV relativeFrom="paragraph">
-                  <wp:posOffset>2630</wp:posOffset>
+                  <wp:posOffset>3700</wp:posOffset>
                 </wp:positionV>
                 <wp:extent cx="2893197" cy="2885"/>
                 <wp:effectExtent l="0" t="0" r="21590" b="35560"/>
@@ -2201,174 +2362,13 @@
           </mc:Choice>
           <mc:Fallback>
             <w:pict>
-              <v:line w14:anchorId="70A87A05" id="Straight Connector 7" o:spid="_x0000_s1026" style="position:absolute;z-index:251687936;visibility:visible;mso-wrap-style:square;mso-wrap-distance-left:9pt;mso-wrap-distance-top:0;mso-wrap-distance-right:9pt;mso-wrap-distance-bottom:0;mso-position-horizontal:absolute;mso-position-horizontal-relative:text;mso-position-vertical:absolute;mso-position-vertical-relative:text" from="1.8pt,.2pt" to="229.6pt,.45pt" o:gfxdata="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" strokecolor="#4472c4 [3204]" strokeweight=".5pt">
+              <v:line w14:anchorId="7610CAA5" id="Straight Connector 7" o:spid="_x0000_s1026" style="position:absolute;z-index:251687936;visibility:visible;mso-wrap-style:square;mso-wrap-distance-left:9pt;mso-wrap-distance-top:0;mso-wrap-distance-right:9pt;mso-wrap-distance-bottom:0;mso-position-horizontal:absolute;mso-position-horizontal-relative:text;mso-position-vertical:absolute;mso-position-vertical-relative:text" from="4pt,.3pt" to="231.8pt,.55pt" o:gfxdata="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" strokecolor="#4472c4 [3204]" strokeweight=".5pt">
                 <v:stroke joinstyle="miter"/>
               </v:line>
             </w:pict>
           </mc:Fallback>
         </mc:AlternateContent>
       </w:r>
-      <w:r>
-        <w:rPr>
-          <w:rFonts w:ascii="Times New Roman" w:eastAsia="Times New Roman" w:hAnsi="Times New Roman" w:cs="Times New Roman"/>
-          <w:sz w:val="24"/>
-          <w:szCs w:val="24"/>
-          <w:lang w:eastAsia="en-IN"/>
-        </w:rPr>
-        <w:t xml:space="preserve">Remove Element </w:t>
-      </w:r>
-    </w:p>
-    <w:p>
-      <w:pPr>
-        <w:numPr>
-          <w:ilvl w:val="0"/>
-          <w:numId w:val="4"/>
-        </w:numPr>
-        <w:spacing w:before="100" w:beforeAutospacing="1" w:after="100" w:afterAutospacing="1" w:line="240" w:lineRule="auto"/>
-        <w:rPr>
-          <w:rFonts w:ascii="Times New Roman" w:eastAsia="Times New Roman" w:hAnsi="Times New Roman" w:cs="Times New Roman"/>
-          <w:sz w:val="24"/>
-          <w:szCs w:val="24"/>
-          <w:lang w:eastAsia="en-IN"/>
-        </w:rPr>
-      </w:pPr>
-      <w:r>
-        <w:rPr>
-          <w:rFonts w:ascii="Times New Roman" w:eastAsia="Times New Roman" w:hAnsi="Times New Roman" w:cs="Times New Roman"/>
-          <w:sz w:val="24"/>
-          <w:szCs w:val="24"/>
-          <w:lang w:eastAsia="en-IN"/>
-        </w:rPr>
-        <w:t xml:space="preserve">Sorted Two Sum </w:t>
-      </w:r>
-    </w:p>
-    <w:p>
-      <w:pPr>
-        <w:numPr>
-          <w:ilvl w:val="0"/>
-          <w:numId w:val="4"/>
-        </w:numPr>
-        <w:spacing w:before="100" w:beforeAutospacing="1" w:after="100" w:afterAutospacing="1" w:line="240" w:lineRule="auto"/>
-        <w:rPr>
-          <w:rFonts w:ascii="Times New Roman" w:eastAsia="Times New Roman" w:hAnsi="Times New Roman" w:cs="Times New Roman"/>
-          <w:sz w:val="24"/>
-          <w:szCs w:val="24"/>
-          <w:lang w:eastAsia="en-IN"/>
-        </w:rPr>
-      </w:pPr>
-      <w:r>
-        <w:rPr>
-          <w:rFonts w:ascii="Times New Roman" w:eastAsia="Times New Roman" w:hAnsi="Times New Roman" w:cs="Times New Roman"/>
-          <w:sz w:val="24"/>
-          <w:szCs w:val="24"/>
-          <w:lang w:eastAsia="en-IN"/>
-        </w:rPr>
-        <w:t>Merge Sorted Arrays</w:t>
-      </w:r>
-      <w:r>
-        <w:rPr>
-          <w:rFonts w:ascii="Times New Roman" w:eastAsia="Times New Roman" w:hAnsi="Times New Roman" w:cs="Times New Roman"/>
-          <w:sz w:val="24"/>
-          <w:szCs w:val="24"/>
-          <w:lang w:eastAsia="en-IN"/>
-        </w:rPr>
-        <w:t>(done)</w:t>
-      </w:r>
-      <w:r>
-        <w:rPr>
-          <w:rFonts w:ascii="Times New Roman" w:eastAsia="Times New Roman" w:hAnsi="Times New Roman" w:cs="Times New Roman"/>
-          <w:sz w:val="24"/>
-          <w:szCs w:val="24"/>
-          <w:lang w:eastAsia="en-IN"/>
-        </w:rPr>
-        <w:t xml:space="preserve"> </w:t>
-      </w:r>
-    </w:p>
-    <w:p>
-      <w:pPr>
-        <w:spacing w:after="0" w:line="240" w:lineRule="auto"/>
-        <w:rPr>
-          <w:rFonts w:ascii="Times New Roman" w:eastAsia="Times New Roman" w:hAnsi="Times New Roman" w:cs="Times New Roman"/>
-          <w:sz w:val="24"/>
-          <w:szCs w:val="24"/>
-          <w:lang w:eastAsia="en-IN"/>
-        </w:rPr>
-      </w:pPr>
-      <w:r>
-        <w:rPr>
-          <w:rFonts w:ascii="Times New Roman" w:eastAsia="Times New Roman" w:hAnsi="Times New Roman" w:cs="Times New Roman"/>
-          <w:sz w:val="24"/>
-          <w:szCs w:val="24"/>
-          <w:lang w:eastAsia="en-IN"/>
-        </w:rPr>
-        <w:pict w14:anchorId="2DCF06FF">
-          <v:rect id="_x0000_i1029" style="width:0;height:1.5pt" o:hralign="center" o:hrstd="t" o:hr="t" fillcolor="#a0a0a0" stroked="f"/>
-        </w:pict>
-      </w:r>
-    </w:p>
-    <w:p>
-      <w:pPr>
-        <w:spacing w:before="100" w:beforeAutospacing="1" w:after="100" w:afterAutospacing="1" w:line="240" w:lineRule="auto"/>
-        <w:outlineLvl w:val="1"/>
-        <w:rPr>
-          <w:rFonts w:ascii="Times New Roman" w:eastAsia="Times New Roman" w:hAnsi="Times New Roman" w:cs="Times New Roman"/>
-          <w:b/>
-          <w:bCs/>
-          <w:sz w:val="36"/>
-          <w:szCs w:val="36"/>
-          <w:lang w:eastAsia="en-IN"/>
-        </w:rPr>
-      </w:pPr>
-      <w:r>
-        <w:rPr>
-          <w:rFonts w:ascii="Times New Roman" w:eastAsia="Times New Roman" w:hAnsi="Times New Roman" w:cs="Times New Roman"/>
-          <w:b/>
-          <w:bCs/>
-          <w:sz w:val="36"/>
-          <w:szCs w:val="36"/>
-          <w:lang w:eastAsia="en-IN"/>
-        </w:rPr>
-        <w:t>Sliding Window (6)</w:t>
-      </w:r>
-    </w:p>
-    <w:p>
-      <w:pPr>
-        <w:numPr>
-          <w:ilvl w:val="0"/>
-          <w:numId w:val="5"/>
-        </w:numPr>
-        <w:spacing w:before="100" w:beforeAutospacing="1" w:after="100" w:afterAutospacing="1" w:line="240" w:lineRule="auto"/>
-        <w:rPr>
-          <w:rFonts w:ascii="Times New Roman" w:eastAsia="Times New Roman" w:hAnsi="Times New Roman" w:cs="Times New Roman"/>
-          <w:sz w:val="24"/>
-          <w:szCs w:val="24"/>
-          <w:lang w:eastAsia="en-IN"/>
-        </w:rPr>
-      </w:pPr>
-      <w:r>
-        <w:rPr>
-          <w:rFonts w:ascii="Times New Roman" w:eastAsia="Times New Roman" w:hAnsi="Times New Roman" w:cs="Times New Roman"/>
-          <w:sz w:val="24"/>
-          <w:szCs w:val="24"/>
-          <w:lang w:eastAsia="en-IN"/>
-        </w:rPr>
-        <w:t xml:space="preserve">Maximum Sum Subarray of Size K </w:t>
-      </w:r>
-    </w:p>
-    <w:p>
-      <w:pPr>
-        <w:numPr>
-          <w:ilvl w:val="0"/>
-          <w:numId w:val="5"/>
-        </w:numPr>
-        <w:spacing w:before="100" w:beforeAutospacing="1" w:after="100" w:afterAutospacing="1" w:line="240" w:lineRule="auto"/>
-        <w:rPr>
-          <w:rFonts w:ascii="Times New Roman" w:eastAsia="Times New Roman" w:hAnsi="Times New Roman" w:cs="Times New Roman"/>
-          <w:sz w:val="24"/>
-          <w:szCs w:val="24"/>
-          <w:lang w:eastAsia="en-IN"/>
-        </w:rPr>
-      </w:pPr>
       <w:r>
         <w:rPr>
           <w:rFonts w:ascii="Times New Roman" w:eastAsia="Times New Roman" w:hAnsi="Times New Roman" w:cs="Times New Roman"/>

</xml_diff>

<commit_message>
updated dsa revision (24-08-2026)
</commit_message>
<xml_diff>
--- a/filter interview list2.docx
+++ b/filter interview list2.docx
@@ -2305,6 +2305,30 @@
       <w:r>
         <w:rPr>
           <w:rFonts w:ascii="Times New Roman" w:eastAsia="Times New Roman" w:hAnsi="Times New Roman" w:cs="Times New Roman"/>
+          <w:sz w:val="24"/>
+          <w:szCs w:val="24"/>
+          <w:lang w:eastAsia="en-IN"/>
+        </w:rPr>
+        <w:t xml:space="preserve">Minimum Sum Subarray of Size K </w:t>
+      </w:r>
+    </w:p>
+    <w:p>
+      <w:pPr>
+        <w:numPr>
+          <w:ilvl w:val="0"/>
+          <w:numId w:val="5"/>
+        </w:numPr>
+        <w:spacing w:before="100" w:beforeAutospacing="1" w:after="100" w:afterAutospacing="1" w:line="240" w:lineRule="auto"/>
+        <w:rPr>
+          <w:rFonts w:ascii="Times New Roman" w:eastAsia="Times New Roman" w:hAnsi="Times New Roman" w:cs="Times New Roman"/>
+          <w:sz w:val="24"/>
+          <w:szCs w:val="24"/>
+          <w:lang w:eastAsia="en-IN"/>
+        </w:rPr>
+      </w:pPr>
+      <w:r>
+        <w:rPr>
+          <w:rFonts w:ascii="Times New Roman" w:eastAsia="Times New Roman" w:hAnsi="Times New Roman" w:cs="Times New Roman"/>
           <w:noProof/>
           <w:sz w:val="24"/>
           <w:szCs w:val="24"/>
@@ -2313,13 +2337,13 @@
         <mc:AlternateContent>
           <mc:Choice Requires="wps">
             <w:drawing>
-              <wp:anchor distT="0" distB="0" distL="114300" distR="114300" simplePos="0" relativeHeight="251687936" behindDoc="0" locked="0" layoutInCell="1" allowOverlap="1" wp14:anchorId="3E082B10" wp14:editId="7388BFF4">
+              <wp:anchor distT="0" distB="0" distL="114300" distR="114300" simplePos="0" relativeHeight="251687936" behindDoc="0" locked="0" layoutInCell="1" allowOverlap="1" wp14:anchorId="3E082B10" wp14:editId="2CD75C61">
                 <wp:simplePos x="0" y="0"/>
                 <wp:positionH relativeFrom="column">
-                  <wp:posOffset>50690</wp:posOffset>
+                  <wp:posOffset>66068</wp:posOffset>
                 </wp:positionH>
                 <wp:positionV relativeFrom="paragraph">
-                  <wp:posOffset>3700</wp:posOffset>
+                  <wp:posOffset>169683</wp:posOffset>
                 </wp:positionV>
                 <wp:extent cx="2893197" cy="2885"/>
                 <wp:effectExtent l="0" t="0" r="21590" b="35560"/>
@@ -2362,37 +2386,13 @@
           </mc:Choice>
           <mc:Fallback>
             <w:pict>
-              <v:line w14:anchorId="7610CAA5" id="Straight Connector 7" o:spid="_x0000_s1026" style="position:absolute;z-index:251687936;visibility:visible;mso-wrap-style:square;mso-wrap-distance-left:9pt;mso-wrap-distance-top:0;mso-wrap-distance-right:9pt;mso-wrap-distance-bottom:0;mso-position-horizontal:absolute;mso-position-horizontal-relative:text;mso-position-vertical:absolute;mso-position-vertical-relative:text" from="4pt,.3pt" to="231.8pt,.55pt" o:gfxdata="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" strokecolor="#4472c4 [3204]" strokeweight=".5pt">
+              <v:line w14:anchorId="32D104DD" id="Straight Connector 7" o:spid="_x0000_s1026" style="position:absolute;z-index:251687936;visibility:visible;mso-wrap-style:square;mso-wrap-distance-left:9pt;mso-wrap-distance-top:0;mso-wrap-distance-right:9pt;mso-wrap-distance-bottom:0;mso-position-horizontal:absolute;mso-position-horizontal-relative:text;mso-position-vertical:absolute;mso-position-vertical-relative:text" from="5.2pt,13.35pt" to="233pt,13.6pt" o:gfxdata="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" strokecolor="#4472c4 [3204]" strokeweight=".5pt">
                 <v:stroke joinstyle="miter"/>
               </v:line>
             </w:pict>
           </mc:Fallback>
         </mc:AlternateContent>
       </w:r>
-      <w:r>
-        <w:rPr>
-          <w:rFonts w:ascii="Times New Roman" w:eastAsia="Times New Roman" w:hAnsi="Times New Roman" w:cs="Times New Roman"/>
-          <w:sz w:val="24"/>
-          <w:szCs w:val="24"/>
-          <w:lang w:eastAsia="en-IN"/>
-        </w:rPr>
-        <w:t xml:space="preserve">Minimum Sum Subarray of Size K </w:t>
-      </w:r>
-    </w:p>
-    <w:p>
-      <w:pPr>
-        <w:numPr>
-          <w:ilvl w:val="0"/>
-          <w:numId w:val="5"/>
-        </w:numPr>
-        <w:spacing w:before="100" w:beforeAutospacing="1" w:after="100" w:afterAutospacing="1" w:line="240" w:lineRule="auto"/>
-        <w:rPr>
-          <w:rFonts w:ascii="Times New Roman" w:eastAsia="Times New Roman" w:hAnsi="Times New Roman" w:cs="Times New Roman"/>
-          <w:sz w:val="24"/>
-          <w:szCs w:val="24"/>
-          <w:lang w:eastAsia="en-IN"/>
-        </w:rPr>
-      </w:pPr>
       <w:r>
         <w:rPr>
           <w:rFonts w:ascii="Times New Roman" w:eastAsia="Times New Roman" w:hAnsi="Times New Roman" w:cs="Times New Roman"/>

</xml_diff>

<commit_message>
updated dsa revision (26-08-2026)
</commit_message>
<xml_diff>
--- a/filter interview list2.docx
+++ b/filter interview list2.docx
@@ -2329,6 +2329,167 @@
       <w:r>
         <w:rPr>
           <w:rFonts w:ascii="Times New Roman" w:eastAsia="Times New Roman" w:hAnsi="Times New Roman" w:cs="Times New Roman"/>
+          <w:sz w:val="24"/>
+          <w:szCs w:val="24"/>
+          <w:lang w:eastAsia="en-IN"/>
+        </w:rPr>
+        <w:t xml:space="preserve">First Negative in Every Window </w:t>
+      </w:r>
+    </w:p>
+    <w:p>
+      <w:pPr>
+        <w:numPr>
+          <w:ilvl w:val="0"/>
+          <w:numId w:val="5"/>
+        </w:numPr>
+        <w:spacing w:before="100" w:beforeAutospacing="1" w:after="100" w:afterAutospacing="1" w:line="240" w:lineRule="auto"/>
+        <w:rPr>
+          <w:rFonts w:ascii="Times New Roman" w:eastAsia="Times New Roman" w:hAnsi="Times New Roman" w:cs="Times New Roman"/>
+          <w:sz w:val="24"/>
+          <w:szCs w:val="24"/>
+          <w:lang w:eastAsia="en-IN"/>
+        </w:rPr>
+      </w:pPr>
+      <w:r>
+        <w:rPr>
+          <w:rFonts w:ascii="Times New Roman" w:eastAsia="Times New Roman" w:hAnsi="Times New Roman" w:cs="Times New Roman"/>
+          <w:sz w:val="24"/>
+          <w:szCs w:val="24"/>
+          <w:lang w:eastAsia="en-IN"/>
+        </w:rPr>
+        <w:t xml:space="preserve">Longest Substring Without Repeating Characters </w:t>
+      </w:r>
+    </w:p>
+    <w:p>
+      <w:pPr>
+        <w:pStyle w:val="ListParagraph"/>
+        <w:numPr>
+          <w:ilvl w:val="0"/>
+          <w:numId w:val="5"/>
+        </w:numPr>
+        <w:shd w:val="clear" w:color="auto" w:fill="1F1F1F"/>
+        <w:spacing w:after="0" w:line="285" w:lineRule="atLeast"/>
+        <w:rPr>
+          <w:rFonts w:ascii="Consolas" w:eastAsia="Times New Roman" w:hAnsi="Consolas" w:cs="Times New Roman"/>
+          <w:color w:val="CCCCCC"/>
+          <w:sz w:val="21"/>
+          <w:szCs w:val="21"/>
+          <w:lang w:eastAsia="en-IN"/>
+        </w:rPr>
+      </w:pPr>
+      <w:r>
+        <w:rPr>
+          <w:rFonts w:ascii="Consolas" w:eastAsia="Times New Roman" w:hAnsi="Consolas" w:cs="Times New Roman"/>
+          <w:color w:val="CE9178"/>
+          <w:sz w:val="21"/>
+          <w:szCs w:val="21"/>
+          <w:lang w:eastAsia="en-IN"/>
+        </w:rPr>
+        <w:t>Maximum Consecutive Ones III</w:t>
+      </w:r>
+    </w:p>
+    <w:p>
+      <w:pPr>
+        <w:numPr>
+          <w:ilvl w:val="0"/>
+          <w:numId w:val="5"/>
+        </w:numPr>
+        <w:spacing w:before="100" w:beforeAutospacing="1" w:after="100" w:afterAutospacing="1" w:line="240" w:lineRule="auto"/>
+        <w:rPr>
+          <w:rFonts w:ascii="Times New Roman" w:eastAsia="Times New Roman" w:hAnsi="Times New Roman" w:cs="Times New Roman"/>
+          <w:sz w:val="24"/>
+          <w:szCs w:val="24"/>
+          <w:lang w:eastAsia="en-IN"/>
+        </w:rPr>
+      </w:pPr>
+    </w:p>
+    <w:p>
+      <w:pPr>
+        <w:numPr>
+          <w:ilvl w:val="0"/>
+          <w:numId w:val="5"/>
+        </w:numPr>
+        <w:spacing w:before="100" w:beforeAutospacing="1" w:after="100" w:afterAutospacing="1" w:line="240" w:lineRule="auto"/>
+        <w:rPr>
+          <w:rFonts w:ascii="Times New Roman" w:eastAsia="Times New Roman" w:hAnsi="Times New Roman" w:cs="Times New Roman"/>
+          <w:sz w:val="24"/>
+          <w:szCs w:val="24"/>
+          <w:lang w:eastAsia="en-IN"/>
+        </w:rPr>
+      </w:pPr>
+      <w:r>
+        <w:rPr>
+          <w:rFonts w:ascii="Times New Roman" w:eastAsia="Times New Roman" w:hAnsi="Times New Roman" w:cs="Times New Roman"/>
+          <w:sz w:val="24"/>
+          <w:szCs w:val="24"/>
+          <w:lang w:eastAsia="en-IN"/>
+        </w:rPr>
+        <w:t xml:space="preserve">Maximum Consecutive Ones </w:t>
+      </w:r>
+    </w:p>
+    <w:p>
+      <w:pPr>
+        <w:numPr>
+          <w:ilvl w:val="0"/>
+          <w:numId w:val="5"/>
+        </w:numPr>
+        <w:spacing w:before="100" w:beforeAutospacing="1" w:after="100" w:afterAutospacing="1" w:line="240" w:lineRule="auto"/>
+        <w:rPr>
+          <w:rFonts w:ascii="Times New Roman" w:eastAsia="Times New Roman" w:hAnsi="Times New Roman" w:cs="Times New Roman"/>
+          <w:sz w:val="24"/>
+          <w:szCs w:val="24"/>
+          <w:lang w:eastAsia="en-IN"/>
+        </w:rPr>
+      </w:pPr>
+      <w:r>
+        <w:rPr>
+          <w:rFonts w:ascii="Times New Roman" w:eastAsia="Times New Roman" w:hAnsi="Times New Roman" w:cs="Times New Roman"/>
+          <w:sz w:val="24"/>
+          <w:szCs w:val="24"/>
+          <w:lang w:eastAsia="en-IN"/>
+        </w:rPr>
+        <w:t xml:space="preserve">Fruits Into Basket </w:t>
+      </w:r>
+    </w:p>
+    <w:p>
+      <w:pPr>
+        <w:spacing w:after="0" w:line="240" w:lineRule="auto"/>
+        <w:rPr>
+          <w:rFonts w:ascii="Times New Roman" w:eastAsia="Times New Roman" w:hAnsi="Times New Roman" w:cs="Times New Roman"/>
+          <w:sz w:val="24"/>
+          <w:szCs w:val="24"/>
+          <w:lang w:eastAsia="en-IN"/>
+        </w:rPr>
+      </w:pPr>
+      <w:r>
+        <w:rPr>
+          <w:rFonts w:ascii="Times New Roman" w:eastAsia="Times New Roman" w:hAnsi="Times New Roman" w:cs="Times New Roman"/>
+          <w:sz w:val="24"/>
+          <w:szCs w:val="24"/>
+          <w:lang w:eastAsia="en-IN"/>
+        </w:rPr>
+        <w:lastRenderedPageBreak/>
+        <w:pict w14:anchorId="7A4C2047">
+          <v:rect id="_x0000_i1030" style="width:0;height:1.5pt" o:hralign="center" o:hrstd="t" o:hr="t" fillcolor="#a0a0a0" stroked="f"/>
+        </w:pict>
+      </w:r>
+    </w:p>
+    <w:p>
+      <w:pPr>
+        <w:spacing w:before="100" w:beforeAutospacing="1" w:after="100" w:afterAutospacing="1" w:line="240" w:lineRule="auto"/>
+        <w:outlineLvl w:val="1"/>
+        <w:rPr>
+          <w:rFonts w:ascii="Times New Roman" w:eastAsia="Times New Roman" w:hAnsi="Times New Roman" w:cs="Times New Roman"/>
+          <w:b/>
+          <w:bCs/>
+          <w:sz w:val="36"/>
+          <w:szCs w:val="36"/>
+          <w:lang w:eastAsia="en-IN"/>
+        </w:rPr>
+      </w:pPr>
+      <w:r>
+        <w:rPr>
+          <w:rFonts w:ascii="Times New Roman" w:eastAsia="Times New Roman" w:hAnsi="Times New Roman" w:cs="Times New Roman"/>
           <w:noProof/>
           <w:sz w:val="24"/>
           <w:szCs w:val="24"/>
@@ -2337,15 +2498,15 @@
         <mc:AlternateContent>
           <mc:Choice Requires="wps">
             <w:drawing>
-              <wp:anchor distT="0" distB="0" distL="114300" distR="114300" simplePos="0" relativeHeight="251687936" behindDoc="0" locked="0" layoutInCell="1" allowOverlap="1" wp14:anchorId="3E082B10" wp14:editId="2CD75C61">
+              <wp:anchor distT="0" distB="0" distL="114300" distR="114300" simplePos="0" relativeHeight="251687936" behindDoc="0" locked="0" layoutInCell="1" allowOverlap="1" wp14:anchorId="3E082B10" wp14:editId="7EBB8208">
                 <wp:simplePos x="0" y="0"/>
                 <wp:positionH relativeFrom="column">
-                  <wp:posOffset>66068</wp:posOffset>
+                  <wp:posOffset>-128905</wp:posOffset>
                 </wp:positionH>
                 <wp:positionV relativeFrom="paragraph">
-                  <wp:posOffset>169683</wp:posOffset>
+                  <wp:posOffset>566337</wp:posOffset>
                 </wp:positionV>
-                <wp:extent cx="2893197" cy="2885"/>
+                <wp:extent cx="2893060" cy="2540"/>
                 <wp:effectExtent l="0" t="0" r="21590" b="35560"/>
                 <wp:wrapNone/>
                 <wp:docPr id="7" name="Straight Connector 7"/>
@@ -2357,7 +2518,7 @@
                       <wps:spPr>
                         <a:xfrm>
                           <a:off x="0" y="0"/>
-                          <a:ext cx="2893197" cy="2885"/>
+                          <a:ext cx="2893060" cy="2540"/>
                         </a:xfrm>
                         <a:prstGeom prst="line">
                           <a:avLst/>
@@ -2386,174 +2547,13 @@
           </mc:Choice>
           <mc:Fallback>
             <w:pict>
-              <v:line w14:anchorId="32D104DD" id="Straight Connector 7" o:spid="_x0000_s1026" style="position:absolute;z-index:251687936;visibility:visible;mso-wrap-style:square;mso-wrap-distance-left:9pt;mso-wrap-distance-top:0;mso-wrap-distance-right:9pt;mso-wrap-distance-bottom:0;mso-position-horizontal:absolute;mso-position-horizontal-relative:text;mso-position-vertical:absolute;mso-position-vertical-relative:text" from="5.2pt,13.35pt" to="233pt,13.6pt" o:gfxdata="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" strokecolor="#4472c4 [3204]" strokeweight=".5pt">
+              <v:line w14:anchorId="3262B529" id="Straight Connector 7" o:spid="_x0000_s1026" style="position:absolute;z-index:251687936;visibility:visible;mso-wrap-style:square;mso-wrap-distance-left:9pt;mso-wrap-distance-top:0;mso-wrap-distance-right:9pt;mso-wrap-distance-bottom:0;mso-position-horizontal:absolute;mso-position-horizontal-relative:text;mso-position-vertical:absolute;mso-position-vertical-relative:text" from="-10.15pt,44.6pt" to="217.65pt,44.8pt" o:gfxdata="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" strokecolor="#4472c4 [3204]" strokeweight=".5pt">
                 <v:stroke joinstyle="miter"/>
               </v:line>
             </w:pict>
           </mc:Fallback>
         </mc:AlternateContent>
       </w:r>
-      <w:r>
-        <w:rPr>
-          <w:rFonts w:ascii="Times New Roman" w:eastAsia="Times New Roman" w:hAnsi="Times New Roman" w:cs="Times New Roman"/>
-          <w:sz w:val="24"/>
-          <w:szCs w:val="24"/>
-          <w:lang w:eastAsia="en-IN"/>
-        </w:rPr>
-        <w:t xml:space="preserve">First Negative in Every Window </w:t>
-      </w:r>
-    </w:p>
-    <w:p>
-      <w:pPr>
-        <w:numPr>
-          <w:ilvl w:val="0"/>
-          <w:numId w:val="5"/>
-        </w:numPr>
-        <w:spacing w:before="100" w:beforeAutospacing="1" w:after="100" w:afterAutospacing="1" w:line="240" w:lineRule="auto"/>
-        <w:rPr>
-          <w:rFonts w:ascii="Times New Roman" w:eastAsia="Times New Roman" w:hAnsi="Times New Roman" w:cs="Times New Roman"/>
-          <w:sz w:val="24"/>
-          <w:szCs w:val="24"/>
-          <w:lang w:eastAsia="en-IN"/>
-        </w:rPr>
-      </w:pPr>
-      <w:r>
-        <w:rPr>
-          <w:rFonts w:ascii="Times New Roman" w:eastAsia="Times New Roman" w:hAnsi="Times New Roman" w:cs="Times New Roman"/>
-          <w:sz w:val="24"/>
-          <w:szCs w:val="24"/>
-          <w:lang w:eastAsia="en-IN"/>
-        </w:rPr>
-        <w:t xml:space="preserve">Longest Substring Without Repeating Characters </w:t>
-      </w:r>
-    </w:p>
-    <w:p>
-      <w:pPr>
-        <w:pStyle w:val="ListParagraph"/>
-        <w:numPr>
-          <w:ilvl w:val="0"/>
-          <w:numId w:val="5"/>
-        </w:numPr>
-        <w:shd w:val="clear" w:color="auto" w:fill="1F1F1F"/>
-        <w:spacing w:after="0" w:line="285" w:lineRule="atLeast"/>
-        <w:rPr>
-          <w:rFonts w:ascii="Consolas" w:eastAsia="Times New Roman" w:hAnsi="Consolas" w:cs="Times New Roman"/>
-          <w:color w:val="CCCCCC"/>
-          <w:sz w:val="21"/>
-          <w:szCs w:val="21"/>
-          <w:lang w:eastAsia="en-IN"/>
-        </w:rPr>
-      </w:pPr>
-      <w:r>
-        <w:rPr>
-          <w:rFonts w:ascii="Consolas" w:eastAsia="Times New Roman" w:hAnsi="Consolas" w:cs="Times New Roman"/>
-          <w:color w:val="CE9178"/>
-          <w:sz w:val="21"/>
-          <w:szCs w:val="21"/>
-          <w:lang w:eastAsia="en-IN"/>
-        </w:rPr>
-        <w:t>Maximum Consecutive Ones III</w:t>
-      </w:r>
-    </w:p>
-    <w:p>
-      <w:pPr>
-        <w:numPr>
-          <w:ilvl w:val="0"/>
-          <w:numId w:val="5"/>
-        </w:numPr>
-        <w:spacing w:before="100" w:beforeAutospacing="1" w:after="100" w:afterAutospacing="1" w:line="240" w:lineRule="auto"/>
-        <w:rPr>
-          <w:rFonts w:ascii="Times New Roman" w:eastAsia="Times New Roman" w:hAnsi="Times New Roman" w:cs="Times New Roman"/>
-          <w:sz w:val="24"/>
-          <w:szCs w:val="24"/>
-          <w:lang w:eastAsia="en-IN"/>
-        </w:rPr>
-      </w:pPr>
-    </w:p>
-    <w:p>
-      <w:pPr>
-        <w:numPr>
-          <w:ilvl w:val="0"/>
-          <w:numId w:val="5"/>
-        </w:numPr>
-        <w:spacing w:before="100" w:beforeAutospacing="1" w:after="100" w:afterAutospacing="1" w:line="240" w:lineRule="auto"/>
-        <w:rPr>
-          <w:rFonts w:ascii="Times New Roman" w:eastAsia="Times New Roman" w:hAnsi="Times New Roman" w:cs="Times New Roman"/>
-          <w:sz w:val="24"/>
-          <w:szCs w:val="24"/>
-          <w:lang w:eastAsia="en-IN"/>
-        </w:rPr>
-      </w:pPr>
-      <w:r>
-        <w:rPr>
-          <w:rFonts w:ascii="Times New Roman" w:eastAsia="Times New Roman" w:hAnsi="Times New Roman" w:cs="Times New Roman"/>
-          <w:sz w:val="24"/>
-          <w:szCs w:val="24"/>
-          <w:lang w:eastAsia="en-IN"/>
-        </w:rPr>
-        <w:t xml:space="preserve">Maximum Consecutive Ones </w:t>
-      </w:r>
-    </w:p>
-    <w:p>
-      <w:pPr>
-        <w:numPr>
-          <w:ilvl w:val="0"/>
-          <w:numId w:val="5"/>
-        </w:numPr>
-        <w:spacing w:before="100" w:beforeAutospacing="1" w:after="100" w:afterAutospacing="1" w:line="240" w:lineRule="auto"/>
-        <w:rPr>
-          <w:rFonts w:ascii="Times New Roman" w:eastAsia="Times New Roman" w:hAnsi="Times New Roman" w:cs="Times New Roman"/>
-          <w:sz w:val="24"/>
-          <w:szCs w:val="24"/>
-          <w:lang w:eastAsia="en-IN"/>
-        </w:rPr>
-      </w:pPr>
-      <w:r>
-        <w:rPr>
-          <w:rFonts w:ascii="Times New Roman" w:eastAsia="Times New Roman" w:hAnsi="Times New Roman" w:cs="Times New Roman"/>
-          <w:sz w:val="24"/>
-          <w:szCs w:val="24"/>
-          <w:lang w:eastAsia="en-IN"/>
-        </w:rPr>
-        <w:t xml:space="preserve">Fruits Into Basket </w:t>
-      </w:r>
-    </w:p>
-    <w:p>
-      <w:pPr>
-        <w:spacing w:after="0" w:line="240" w:lineRule="auto"/>
-        <w:rPr>
-          <w:rFonts w:ascii="Times New Roman" w:eastAsia="Times New Roman" w:hAnsi="Times New Roman" w:cs="Times New Roman"/>
-          <w:sz w:val="24"/>
-          <w:szCs w:val="24"/>
-          <w:lang w:eastAsia="en-IN"/>
-        </w:rPr>
-      </w:pPr>
-      <w:r>
-        <w:rPr>
-          <w:rFonts w:ascii="Times New Roman" w:eastAsia="Times New Roman" w:hAnsi="Times New Roman" w:cs="Times New Roman"/>
-          <w:sz w:val="24"/>
-          <w:szCs w:val="24"/>
-          <w:lang w:eastAsia="en-IN"/>
-        </w:rPr>
-        <w:lastRenderedPageBreak/>
-        <w:pict w14:anchorId="7A4C2047">
-          <v:rect id="_x0000_i1030" style="width:0;height:1.5pt" o:hralign="center" o:hrstd="t" o:hr="t" fillcolor="#a0a0a0" stroked="f"/>
-        </w:pict>
-      </w:r>
-    </w:p>
-    <w:p>
-      <w:pPr>
-        <w:spacing w:before="100" w:beforeAutospacing="1" w:after="100" w:afterAutospacing="1" w:line="240" w:lineRule="auto"/>
-        <w:outlineLvl w:val="1"/>
-        <w:rPr>
-          <w:rFonts w:ascii="Times New Roman" w:eastAsia="Times New Roman" w:hAnsi="Times New Roman" w:cs="Times New Roman"/>
-          <w:b/>
-          <w:bCs/>
-          <w:sz w:val="36"/>
-          <w:szCs w:val="36"/>
-          <w:lang w:eastAsia="en-IN"/>
-        </w:rPr>
-      </w:pPr>
       <w:r>
         <w:rPr>
           <w:rFonts w:ascii="Times New Roman" w:eastAsia="Times New Roman" w:hAnsi="Times New Roman" w:cs="Times New Roman"/>

</xml_diff>